<commit_message>
fix(system): finalize cross-account source consistency
</commit_message>
<xml_diff>
--- a/docs/system/HOW_TO_USE_ROADMAP_WITH_AI.docx
+++ b/docs/system/HOW_TO_USE_ROADMAP_WITH_AI.docx
@@ -554,7 +554,12 @@
         <w:rPr>
           <w:sz w:val="19"/>
         </w:rPr>
-        <w:t>MASTER_PROMPT_V3.md - 3.0.0</w:t>
+        <w:t>MASTER_PROMPT_V3.md - 3.0.2</w:t>
+      </w:r>
+    </w:p>
+    <w:p>
+      <w:r>
+        <w:t>Canonical live repo: https://github.com/MinhSit/embedded-firmware-journey-v3</w:t>
       </w:r>
     </w:p>
     <w:p>
@@ -717,14 +722,7 @@
           <w:b/>
           <w:sz w:val="26"/>
         </w:rPr>
-        <w:t xml:space="preserve">BOOT </w:t>
-      </w:r>
-      <w:r>
-        <w:rPr>
-          <w:b/>
-          <w:sz w:val="26"/>
-        </w:rPr>
-        <w:t xml:space="preserve"> </w:t>
+        <w:t xml:space="preserve">BOOT  </w:t>
       </w:r>
       <w:r>
         <w:rPr>
@@ -775,6 +773,8 @@
         </w:rPr>
         <w:sym w:font="Wingdings" w:char="F0E0"/>
       </w:r>
+      <w:bookmarkStart w:id="0" w:name="_GoBack"/>
+      <w:bookmarkEnd w:id="0"/>
       <w:r>
         <w:rPr>
           <w:b/>
@@ -948,7 +948,14 @@
                 <w:rFonts w:ascii="Consolas" w:hAnsi="Consolas"/>
                 <w:sz w:val="18"/>
               </w:rPr>
-              <w:t>Bí?  HINT 1 → HINT 2 → HINT 3 → HINT 4</w:t>
+              <w:t xml:space="preserve">Bí? </w:t>
+            </w:r>
+            <w:r>
+              <w:rPr>
+                <w:rFonts w:ascii="Consolas" w:hAnsi="Consolas"/>
+                <w:sz w:val="18"/>
+              </w:rPr>
+              <w:t xml:space="preserve"> HINT 1 → HINT 2 → HINT 3 → HINT 4</w:t>
             </w:r>
             <w:r>
               <w:br/>
@@ -978,14 +985,7 @@
                 <w:rFonts w:ascii="Consolas" w:hAnsi="Consolas"/>
                 <w:sz w:val="18"/>
               </w:rPr>
-              <w:t>BUILD / TEST / MEA</w:t>
-            </w:r>
-            <w:r>
-              <w:rPr>
-                <w:rFonts w:ascii="Consolas" w:hAnsi="Consolas"/>
-                <w:sz w:val="18"/>
-              </w:rPr>
-              <w:t>SUREMENT / EVIDENCE</w:t>
+              <w:t>BUILD / TEST / MEASUREMENT / EVIDENCE</w:t>
             </w:r>
             <w:r>
               <w:br/>
@@ -1226,7 +1226,13 @@
               <w:rPr>
                 <w:sz w:val="20"/>
               </w:rPr>
-              <w:t>. SUBMIT TODO = review công vi</w:t>
+              <w:t xml:space="preserve">. SUBMIT TODO = </w:t>
+            </w:r>
+            <w:r>
+              <w:rPr>
+                <w:sz w:val="20"/>
+              </w:rPr>
+              <w:t>review công vi</w:t>
             </w:r>
             <w:r>
               <w:rPr>
@@ -1304,10 +1310,7 @@
         <w:ind w:left="142" w:hanging="142"/>
       </w:pPr>
       <w:r>
-        <w:t xml:space="preserve">1. </w:t>
-      </w:r>
-      <w:r>
-        <w:t>M</w:t>
+        <w:t>1. M</w:t>
       </w:r>
       <w:r>
         <w:t>ở</w:t>
@@ -1399,7 +1402,10 @@
         <w:t>ọ</w:t>
       </w:r>
       <w:r>
-        <w:t>c lan sang ngày mai.</w:t>
+        <w:t xml:space="preserve">c lan sang ngày </w:t>
+      </w:r>
+      <w:r>
+        <w:t>mai.</w:t>
       </w:r>
     </w:p>
     <w:p>
@@ -1539,7 +1545,10 @@
         <w:t>Ệ</w:t>
       </w:r>
       <w:r>
-        <w:t>C GÌ?</w:t>
+        <w:t>C</w:t>
+      </w:r>
+      <w:r>
+        <w:t xml:space="preserve"> GÌ?</w:t>
       </w:r>
     </w:p>
     <w:tbl>
@@ -1720,13 +1729,7 @@
               <w:rPr>
                 <w:sz w:val="17"/>
               </w:rPr>
-              <w:t xml:space="preserve">t: PASS, AI integrity, </w:t>
-            </w:r>
-            <w:r>
-              <w:rPr>
-                <w:sz w:val="17"/>
-              </w:rPr>
-              <w:t>evidence, recovery.</w:t>
+              <w:t>t: PASS, AI integrity, evidence, recovery.</w:t>
             </w:r>
           </w:p>
         </w:tc>
@@ -1968,57 +1971,33 @@
           </w:tcPr>
           <w:p>
             <w:r>
-              <w:rPr>
-                <w:sz w:val="17"/>
-              </w:rPr>
               <w:t>Quy đ</w:t>
             </w:r>
             <w:r>
-              <w:rPr>
-                <w:sz w:val="17"/>
-              </w:rPr>
               <w:t>ị</w:t>
             </w:r>
             <w:r>
-              <w:rPr>
-                <w:sz w:val="17"/>
-              </w:rPr>
-              <w:t>nh AI ph</w:t>
-            </w:r>
-            <w:r>
-              <w:rPr>
-                <w:sz w:val="17"/>
-              </w:rPr>
+              <w:t>nh</w:t>
+            </w:r>
+            <w:r>
+              <w:t xml:space="preserve"> AI ph</w:t>
+            </w:r>
+            <w:r>
               <w:t>ả</w:t>
             </w:r>
             <w:r>
-              <w:rPr>
-                <w:sz w:val="17"/>
-              </w:rPr>
               <w:t>i BOOT, d</w:t>
             </w:r>
             <w:r>
-              <w:rPr>
-                <w:sz w:val="17"/>
-              </w:rPr>
               <w:t>ạ</w:t>
             </w:r>
             <w:r>
-              <w:rPr>
-                <w:sz w:val="17"/>
-              </w:rPr>
-              <w:t>y, review, gate, recovery th</w:t>
-            </w:r>
-            <w:r>
-              <w:rPr>
-                <w:sz w:val="17"/>
-              </w:rPr>
+              <w:t>y, review, gate, recovery và discover live repo th</w:t>
+            </w:r>
+            <w:r>
               <w:t>ế</w:t>
             </w:r>
             <w:r>
-              <w:rPr>
-                <w:sz w:val="17"/>
-              </w:rPr>
               <w:t xml:space="preserve"> nào.</w:t>
             </w:r>
           </w:p>
@@ -2358,7 +2337,72 @@
               <w:rPr>
                 <w:sz w:val="17"/>
               </w:rPr>
-              <w:t xml:space="preserve"> tra nhanh.</w:t>
+              <w:t xml:space="preserve"> tra nhanh</w:t>
+            </w:r>
+            <w:r>
+              <w:rPr>
+                <w:sz w:val="17"/>
+              </w:rPr>
+              <w:t>.</w:t>
+            </w:r>
+          </w:p>
+        </w:tc>
+      </w:tr>
+      <w:tr>
+        <w:trPr>
+          <w:jc w:val="center"/>
+        </w:trPr>
+        <w:tc>
+          <w:tcPr>
+            <w:tcW w:w="3324" w:type="dxa"/>
+          </w:tcPr>
+          <w:p>
+            <w:r>
+              <w:t>ROADMAP_REVIEW_LOG.md</w:t>
+            </w:r>
+          </w:p>
+        </w:tc>
+        <w:tc>
+          <w:tcPr>
+            <w:tcW w:w="3324" w:type="dxa"/>
+          </w:tcPr>
+          <w:p>
+            <w:r>
+              <w:t>Live review checkpoints, concern và change proposal; không override roadmap.</w:t>
+            </w:r>
+          </w:p>
+        </w:tc>
+        <w:tc>
+          <w:tcPr>
+            <w:tcW w:w="3324" w:type="dxa"/>
+          </w:tcPr>
+          <w:p>
+            <w:r>
+              <w:t>B</w:t>
+            </w:r>
+            <w:r>
+              <w:t>ạ</w:t>
+            </w:r>
+            <w:r>
+              <w:t>n không c</w:t>
+            </w:r>
+            <w:r>
+              <w:t>ầ</w:t>
+            </w:r>
+            <w:r>
+              <w:t>n nh</w:t>
+            </w:r>
+            <w:r>
+              <w:t>ớ</w:t>
+            </w:r>
+            <w:r>
+              <w:t xml:space="preserve"> m</w:t>
+            </w:r>
+            <w:r>
+              <w:t>ố</w:t>
+            </w:r>
+            <w:r>
+              <w:t>c; AI check khi BOOT/WEEKLY REVIEW.</w:t>
             </w:r>
           </w:p>
         </w:tc>
@@ -2399,133 +2443,80 @@
           </w:tcPr>
           <w:p>
             <w:r>
-              <w:rPr>
-                <w:rFonts w:ascii="Consolas" w:hAnsi="Consolas"/>
-                <w:sz w:val="18"/>
-              </w:rPr>
               <w:t>ChatGPT Project - gi</w:t>
             </w:r>
             <w:r>
-              <w:rPr>
-                <w:rFonts w:ascii="Consolas" w:hAnsi="Consolas"/>
-                <w:sz w:val="18"/>
-              </w:rPr>
               <w:t>ữ</w:t>
             </w:r>
             <w:r>
-              <w:rPr>
-                <w:rFonts w:ascii="Consolas" w:hAnsi="Consolas"/>
-                <w:sz w:val="18"/>
-              </w:rPr>
               <w:t xml:space="preserve"> 3 source frozen:</w:t>
             </w:r>
             <w:r>
-              <w:rPr>
-                <w:rFonts w:ascii="Consolas" w:hAnsi="Consolas"/>
-                <w:sz w:val="18"/>
-              </w:rPr>
               <w:br/>
               <w:t>SYSTEM_SPEC_V3.md</w:t>
             </w:r>
             <w:r>
-              <w:rPr>
-                <w:rFonts w:ascii="Consolas" w:hAnsi="Consolas"/>
-                <w:sz w:val="18"/>
-              </w:rPr>
               <w:br/>
             </w:r>
             <w:r>
-              <w:rPr>
-                <w:rFonts w:ascii="Consolas" w:hAnsi="Consolas"/>
-                <w:sz w:val="18"/>
-              </w:rPr>
               <w:t>EMBEDDED_ROADMAP_V3.1.docx</w:t>
             </w:r>
             <w:r>
-              <w:rPr>
-                <w:rFonts w:ascii="Consolas" w:hAnsi="Consolas"/>
-                <w:sz w:val="18"/>
-              </w:rPr>
               <w:br/>
               <w:t>MASTER_PROMPT_V3.md</w:t>
             </w:r>
             <w:r>
-              <w:rPr>
-                <w:rFonts w:ascii="Consolas" w:hAnsi="Consolas"/>
-                <w:sz w:val="18"/>
-              </w:rPr>
               <w:br/>
             </w:r>
             <w:r>
-              <w:rPr>
-                <w:rFonts w:ascii="Consolas" w:hAnsi="Consolas"/>
-                <w:sz w:val="18"/>
-              </w:rPr>
+              <w:br/>
+              <w:t>GitHub canonical:</w:t>
+            </w:r>
+            <w:r>
+              <w:br/>
+              <w:t>https://github.com/MinhSit/embedded-firmware-journey-v3</w:t>
+            </w:r>
+            <w:r>
+              <w:br/>
+            </w:r>
+            <w:r>
               <w:br/>
               <w:t>GitHub - live state:</w:t>
             </w:r>
             <w:r>
-              <w:rPr>
-                <w:rFonts w:ascii="Consolas" w:hAnsi="Consolas"/>
-                <w:sz w:val="18"/>
-              </w:rPr>
               <w:br/>
               <w:t>roadmap-control/current-state.md</w:t>
             </w:r>
             <w:r>
-              <w:rPr>
-                <w:rFonts w:ascii="Consolas" w:hAnsi="Consolas"/>
-                <w:sz w:val="18"/>
-              </w:rPr>
               <w:br/>
               <w:t>roadmap-control/daily-log.md</w:t>
             </w:r>
             <w:r>
-              <w:rPr>
-                <w:rFonts w:ascii="Consolas" w:hAnsi="Consolas"/>
-                <w:sz w:val="18"/>
-              </w:rPr>
               <w:br/>
               <w:t>roadmap-control/competency-ledger.md</w:t>
             </w:r>
             <w:r>
-              <w:rPr>
-                <w:rFonts w:ascii="Consolas" w:hAnsi="Consolas"/>
-                <w:sz w:val="18"/>
-              </w:rPr>
               <w:br/>
-              <w:t>roadmap-control/ai-usage-log.md</w:t>
-            </w:r>
-            <w:r>
-              <w:rPr>
-                <w:rFonts w:ascii="Consolas" w:hAnsi="Consolas"/>
-                <w:sz w:val="18"/>
-              </w:rPr>
+              <w:t>roadmap-contr</w:t>
+            </w:r>
+            <w:r>
+              <w:t>ol/ai-usage-log.md</w:t>
+            </w:r>
+            <w:r>
               <w:br/>
-              <w:t>weekly-scorecards/</w:t>
-            </w:r>
-            <w:r>
-              <w:rPr>
-                <w:rFonts w:ascii="Consolas" w:hAnsi="Consolas"/>
-                <w:sz w:val="18"/>
-              </w:rPr>
+              <w:t>docs/system/ROADMAP_REVIEW_LOG.md</w:t>
+            </w:r>
+            <w:r>
               <w:br/>
-              <w:t>recovery/</w:t>
-            </w:r>
-            <w:r>
-              <w:rPr>
-                <w:rFonts w:ascii="Consolas" w:hAnsi="Consolas"/>
-                <w:sz w:val="18"/>
-              </w:rPr>
+              <w:t>roadmap-control/weekly-scorecards/</w:t>
+            </w:r>
+            <w:r>
               <w:br/>
-              <w:t>code / tests / evidence / c</w:t>
-            </w:r>
-            <w:r>
-              <w:rPr>
-                <w:rFonts w:ascii="Consolas" w:hAnsi="Consolas"/>
-                <w:sz w:val="18"/>
-              </w:rPr>
-              <w:t>aptures</w:t>
+              <w:t>roadmap-control/recovery/</w:t>
+            </w:r>
+            <w:r>
+              <w:br/>
+              <w:t>code / tests / evidence / captures</w:t>
             </w:r>
           </w:p>
         </w:tc>
@@ -2606,7 +2597,13 @@
               <w:rPr>
                 <w:sz w:val="20"/>
               </w:rPr>
-              <w:t>i current-state/log m</w:t>
+              <w:t>i current</w:t>
+            </w:r>
+            <w:r>
+              <w:rPr>
+                <w:sz w:val="20"/>
+              </w:rPr>
+              <w:t>-state/log m</w:t>
             </w:r>
             <w:r>
               <w:rPr>
@@ -2704,10 +2701,7 @@
         <w:t>ị</w:t>
       </w:r>
       <w:r>
-        <w:t xml:space="preserve">ch </w:t>
-      </w:r>
-      <w:r>
-        <w:t>l</w:t>
+        <w:t>ch l</w:t>
       </w:r>
       <w:r>
         <w:t>ẽ</w:t>
@@ -2759,7 +2753,10 @@
         <w:t>ầ</w:t>
       </w:r>
       <w:r>
-        <w:t>u ra nào đã build/test/đo/reproduce đư</w:t>
+        <w:t xml:space="preserve">u ra nào đã </w:t>
+      </w:r>
+      <w:r>
+        <w:t>build/test/đo/reproduce đư</w:t>
       </w:r>
       <w:r>
         <w:t>ợ</w:t>
@@ -2884,73 +2881,73 @@
               <w:rPr>
                 <w:sz w:val="20"/>
               </w:rPr>
-              <w:t xml:space="preserve">p không </w:t>
+              <w:t>p không ch</w:t>
             </w:r>
             <w:r>
               <w:rPr>
                 <w:sz w:val="20"/>
               </w:rPr>
-              <w:t>ch</w:t>
+              <w:t>ứ</w:t>
             </w:r>
             <w:r>
               <w:rPr>
                 <w:sz w:val="20"/>
               </w:rPr>
-              <w:t>ứ</w:t>
+              <w:t>ng minh b</w:t>
             </w:r>
             <w:r>
               <w:rPr>
                 <w:sz w:val="20"/>
               </w:rPr>
-              <w:t>ng minh b</w:t>
+              <w:t>ạ</w:t>
             </w:r>
             <w:r>
               <w:rPr>
                 <w:sz w:val="20"/>
               </w:rPr>
-              <w:t>ạ</w:t>
+              <w:t>n t</w:t>
             </w:r>
             <w:r>
               <w:rPr>
                 <w:sz w:val="20"/>
               </w:rPr>
-              <w:t>n t</w:t>
+              <w:t>ự</w:t>
             </w:r>
             <w:r>
               <w:rPr>
                 <w:sz w:val="20"/>
               </w:rPr>
-              <w:t>ự</w:t>
+              <w:t xml:space="preserve"> làm. Calendar đi trư</w:t>
             </w:r>
             <w:r>
               <w:rPr>
                 <w:sz w:val="20"/>
               </w:rPr>
-              <w:t xml:space="preserve"> làm. Calendar đi trư</w:t>
+              <w:t>ớ</w:t>
             </w:r>
             <w:r>
               <w:rPr>
                 <w:sz w:val="20"/>
               </w:rPr>
-              <w:t>ớ</w:t>
+              <w:t>c cũng không cho phép nh</w:t>
             </w:r>
             <w:r>
               <w:rPr>
                 <w:sz w:val="20"/>
               </w:rPr>
-              <w:t>c cũng không cho phép nh</w:t>
+              <w:t>ả</w:t>
             </w:r>
             <w:r>
               <w:rPr>
                 <w:sz w:val="20"/>
               </w:rPr>
-              <w:t>ả</w:t>
+              <w:t>y qua prerequisite competency còn th</w:t>
             </w:r>
             <w:r>
               <w:rPr>
                 <w:sz w:val="20"/>
               </w:rPr>
-              <w:t>y qua prerequisite competency còn thi</w:t>
+              <w:t>i</w:t>
             </w:r>
             <w:r>
               <w:rPr>
@@ -3035,107 +3032,46 @@
           </w:tcPr>
           <w:p>
             <w:r>
-              <w:rPr>
-                <w:rFonts w:ascii="Consolas" w:hAnsi="Consolas"/>
-                <w:sz w:val="18"/>
-              </w:rPr>
               <w:t>STATE SNAPSHOT</w:t>
             </w:r>
             <w:r>
               <w:br/>
-            </w:r>
-            <w:r>
-              <w:rPr>
-                <w:rFonts w:ascii="Consolas" w:hAnsi="Consolas"/>
-                <w:sz w:val="18"/>
-              </w:rPr>
               <w:t>- Calendar</w:t>
             </w:r>
             <w:r>
               <w:br/>
-            </w:r>
-            <w:r>
-              <w:rPr>
-                <w:rFonts w:ascii="Consolas" w:hAnsi="Consolas"/>
-                <w:sz w:val="18"/>
-              </w:rPr>
               <w:t>- Execution</w:t>
             </w:r>
             <w:r>
               <w:br/>
-            </w:r>
-            <w:r>
-              <w:rPr>
-                <w:rFonts w:ascii="Consolas" w:hAnsi="Consolas"/>
-                <w:sz w:val="18"/>
-              </w:rPr>
               <w:t>- Artifact</w:t>
             </w:r>
             <w:r>
               <w:br/>
-            </w:r>
-            <w:r>
-              <w:rPr>
-                <w:rFonts w:ascii="Consolas" w:hAnsi="Consolas"/>
-                <w:sz w:val="18"/>
-              </w:rPr>
               <w:t>- Competency</w:t>
             </w:r>
             <w:r>
               <w:br/>
-            </w:r>
-            <w:r>
-              <w:rPr>
-                <w:rFonts w:ascii="Consolas" w:hAnsi="Consolas"/>
-                <w:sz w:val="18"/>
-              </w:rPr>
               <w:t>- Current Gate</w:t>
             </w:r>
             <w:r>
               <w:br/>
-            </w:r>
-            <w:r>
-              <w:rPr>
-                <w:rFonts w:ascii="Consolas" w:hAnsi="Consolas"/>
-                <w:sz w:val="18"/>
-              </w:rPr>
               <w:t>- AI contamination / retest</w:t>
             </w:r>
             <w:r>
               <w:br/>
-            </w:r>
-            <w:r>
-              <w:rPr>
-                <w:rFonts w:ascii="Consolas" w:hAnsi="Consolas"/>
-                <w:sz w:val="18"/>
-              </w:rPr>
-              <w:t xml:space="preserve">- Schedule variance </w:t>
-            </w:r>
-            <w:r>
-              <w:rPr>
-                <w:rFonts w:ascii="Consolas" w:hAnsi="Consolas"/>
-                <w:sz w:val="18"/>
-              </w:rPr>
-              <w:t>/ Recovery</w:t>
+              <w:t>- Schedule variance / Recovery</w:t>
             </w:r>
             <w:r>
               <w:br/>
-            </w:r>
-            <w:r>
-              <w:rPr>
-                <w:rFonts w:ascii="Consolas" w:hAnsi="Consolas"/>
-                <w:sz w:val="18"/>
-              </w:rPr>
               <w:t>- Deadline risk</w:t>
             </w:r>
             <w:r>
               <w:br/>
-            </w:r>
-            <w:r>
-              <w:rPr>
-                <w:rFonts w:ascii="Consolas" w:hAnsi="Consolas"/>
-                <w:sz w:val="18"/>
-              </w:rPr>
+              <w:t>- Roadmap Review status / checkpoint</w:t>
+            </w:r>
+            <w:r>
+              <w:br/>
               <w:t>- Exact Next Action</w:t>
             </w:r>
             <w:r>
@@ -3143,52 +3079,25 @@
             </w:r>
             <w:r>
               <w:br/>
-            </w:r>
-            <w:r>
-              <w:rPr>
-                <w:rFonts w:ascii="Consolas" w:hAnsi="Consolas"/>
-                <w:sz w:val="18"/>
-              </w:rPr>
               <w:t>THEORY PACK</w:t>
             </w:r>
             <w:r>
               <w:br/>
-            </w:r>
-            <w:r>
-              <w:rPr>
-                <w:rFonts w:ascii="Consolas" w:hAnsi="Consolas"/>
-                <w:sz w:val="18"/>
-              </w:rPr>
-              <w:t>- why / mental model / core concepts</w:t>
+              <w:t>- w</w:t>
+            </w:r>
+            <w:r>
+              <w:t>hy / mental model / core concepts</w:t>
             </w:r>
             <w:r>
               <w:br/>
-            </w:r>
-            <w:r>
-              <w:rPr>
-                <w:rFonts w:ascii="Consolas" w:hAnsi="Consolas"/>
-                <w:sz w:val="18"/>
-              </w:rPr>
               <w:t>- mini example / failure modes</w:t>
             </w:r>
             <w:r>
               <w:br/>
-            </w:r>
-            <w:r>
-              <w:rPr>
-                <w:rFonts w:ascii="Consolas" w:hAnsi="Consolas"/>
-                <w:sz w:val="18"/>
-              </w:rPr>
               <w:t>- measurement / official reading</w:t>
             </w:r>
             <w:r>
               <w:br/>
-            </w:r>
-            <w:r>
-              <w:rPr>
-                <w:rFonts w:ascii="Consolas" w:hAnsi="Consolas"/>
-                <w:sz w:val="18"/>
-              </w:rPr>
               <w:t>- pre-check 3-7 câu</w:t>
             </w:r>
             <w:r>
@@ -3196,80 +3105,34 @@
             </w:r>
             <w:r>
               <w:br/>
-            </w:r>
-            <w:r>
-              <w:rPr>
-                <w:rFonts w:ascii="Consolas" w:hAnsi="Consolas"/>
-                <w:sz w:val="18"/>
-              </w:rPr>
               <w:t>FULL DAY PACK</w:t>
             </w:r>
             <w:r>
               <w:br/>
-            </w:r>
-            <w:r>
-              <w:rPr>
-                <w:rFonts w:ascii="Consolas" w:hAnsi="Consolas"/>
-                <w:sz w:val="18"/>
-              </w:rPr>
               <w:t>- THEORY...</w:t>
             </w:r>
             <w:r>
               <w:br/>
-            </w:r>
-            <w:r>
-              <w:rPr>
-                <w:rFonts w:ascii="Consolas" w:hAnsi="Consolas"/>
-                <w:sz w:val="18"/>
-              </w:rPr>
               <w:t>- TODO...</w:t>
             </w:r>
             <w:r>
               <w:br/>
-            </w:r>
-            <w:r>
-              <w:rPr>
-                <w:rFonts w:ascii="Consolas" w:hAnsi="Consolas"/>
-                <w:sz w:val="18"/>
-              </w:rPr>
               <w:t>- SUBMIT...</w:t>
             </w:r>
             <w:r>
               <w:br/>
-            </w:r>
-            <w:r>
-              <w:rPr>
-                <w:rFonts w:ascii="Consolas" w:hAnsi="Consolas"/>
-                <w:sz w:val="18"/>
-              </w:rPr>
               <w:t>- starter code/test n</w:t>
             </w:r>
             <w:r>
-              <w:rPr>
-                <w:rFonts w:ascii="Consolas" w:hAnsi="Consolas"/>
-                <w:sz w:val="18"/>
-              </w:rPr>
               <w:t>ế</w:t>
             </w:r>
             <w:r>
-              <w:rPr>
-                <w:rFonts w:ascii="Consolas" w:hAnsi="Consolas"/>
-                <w:sz w:val="18"/>
-              </w:rPr>
               <w:t>u c</w:t>
             </w:r>
             <w:r>
-              <w:rPr>
-                <w:rFonts w:ascii="Consolas" w:hAnsi="Consolas"/>
-                <w:sz w:val="18"/>
-              </w:rPr>
               <w:t>ầ</w:t>
             </w:r>
             <w:r>
-              <w:rPr>
-                <w:rFonts w:ascii="Consolas" w:hAnsi="Consolas"/>
-                <w:sz w:val="18"/>
-              </w:rPr>
               <w:t>n</w:t>
             </w:r>
           </w:p>
@@ -3457,7 +3320,13 @@
               <w:rPr>
                 <w:sz w:val="18"/>
               </w:rPr>
-              <w:t>Reload context nhưng chưa mu</w:t>
+              <w:t xml:space="preserve">Reload </w:t>
+            </w:r>
+            <w:r>
+              <w:rPr>
+                <w:sz w:val="18"/>
+              </w:rPr>
+              <w:t>context nhưng chưa mu</w:t>
             </w:r>
             <w:r>
               <w:rPr>
@@ -3628,10 +3497,7 @@
           </w:tcPr>
           <w:p>
             <w:r>
-              <w:rPr>
-                <w:sz w:val="18"/>
-              </w:rPr>
-              <w:t>4 positions + gate + blocker + Next Action.</w:t>
+              <w:t>4 positions + gate + blocker + review status + Next Action.</w:t>
             </w:r>
           </w:p>
         </w:tc>
@@ -3715,10 +3581,7 @@
       </w:pPr>
       <w:r>
         <w:lastRenderedPageBreak/>
-        <w:t xml:space="preserve">4. DAY PACK - </w:t>
-      </w:r>
-      <w:r>
-        <w:t>AI T</w:t>
+        <w:t>4. DAY PACK - AI T</w:t>
       </w:r>
       <w:r>
         <w:t>Ạ</w:t>
@@ -3741,7 +3604,10 @@
         <w:t>ị</w:t>
       </w:r>
       <w:r>
-        <w:t>nh nghĩa Vi</w:t>
+        <w:t xml:space="preserve">nh nghĩa </w:t>
+      </w:r>
+      <w:r>
+        <w:t>Vi</w:t>
       </w:r>
       <w:r>
         <w:t>ệ</w:t>
@@ -3909,24 +3775,24 @@
                 <w:rFonts w:ascii="Consolas" w:hAnsi="Consolas"/>
                 <w:sz w:val="18"/>
               </w:rPr>
-              <w:t xml:space="preserve">  </w:t>
+              <w:t xml:space="preserve">    test_pointer_array.c</w:t>
+            </w:r>
+            <w:r>
+              <w:br/>
             </w:r>
             <w:r>
               <w:rPr>
                 <w:rFonts w:ascii="Consolas" w:hAnsi="Consolas"/>
                 <w:sz w:val="18"/>
               </w:rPr>
-              <w:t xml:space="preserve">  test_pointer_array.c</w:t>
-            </w:r>
-            <w:r>
-              <w:br/>
+              <w:t xml:space="preserve">    THEORY_W01_D01_</w:t>
             </w:r>
             <w:r>
               <w:rPr>
                 <w:rFonts w:ascii="Consolas" w:hAnsi="Consolas"/>
                 <w:sz w:val="18"/>
               </w:rPr>
-              <w:t xml:space="preserve">    THEORY_W01_D01_2026-08-10_pointer-array.md</w:t>
+              <w:t>2026-08-10_pointer-array.md</w:t>
             </w:r>
             <w:r>
               <w:br/>
@@ -4210,10 +4076,10 @@
         <w:pStyle w:val="ListBullet"/>
       </w:pPr>
       <w:r>
-        <w:t>Compile</w:t>
-      </w:r>
-      <w:r>
-        <w:t>-clean stub, mock, fixture, test harness.</w:t>
+        <w:t>Compile-clean stub, mock, fixture, test harnes</w:t>
+      </w:r>
+      <w:r>
+        <w:t>s.</w:t>
       </w:r>
     </w:p>
     <w:p>
@@ -4556,13 +4422,7 @@
               <w:rPr>
                 <w:sz w:val="16"/>
               </w:rPr>
-              <w:t xml:space="preserve">Gate / </w:t>
-            </w:r>
-            <w:r>
-              <w:rPr>
-                <w:sz w:val="16"/>
-              </w:rPr>
-              <w:t>diagnostic / retest</w:t>
+              <w:t>Gate / diagnostic / retest</w:t>
             </w:r>
           </w:p>
         </w:tc>
@@ -4626,7 +4486,13 @@
               <w:rPr>
                 <w:sz w:val="16"/>
               </w:rPr>
-              <w:t>o independent evidence.</w:t>
+              <w:t>o</w:t>
+            </w:r>
+            <w:r>
+              <w:rPr>
+                <w:sz w:val="16"/>
+              </w:rPr>
+              <w:t xml:space="preserve"> independent evidence.</w:t>
             </w:r>
           </w:p>
         </w:tc>
@@ -5040,7 +4906,13 @@
               <w:rPr>
                 <w:sz w:val="16"/>
               </w:rPr>
-              <w:t>n c</w:t>
+              <w:t>n</w:t>
+            </w:r>
+            <w:r>
+              <w:rPr>
+                <w:sz w:val="16"/>
+              </w:rPr>
+              <w:t xml:space="preserve"> c</w:t>
             </w:r>
             <w:r>
               <w:rPr>
@@ -5352,7 +5224,13 @@
               <w:rPr>
                 <w:sz w:val="20"/>
               </w:rPr>
-              <w:t>t, hypothesis, failed test, log, debugger observation, capture, diagram ho</w:t>
+              <w:t xml:space="preserve">t, hypothesis, failed </w:t>
+            </w:r>
+            <w:r>
+              <w:rPr>
+                <w:sz w:val="20"/>
+              </w:rPr>
+              <w:t>test, log, debugger observation, capture, diagram ho</w:t>
             </w:r>
             <w:r>
               <w:rPr>
@@ -5465,10 +5343,10 @@
         <w:t>ạ</w:t>
       </w:r>
       <w:r>
-        <w:t xml:space="preserve">y theo: why → mental model → concepts → flow → mini </w:t>
-      </w:r>
-      <w:r>
-        <w:t>example → failure modes → measurement → official reading → questions.</w:t>
+        <w:t xml:space="preserve">y theo: why → mental model → concepts → flow → mini example → failure modes → measurement → official reading → </w:t>
+      </w:r>
+      <w:r>
+        <w:t>questions.</w:t>
       </w:r>
     </w:p>
     <w:p>
@@ -5790,13 +5668,7 @@
               <w:rPr>
                 <w:sz w:val="18"/>
               </w:rPr>
-              <w:t xml:space="preserve">ng, mental model, </w:t>
-            </w:r>
-            <w:r>
-              <w:rPr>
-                <w:sz w:val="18"/>
-              </w:rPr>
-              <w:t>m</w:t>
+              <w:t>ng, mental model, m</w:t>
             </w:r>
             <w:r>
               <w:rPr>
@@ -5901,7 +5773,13 @@
               <w:rPr>
                 <w:sz w:val="18"/>
               </w:rPr>
-              <w:t>p vùng/concept, invariant, measurement.</w:t>
+              <w:t xml:space="preserve">p </w:t>
+            </w:r>
+            <w:r>
+              <w:rPr>
+                <w:sz w:val="18"/>
+              </w:rPr>
+              <w:t>vùng/concept, invariant, measurement.</w:t>
             </w:r>
           </w:p>
         </w:tc>
@@ -6208,7 +6086,14 @@
                 <w:rFonts w:ascii="Consolas" w:hAnsi="Consolas"/>
                 <w:sz w:val="18"/>
               </w:rPr>
-              <w:t>Relevant code/diff:</w:t>
+              <w:t xml:space="preserve">Relevant </w:t>
+            </w:r>
+            <w:r>
+              <w:rPr>
+                <w:rFonts w:ascii="Consolas" w:hAnsi="Consolas"/>
+                <w:sz w:val="18"/>
+              </w:rPr>
+              <w:t>code/diff:</w:t>
             </w:r>
             <w:r>
               <w:br/>
@@ -6300,10 +6185,7 @@
         <w:ind w:left="142" w:hanging="142"/>
       </w:pPr>
       <w:r>
-        <w:t xml:space="preserve">3. LOCK ASSUMPTIONS - </w:t>
-      </w:r>
-      <w:r>
-        <w:t>clock/pin/state/lifetime/bounds/version.</w:t>
+        <w:t>3. LOCK ASSUMPTIONS - clock/pin/state/lifetime/bounds/version.</w:t>
       </w:r>
     </w:p>
     <w:p>
@@ -6317,7 +6199,10 @@
         <w:t>ả</w:t>
       </w:r>
       <w:r>
-        <w:t xml:space="preserve"> thuy</w:t>
+        <w:t xml:space="preserve"> </w:t>
+      </w:r>
+      <w:r>
+        <w:t>thuy</w:t>
       </w:r>
       <w:r>
         <w:t>ế</w:t>
@@ -6451,10 +6336,7 @@
         <w:ind w:left="142" w:hanging="142"/>
       </w:pPr>
       <w:r>
-        <w:t>8. REGRESSION - thêm test</w:t>
-      </w:r>
-      <w:r>
-        <w:t xml:space="preserve"> ch</w:t>
+        <w:t>8. REGRESSION - thêm test ch</w:t>
       </w:r>
       <w:r>
         <w:t>ố</w:t>
@@ -6468,7 +6350,10 @@
         <w:ind w:left="142" w:hanging="142"/>
       </w:pPr>
       <w:r>
-        <w:t>9. ROOT-CAUSE STORY - lưu symptom → measurement → fix.</w:t>
+        <w:t>9. ROOT-CAUSE STORY - lưu symptom → measurement → fix</w:t>
+      </w:r>
+      <w:r>
+        <w:t>.</w:t>
       </w:r>
     </w:p>
     <w:p>
@@ -6694,13 +6579,7 @@
               <w:rPr>
                 <w:sz w:val="18"/>
               </w:rPr>
-              <w:t xml:space="preserve">t </w:t>
-            </w:r>
-            <w:r>
-              <w:rPr>
-                <w:sz w:val="18"/>
-              </w:rPr>
-              <w:t>measurement.</w:t>
+              <w:t>t measurement.</w:t>
             </w:r>
           </w:p>
         </w:tc>
@@ -6829,7 +6708,13 @@
               <w:rPr>
                 <w:sz w:val="18"/>
               </w:rPr>
-              <w:t>ng random edits, lưu repro + hypothesis.</w:t>
+              <w:t>ng</w:t>
+            </w:r>
+            <w:r>
+              <w:rPr>
+                <w:sz w:val="18"/>
+              </w:rPr>
+              <w:t xml:space="preserve"> random edits, lưu repro + hypothesis.</w:t>
             </w:r>
           </w:p>
         </w:tc>
@@ -7015,14 +6900,17 @@
                 <w:rFonts w:ascii="Consolas" w:hAnsi="Consolas"/>
                 <w:sz w:val="18"/>
               </w:rPr>
-              <w:t xml:space="preserve">Highest AI </w:t>
+              <w:t>Highest AI Level Used:</w:t>
+            </w:r>
+            <w:r>
+              <w:br/>
             </w:r>
             <w:r>
               <w:rPr>
                 <w:rFonts w:ascii="Consolas" w:hAnsi="Consolas"/>
                 <w:sz w:val="18"/>
               </w:rPr>
-              <w:t>Level Used:</w:t>
+              <w:t>Commit:</w:t>
             </w:r>
             <w:r>
               <w:br/>
@@ -7032,7 +6920,7 @@
                 <w:rFonts w:ascii="Consolas" w:hAnsi="Consolas"/>
                 <w:sz w:val="18"/>
               </w:rPr>
-              <w:t>Commit:</w:t>
+              <w:t>Files Changed:</w:t>
             </w:r>
             <w:r>
               <w:br/>
@@ -7042,7 +6930,7 @@
                 <w:rFonts w:ascii="Consolas" w:hAnsi="Consolas"/>
                 <w:sz w:val="18"/>
               </w:rPr>
-              <w:t>Files Changed:</w:t>
+              <w:t>Build Command:</w:t>
             </w:r>
             <w:r>
               <w:br/>
@@ -7052,7 +6940,7 @@
                 <w:rFonts w:ascii="Consolas" w:hAnsi="Consolas"/>
                 <w:sz w:val="18"/>
               </w:rPr>
-              <w:t>Build Command:</w:t>
+              <w:t>Build Result:</w:t>
             </w:r>
             <w:r>
               <w:br/>
@@ -7062,7 +6950,7 @@
                 <w:rFonts w:ascii="Consolas" w:hAnsi="Consolas"/>
                 <w:sz w:val="18"/>
               </w:rPr>
-              <w:t>Build Result:</w:t>
+              <w:t>Test Command:</w:t>
             </w:r>
             <w:r>
               <w:br/>
@@ -7072,17 +6960,14 @@
                 <w:rFonts w:ascii="Consolas" w:hAnsi="Consolas"/>
                 <w:sz w:val="18"/>
               </w:rPr>
-              <w:t>Test Command:</w:t>
-            </w:r>
-            <w:r>
-              <w:br/>
+              <w:t>T</w:t>
             </w:r>
             <w:r>
               <w:rPr>
                 <w:rFonts w:ascii="Consolas" w:hAnsi="Consolas"/>
                 <w:sz w:val="18"/>
               </w:rPr>
-              <w:t>Test Result:</w:t>
+              <w:t>est Result:</w:t>
             </w:r>
             <w:r>
               <w:br/>
@@ -7194,10 +7079,7 @@
         <w:t>ả</w:t>
       </w:r>
       <w:r>
-        <w:t xml:space="preserve"> repo. Ưu tiên commit/push lên GitHub</w:t>
-      </w:r>
-      <w:r>
-        <w:t xml:space="preserve"> r</w:t>
+        <w:t xml:space="preserve"> repo. Ưu tiên commit/push lên GitHub r</w:t>
       </w:r>
       <w:r>
         <w:t>ồ</w:t>
@@ -7268,7 +7150,13 @@
               <w:rPr>
                 <w:sz w:val="20"/>
               </w:rPr>
-              <w:t>i tách Artifact status và Competency status. ARTIFACT_PASS + COMPETENCY_UNVERIFIED là tr</w:t>
+              <w:t>i tách</w:t>
+            </w:r>
+            <w:r>
+              <w:rPr>
+                <w:sz w:val="20"/>
+              </w:rPr>
+              <w:t xml:space="preserve"> Artifact status và Competency status. ARTIFACT_PASS + COMPETENCY_UNVERIFIED là tr</w:t>
             </w:r>
             <w:r>
               <w:rPr>
@@ -7362,14 +7250,7 @@
                 <w:rFonts w:ascii="Consolas" w:hAnsi="Consolas"/>
                 <w:sz w:val="18"/>
               </w:rPr>
-              <w:t>feat(</w:t>
-            </w:r>
-            <w:r>
-              <w:rPr>
-                <w:rFonts w:ascii="Consolas" w:hAnsi="Consolas"/>
-                <w:sz w:val="18"/>
-              </w:rPr>
-              <w:t>ring-buffer): add bounded push and pop</w:t>
+              <w:t>feat(ring-buffer): add bounded push and pop</w:t>
             </w:r>
             <w:r>
               <w:br/>
@@ -7483,10 +7364,7 @@
         <w:t>ế</w:t>
       </w:r>
       <w:r>
-        <w:t xml:space="preserve">t </w:t>
-      </w:r>
-      <w:r>
-        <w:t>thúc ngày.</w:t>
+        <w:t>t thúc ngày.</w:t>
       </w:r>
     </w:p>
     <w:p>
@@ -7907,13 +7785,7 @@
               <w:rPr>
                 <w:sz w:val="18"/>
               </w:rPr>
-              <w:t xml:space="preserve">Logic analyzer, timing, </w:t>
-            </w:r>
-            <w:r>
-              <w:rPr>
-                <w:sz w:val="18"/>
-              </w:rPr>
-              <w:t>register dump.</w:t>
+              <w:t>Logic analyzer, timing, register dump.</w:t>
             </w:r>
           </w:p>
         </w:tc>
@@ -8099,10 +7971,7 @@
         <w:ind w:left="142" w:hanging="142"/>
       </w:pPr>
       <w:r>
-        <w:t xml:space="preserve">4. </w:t>
-      </w:r>
-      <w:r>
-        <w:t>Commit logical change.</w:t>
+        <w:t>4. Commit logical change.</w:t>
       </w:r>
     </w:p>
     <w:p>
@@ -8124,7 +7993,10 @@
         <w:t>ấ</w:t>
       </w:r>
       <w:r>
-        <w:t>m GREEN/YELLOW/RED đúng th</w:t>
+        <w:t xml:space="preserve">m GREEN/YELLOW/RED </w:t>
+      </w:r>
+      <w:r>
+        <w:t>đúng th</w:t>
       </w:r>
       <w:r>
         <w:t>ự</w:t>
@@ -8293,14 +8165,17 @@
                 <w:rFonts w:ascii="Consolas" w:hAnsi="Consolas"/>
                 <w:sz w:val="18"/>
               </w:rPr>
-              <w:t>5. AI</w:t>
+              <w:t>5. AI Usage</w:t>
+            </w:r>
+            <w:r>
+              <w:br/>
             </w:r>
             <w:r>
               <w:rPr>
                 <w:rFonts w:ascii="Consolas" w:hAnsi="Consolas"/>
                 <w:sz w:val="18"/>
               </w:rPr>
-              <w:t xml:space="preserve"> Usage</w:t>
+              <w:t>6. Artifact Result</w:t>
             </w:r>
             <w:r>
               <w:br/>
@@ -8310,7 +8185,7 @@
                 <w:rFonts w:ascii="Consolas" w:hAnsi="Consolas"/>
                 <w:sz w:val="18"/>
               </w:rPr>
-              <w:t>6. Artifact Result</w:t>
+              <w:t>7. Evidence</w:t>
             </w:r>
             <w:r>
               <w:br/>
@@ -8320,7 +8195,7 @@
                 <w:rFonts w:ascii="Consolas" w:hAnsi="Consolas"/>
                 <w:sz w:val="18"/>
               </w:rPr>
-              <w:t>7. Evidence</w:t>
+              <w:t>8. Measurements</w:t>
             </w:r>
             <w:r>
               <w:br/>
@@ -8330,17 +8205,14 @@
                 <w:rFonts w:ascii="Consolas" w:hAnsi="Consolas"/>
                 <w:sz w:val="18"/>
               </w:rPr>
-              <w:t>8. Measurements</w:t>
-            </w:r>
-            <w:r>
-              <w:br/>
+              <w:t xml:space="preserve">9. Understanding </w:t>
             </w:r>
             <w:r>
               <w:rPr>
                 <w:rFonts w:ascii="Consolas" w:hAnsi="Consolas"/>
                 <w:sz w:val="18"/>
               </w:rPr>
-              <w:t>9. Understanding Check</w:t>
+              <w:t>Check</w:t>
             </w:r>
             <w:r>
               <w:br/>
@@ -8475,6 +8347,104 @@
         <w:t>11. WEEKLY REVIEW, GATE VÀ RETEST</w:t>
       </w:r>
     </w:p>
+    <w:p>
+      <w:r>
+        <w:rPr>
+          <w:b/>
+        </w:rPr>
+        <w:t>B</w:t>
+      </w:r>
+      <w:r>
+        <w:rPr>
+          <w:b/>
+        </w:rPr>
+        <w:t>ạ</w:t>
+      </w:r>
+      <w:r>
+        <w:rPr>
+          <w:b/>
+        </w:rPr>
+        <w:t>n không c</w:t>
+      </w:r>
+      <w:r>
+        <w:rPr>
+          <w:b/>
+        </w:rPr>
+        <w:t>ầ</w:t>
+      </w:r>
+      <w:r>
+        <w:rPr>
+          <w:b/>
+        </w:rPr>
+        <w:t>n h</w:t>
+      </w:r>
+      <w:r>
+        <w:rPr>
+          <w:b/>
+        </w:rPr>
+        <w:t>ọ</w:t>
+      </w:r>
+      <w:r>
+        <w:rPr>
+          <w:b/>
+        </w:rPr>
+        <w:t>c thu</w:t>
+      </w:r>
+      <w:r>
+        <w:rPr>
+          <w:b/>
+        </w:rPr>
+        <w:t>ộ</w:t>
+      </w:r>
+      <w:r>
+        <w:rPr>
+          <w:b/>
+        </w:rPr>
+        <w:t>c CP-00/CP-01/... . BOOT và WEEKLY REVIEW ph</w:t>
+      </w:r>
+      <w:r>
+        <w:rPr>
+          <w:b/>
+        </w:rPr>
+        <w:t>ả</w:t>
+      </w:r>
+      <w:r>
+        <w:rPr>
+          <w:b/>
+        </w:rPr>
+        <w:t>i đ</w:t>
+      </w:r>
+      <w:r>
+        <w:rPr>
+          <w:b/>
+        </w:rPr>
+        <w:t>ọ</w:t>
+      </w:r>
+      <w:r>
+        <w:rPr>
+          <w:b/>
+        </w:rPr>
+        <w:t>c live ROADMAP_REVIEW_LOG.md và t</w:t>
+      </w:r>
+      <w:r>
+        <w:rPr>
+          <w:b/>
+        </w:rPr>
+        <w:t>ự</w:t>
+      </w:r>
+      <w:r>
+        <w:rPr>
+          <w:b/>
+        </w:rPr>
+        <w:t xml:space="preserve"> b</w:t>
+      </w:r>
+      <w:r>
+        <w:rPr>
+          <w:b/>
+        </w:rPr>
+        <w:t>áo khi review NOT_DUE / DUE / URGENT.</w:t>
+      </w:r>
+    </w:p>
     <w:tbl>
       <w:tblPr>
         <w:tblW w:w="0" w:type="auto"/>
@@ -8502,11 +8472,69 @@
           </w:tcPr>
           <w:p>
             <w:r>
-              <w:rPr>
-                <w:rFonts w:ascii="Consolas" w:hAnsi="Consolas"/>
-                <w:sz w:val="18"/>
-              </w:rPr>
               <w:t>WEEKLY REVIEW</w:t>
+            </w:r>
+            <w:r>
+              <w:br/>
+            </w:r>
+            <w:r>
+              <w:br/>
+              <w:t>Ngoài scorecard, AI ph</w:t>
+            </w:r>
+            <w:r>
+              <w:t>ả</w:t>
+            </w:r>
+            <w:r>
+              <w:t>i check ROADMAP_REVIEW_LOG.md và báo m</w:t>
+            </w:r>
+            <w:r>
+              <w:t>ộ</w:t>
+            </w:r>
+            <w:r>
+              <w:t>t trong: NOT_DUE / DUE / URGENT / COMPLETED / MISSING.</w:t>
+            </w:r>
+            <w:r>
+              <w:br/>
+              <w:t>N</w:t>
+            </w:r>
+            <w:r>
+              <w:t>ế</w:t>
+            </w:r>
+            <w:r>
+              <w:t>u checkpoint DUE b</w:t>
+            </w:r>
+            <w:r>
+              <w:t>ả</w:t>
+            </w:r>
+            <w:r>
+              <w:t>o v</w:t>
+            </w:r>
+            <w:r>
+              <w:t>ệ</w:t>
+            </w:r>
+            <w:r>
+              <w:t xml:space="preserve"> phase transition, ch</w:t>
+            </w:r>
+            <w:r>
+              <w:t>ạ</w:t>
+            </w:r>
+            <w:r>
+              <w:t>y ROADMAP REVIEW trư</w:t>
+            </w:r>
+            <w:r>
+              <w:t>ớ</w:t>
+            </w:r>
+            <w:r>
+              <w:t>c khi vư</w:t>
+            </w:r>
+            <w:r>
+              <w:t>ợ</w:t>
+            </w:r>
+            <w:r>
+              <w:t>t checkpo</w:t>
+            </w:r>
+            <w:r>
+              <w:t>int.</w:t>
             </w:r>
           </w:p>
         </w:tc>
@@ -8525,10 +8553,7 @@
         <w:t>ấ</w:t>
       </w:r>
       <w:r>
-        <w:t xml:space="preserve">m Output, </w:t>
-      </w:r>
-      <w:r>
-        <w:t>Understanding, Testing, Documentation, Health và Career; sau đó ra PASS / CONDITIONAL PASS / FAIL.</w:t>
+        <w:t>m Output, Understanding, Testing, Documentation, Health và Career; sau đó ra PASS / CONDITIONAL PASS / FAIL.</w:t>
       </w:r>
     </w:p>
     <w:tbl>
@@ -8763,7 +8788,13 @@
               <w:rPr>
                 <w:sz w:val="18"/>
               </w:rPr>
-              <w:t xml:space="preserve"> có deadline/closure.</w:t>
+              <w:t xml:space="preserve"> có </w:t>
+            </w:r>
+            <w:r>
+              <w:rPr>
+                <w:sz w:val="18"/>
+              </w:rPr>
+              <w:t>deadline/closure.</w:t>
             </w:r>
           </w:p>
         </w:tc>
@@ -8926,10 +8957,10 @@
         <w:t>ả</w:t>
       </w:r>
       <w:r>
-        <w:t>i có contract: Gate ID, competencies, prerequisites, AI mode, allowed references, time limit, tasks, rubric, mandatory items, auto-fai</w:t>
-      </w:r>
-      <w:r>
-        <w:t>l, evidence, retest rule.</w:t>
+        <w:t xml:space="preserve">i có contract: Gate ID, competencies, prerequisites, AI mode, allowed references, time limit, tasks, rubric, </w:t>
+      </w:r>
+      <w:r>
+        <w:t>mandatory items, auto-fail, evidence, retest rule.</w:t>
       </w:r>
     </w:p>
     <w:tbl>
@@ -9042,7 +9073,6 @@
         <w:pStyle w:val="Heading2"/>
       </w:pPr>
       <w:r>
-        <w:lastRenderedPageBreak/>
         <w:t>Retest</w:t>
       </w:r>
     </w:p>
@@ -9146,7 +9176,10 @@
         <w:pStyle w:val="Heading1"/>
       </w:pPr>
       <w:r>
-        <w:t>12. RECOVERY - FAIL KHÔNG CÓ NGHĨA RESET</w:t>
+        <w:t xml:space="preserve">12. RECOVERY - FAIL KHÔNG CÓ NGHĨA </w:t>
+      </w:r>
+      <w:r>
+        <w:t>RESET</w:t>
       </w:r>
     </w:p>
     <w:tbl>
@@ -9247,14 +9280,7 @@
                 <w:b/>
                 <w:sz w:val="18"/>
               </w:rPr>
-              <w:t xml:space="preserve">Ý </w:t>
-            </w:r>
-            <w:r>
-              <w:rPr>
-                <w:b/>
-                <w:sz w:val="18"/>
-              </w:rPr>
-              <w:t>nghĩa</w:t>
+              <w:t>Ý nghĩa</w:t>
             </w:r>
           </w:p>
         </w:tc>
@@ -9623,12 +9649,18 @@
               <w:rPr>
                 <w:sz w:val="20"/>
               </w:rPr>
-              <w:t>t gate fail → targeted recovery → fresh retest → resume. Không reset toàn roadmap vì m</w:t>
+              <w:t xml:space="preserve">t gate fail → targeted recovery → fresh retest → resume. Không reset toàn </w:t>
             </w:r>
             <w:r>
               <w:rPr>
                 <w:sz w:val="20"/>
               </w:rPr>
+              <w:t>roadmap vì m</w:t>
+            </w:r>
+            <w:r>
+              <w:rPr>
+                <w:sz w:val="20"/>
+              </w:rPr>
               <w:t>ộ</w:t>
             </w:r>
             <w:r>
@@ -9647,13 +9679,7 @@
               <w:rPr>
                 <w:sz w:val="20"/>
               </w:rPr>
-              <w:t xml:space="preserve">i thông </w:t>
-            </w:r>
-            <w:r>
-              <w:rPr>
-                <w:sz w:val="20"/>
-              </w:rPr>
-              <w:t>thư</w:t>
+              <w:t>i thông thư</w:t>
             </w:r>
             <w:r>
               <w:rPr>
@@ -9726,25 +9752,13 @@
           </w:tcPr>
           <w:p>
             <w:r>
-              <w:rPr>
-                <w:rFonts w:ascii="Consolas" w:hAnsi="Consolas"/>
-                <w:sz w:val="18"/>
-              </w:rPr>
               <w:t>roadmap-control/</w:t>
             </w:r>
             <w:r>
-              <w:rPr>
-                <w:rFonts w:ascii="Consolas" w:hAnsi="Consolas"/>
-                <w:sz w:val="18"/>
-              </w:rPr>
               <w:br/>
               <w:t>current-state.md | daily-log.md | competency-ledger.md | ai-usage-log.md</w:t>
             </w:r>
             <w:r>
-              <w:rPr>
-                <w:rFonts w:ascii="Consolas" w:hAnsi="Consolas"/>
-                <w:sz w:val="18"/>
-              </w:rPr>
               <w:br/>
               <w:t>weekly-scorecards/ | recovery/</w:t>
             </w:r>
@@ -9765,16 +9779,16 @@
         <w:t>ể</w:t>
       </w:r>
       <w:r>
-        <w:t xml:space="preserve"> giao AI. Không upload l</w:t>
+        <w:t xml:space="preserve"> giao AI. Không </w:t>
+      </w:r>
+      <w:r>
+        <w:t>upload l</w:t>
       </w:r>
       <w:r>
         <w:t>ạ</w:t>
       </w:r>
       <w:r>
-        <w:t xml:space="preserve">i các live files </w:t>
-      </w:r>
-      <w:r>
-        <w:t>này vào ChatGPT Project m</w:t>
+        <w:t>i các live files này vào ChatGPT Project m</w:t>
       </w:r>
       <w:r>
         <w:t>ỗ</w:t>
@@ -10004,15 +10018,9 @@
           </w:tcPr>
           <w:p>
             <w:r>
-              <w:rPr>
-                <w:sz w:val="17"/>
-              </w:rPr>
               <w:t>Gate</w:t>
             </w:r>
             <w:r>
-              <w:rPr>
-                <w:sz w:val="17"/>
-              </w:rPr>
               <w:br/>
               <w:t>Recovery</w:t>
             </w:r>
@@ -10032,45 +10040,24 @@
           </w:tcPr>
           <w:p>
             <w:r>
-              <w:rPr>
-                <w:sz w:val="17"/>
-              </w:rPr>
-              <w:t>competency-ledger + current-state; cu</w:t>
-            </w:r>
-            <w:r>
-              <w:rPr>
-                <w:sz w:val="17"/>
-              </w:rPr>
+              <w:t xml:space="preserve">competency-ledger + </w:t>
+            </w:r>
+            <w:r>
+              <w:t>current-state; cu</w:t>
+            </w:r>
+            <w:r>
               <w:t>ố</w:t>
             </w:r>
             <w:r>
-              <w:rPr>
-                <w:sz w:val="17"/>
-              </w:rPr>
               <w:t>i tu</w:t>
             </w:r>
             <w:r>
-              <w:rPr>
-                <w:sz w:val="17"/>
-              </w:rPr>
               <w:t>ầ</w:t>
             </w:r>
             <w:r>
-              <w:rPr>
-                <w:sz w:val="17"/>
-              </w:rPr>
-              <w:t xml:space="preserve">n thêm </w:t>
-            </w:r>
-            <w:r>
-              <w:rPr>
-                <w:sz w:val="17"/>
-              </w:rPr>
-              <w:t>scorecard</w:t>
-            </w:r>
-            <w:r>
-              <w:rPr>
-                <w:sz w:val="17"/>
-              </w:rPr>
+              <w:t>n thêm scorecard</w:t>
+            </w:r>
+            <w:r>
               <w:br/>
               <w:t>recovery plan + current-state</w:t>
             </w:r>
@@ -10451,7 +10438,13 @@
               <w:rPr>
                 <w:sz w:val="16"/>
               </w:rPr>
-              <w:t>i ti</w:t>
+              <w:t xml:space="preserve">i </w:t>
+            </w:r>
+            <w:r>
+              <w:rPr>
+                <w:sz w:val="16"/>
+              </w:rPr>
+              <w:t>ti</w:t>
             </w:r>
             <w:r>
               <w:rPr>
@@ -10495,13 +10488,7 @@
               <w:rPr>
                 <w:sz w:val="16"/>
               </w:rPr>
-              <w:t xml:space="preserve">4 positions + </w:t>
-            </w:r>
-            <w:r>
-              <w:rPr>
-                <w:sz w:val="16"/>
-              </w:rPr>
-              <w:t>gate + blocker + Next Action</w:t>
+              <w:t>4 positions + gate + blocker + Next Action</w:t>
             </w:r>
           </w:p>
         </w:tc>
@@ -10847,7 +10834,13 @@
               <w:rPr>
                 <w:sz w:val="16"/>
               </w:rPr>
-              <w:t>Fresh assessment, thư</w:t>
+              <w:t xml:space="preserve">Fresh </w:t>
+            </w:r>
+            <w:r>
+              <w:rPr>
+                <w:sz w:val="16"/>
+              </w:rPr>
+              <w:t>assessment, thư</w:t>
             </w:r>
             <w:r>
               <w:rPr>
@@ -11600,10 +11593,7 @@
           </w:tcPr>
           <w:p>
             <w:r>
-              <w:rPr>
-                <w:sz w:val="16"/>
-              </w:rPr>
-              <w:t>Scorecard + weekly decision</w:t>
+              <w:t>Scorecard + weekly decision + check roadmap-review status</w:t>
             </w:r>
           </w:p>
         </w:tc>
@@ -12241,14 +12231,7 @@
                 <w:b/>
                 <w:sz w:val="16"/>
               </w:rPr>
-              <w:t xml:space="preserve">MOCK </w:t>
-            </w:r>
-            <w:r>
-              <w:rPr>
-                <w:b/>
-                <w:sz w:val="16"/>
-              </w:rPr>
-              <w:t>INTERVIEW</w:t>
+              <w:t>MOCK INTERVIEW</w:t>
             </w:r>
           </w:p>
         </w:tc>
@@ -12665,14 +12648,45 @@
                 <w:rFonts w:ascii="Consolas" w:hAnsi="Consolas"/>
                 <w:sz w:val="18"/>
               </w:rPr>
-              <w:t>08:10</w:t>
+              <w:t>08:10  Theory Pack</w:t>
+            </w:r>
+            <w:r>
+              <w:br/>
             </w:r>
             <w:r>
               <w:rPr>
                 <w:rFonts w:ascii="Consolas" w:hAnsi="Consolas"/>
                 <w:sz w:val="18"/>
               </w:rPr>
-              <w:t xml:space="preserve">  Theory Pack</w:t>
+              <w:t>08:40  tr</w:t>
+            </w:r>
+            <w:r>
+              <w:rPr>
+                <w:rFonts w:ascii="Consolas" w:hAnsi="Consolas"/>
+                <w:sz w:val="18"/>
+              </w:rPr>
+              <w:t>ả</w:t>
+            </w:r>
+            <w:r>
+              <w:rPr>
+                <w:rFonts w:ascii="Consolas" w:hAnsi="Consolas"/>
+                <w:sz w:val="18"/>
+              </w:rPr>
+              <w:t xml:space="preserve"> l</w:t>
+            </w:r>
+            <w:r>
+              <w:rPr>
+                <w:rFonts w:ascii="Consolas" w:hAnsi="Consolas"/>
+                <w:sz w:val="18"/>
+              </w:rPr>
+              <w:t>ờ</w:t>
+            </w:r>
+            <w:r>
+              <w:rPr>
+                <w:rFonts w:ascii="Consolas" w:hAnsi="Consolas"/>
+                <w:sz w:val="18"/>
+              </w:rPr>
+              <w:t>i pre-check</w:t>
             </w:r>
             <w:r>
               <w:br/>
@@ -12682,35 +12696,45 @@
                 <w:rFonts w:ascii="Consolas" w:hAnsi="Consolas"/>
                 <w:sz w:val="18"/>
               </w:rPr>
-              <w:t>08:40  tr</w:t>
+              <w:t>09:00  m</w:t>
             </w:r>
             <w:r>
               <w:rPr>
                 <w:rFonts w:ascii="Consolas" w:hAnsi="Consolas"/>
                 <w:sz w:val="18"/>
               </w:rPr>
-              <w:t>ả</w:t>
+              <w:t>ở</w:t>
             </w:r>
             <w:r>
               <w:rPr>
                 <w:rFonts w:ascii="Consolas" w:hAnsi="Consolas"/>
                 <w:sz w:val="18"/>
               </w:rPr>
-              <w:t xml:space="preserve"> l</w:t>
+              <w:t xml:space="preserve"> TODO/starter</w:t>
+            </w:r>
+            <w:r>
+              <w:br/>
             </w:r>
             <w:r>
               <w:rPr>
                 <w:rFonts w:ascii="Consolas" w:hAnsi="Consolas"/>
                 <w:sz w:val="18"/>
               </w:rPr>
-              <w:t>ờ</w:t>
+              <w:t>09:05  t</w:t>
             </w:r>
             <w:r>
               <w:rPr>
                 <w:rFonts w:ascii="Consolas" w:hAnsi="Consolas"/>
                 <w:sz w:val="18"/>
               </w:rPr>
-              <w:t>i pre-check</w:t>
+              <w:t>ự</w:t>
+            </w:r>
+            <w:r>
+              <w:rPr>
+                <w:rFonts w:ascii="Consolas" w:hAnsi="Consolas"/>
+                <w:sz w:val="18"/>
+              </w:rPr>
+              <w:t xml:space="preserve"> code AI-1/AI-2</w:t>
             </w:r>
             <w:r>
               <w:br/>
@@ -12720,21 +12744,27 @@
                 <w:rFonts w:ascii="Consolas" w:hAnsi="Consolas"/>
                 <w:sz w:val="18"/>
               </w:rPr>
-              <w:t>09:00  m</w:t>
+              <w:t>11:00  test fail</w:t>
+            </w:r>
+            <w:r>
+              <w:br/>
             </w:r>
             <w:r>
               <w:rPr>
                 <w:rFonts w:ascii="Consolas" w:hAnsi="Consolas"/>
                 <w:sz w:val="18"/>
               </w:rPr>
-              <w:t>ở</w:t>
+              <w:t>11:05  DEBUG: ...</w:t>
+            </w:r>
+            <w:r>
+              <w:br/>
             </w:r>
             <w:r>
               <w:rPr>
                 <w:rFonts w:ascii="Consolas" w:hAnsi="Consolas"/>
                 <w:sz w:val="18"/>
               </w:rPr>
-              <w:t xml:space="preserve"> TODO/starter</w:t>
+              <w:t>11:30  fix + regression</w:t>
             </w:r>
             <w:r>
               <w:br/>
@@ -12744,21 +12774,34 @@
                 <w:rFonts w:ascii="Consolas" w:hAnsi="Consolas"/>
                 <w:sz w:val="18"/>
               </w:rPr>
-              <w:t>09:05  t</w:t>
+              <w:t>14:00  edge cases</w:t>
+            </w:r>
+            <w:r>
+              <w:br/>
             </w:r>
             <w:r>
               <w:rPr>
                 <w:rFonts w:ascii="Consolas" w:hAnsi="Consolas"/>
                 <w:sz w:val="18"/>
               </w:rPr>
-              <w:t>ự</w:t>
+              <w:t>16:00  build/test clean</w:t>
+            </w:r>
+            <w:r>
+              <w:br/>
             </w:r>
             <w:r>
               <w:rPr>
                 <w:rFonts w:ascii="Consolas" w:hAnsi="Consolas"/>
                 <w:sz w:val="18"/>
               </w:rPr>
-              <w:t xml:space="preserve"> code AI-1/AI-2</w:t>
+              <w:t xml:space="preserve">16:15  CHECK </w:t>
+            </w:r>
+            <w:r>
+              <w:rPr>
+                <w:rFonts w:ascii="Consolas" w:hAnsi="Consolas"/>
+                <w:sz w:val="18"/>
+              </w:rPr>
+              <w:t>UNDERSTANDING</w:t>
             </w:r>
             <w:r>
               <w:br/>
@@ -12768,7 +12811,7 @@
                 <w:rFonts w:ascii="Consolas" w:hAnsi="Consolas"/>
                 <w:sz w:val="18"/>
               </w:rPr>
-              <w:t>11:00  test fail</w:t>
+              <w:t>16:30  commit/push</w:t>
             </w:r>
             <w:r>
               <w:br/>
@@ -12778,7 +12821,7 @@
                 <w:rFonts w:ascii="Consolas" w:hAnsi="Consolas"/>
                 <w:sz w:val="18"/>
               </w:rPr>
-              <w:t>11:05  DEBUG: ...</w:t>
+              <w:t>16:40  SUBMIT TODO</w:t>
             </w:r>
             <w:r>
               <w:br/>
@@ -12788,74 +12831,7 @@
                 <w:rFonts w:ascii="Consolas" w:hAnsi="Consolas"/>
                 <w:sz w:val="18"/>
               </w:rPr>
-              <w:t>11:30  fix + regression</w:t>
-            </w:r>
-            <w:r>
-              <w:br/>
-            </w:r>
-            <w:r>
-              <w:rPr>
-                <w:rFonts w:ascii="Consolas" w:hAnsi="Consolas"/>
-                <w:sz w:val="18"/>
-              </w:rPr>
-              <w:t>14:00  edge cases</w:t>
-            </w:r>
-            <w:r>
-              <w:br/>
-            </w:r>
-            <w:r>
-              <w:rPr>
-                <w:rFonts w:ascii="Consolas" w:hAnsi="Consolas"/>
-                <w:sz w:val="18"/>
-              </w:rPr>
-              <w:t>16:00  build/test clean</w:t>
-            </w:r>
-            <w:r>
-              <w:br/>
-            </w:r>
-            <w:r>
-              <w:rPr>
-                <w:rFonts w:ascii="Consolas" w:hAnsi="Consolas"/>
-                <w:sz w:val="18"/>
-              </w:rPr>
-              <w:t>16:15  CHECK UNDERSTANDING</w:t>
-            </w:r>
-            <w:r>
-              <w:br/>
-            </w:r>
-            <w:r>
-              <w:rPr>
-                <w:rFonts w:ascii="Consolas" w:hAnsi="Consolas"/>
-                <w:sz w:val="18"/>
-              </w:rPr>
-              <w:t>16:30  commit/push</w:t>
-            </w:r>
-            <w:r>
-              <w:br/>
-            </w:r>
-            <w:r>
-              <w:rPr>
-                <w:rFonts w:ascii="Consolas" w:hAnsi="Consolas"/>
-                <w:sz w:val="18"/>
-              </w:rPr>
-              <w:t>16:40  SUBMIT TODO</w:t>
-            </w:r>
-            <w:r>
-              <w:br/>
-            </w:r>
-            <w:r>
-              <w:rPr>
-                <w:rFonts w:ascii="Consolas" w:hAnsi="Consolas"/>
-                <w:sz w:val="18"/>
-              </w:rPr>
-              <w:t>17:</w:t>
-            </w:r>
-            <w:r>
-              <w:rPr>
-                <w:rFonts w:ascii="Consolas" w:hAnsi="Consolas"/>
-                <w:sz w:val="18"/>
-              </w:rPr>
-              <w:t>00  s</w:t>
+              <w:t>17:00  s</w:t>
             </w:r>
             <w:r>
               <w:rPr>
@@ -13017,7 +12993,14 @@
                 <w:rFonts w:ascii="Consolas" w:hAnsi="Consolas"/>
                 <w:sz w:val="18"/>
               </w:rPr>
-              <w:t>→ debugger/register view</w:t>
+              <w:t>→ debugger/regi</w:t>
+            </w:r>
+            <w:r>
+              <w:rPr>
+                <w:rFonts w:ascii="Consolas" w:hAnsi="Consolas"/>
+                <w:sz w:val="18"/>
+              </w:rPr>
+              <w:t>ster view</w:t>
             </w:r>
             <w:r>
               <w:br/>
@@ -13037,14 +13020,7 @@
                 <w:rFonts w:ascii="Consolas" w:hAnsi="Consolas"/>
                 <w:sz w:val="18"/>
               </w:rPr>
-              <w:t>→ negative/</w:t>
-            </w:r>
-            <w:r>
-              <w:rPr>
-                <w:rFonts w:ascii="Consolas" w:hAnsi="Consolas"/>
-                <w:sz w:val="18"/>
-              </w:rPr>
-              <w:t>fault case</w:t>
+              <w:t>→ negative/fault case</w:t>
             </w:r>
             <w:r>
               <w:br/>
@@ -13150,7 +13126,10 @@
         <w:ind w:left="142" w:hanging="142"/>
       </w:pPr>
       <w:r>
-        <w:t>3. Không paste AI full solution r</w:t>
+        <w:t>3. Không paste AI full sol</w:t>
+      </w:r>
+      <w:r>
+        <w:t>ution r</w:t>
       </w:r>
       <w:r>
         <w:t>ồ</w:t>
@@ -13176,10 +13155,7 @@
         <w:ind w:left="142" w:hanging="142"/>
       </w:pPr>
       <w:r>
-        <w:t xml:space="preserve">4. Không xóa failure evidence </w:t>
-      </w:r>
-      <w:r>
-        <w:t>đ</w:t>
+        <w:t>4. Không xóa failure evidence đ</w:t>
       </w:r>
       <w:r>
         <w:t>ể</w:t>
@@ -13253,7 +13229,10 @@
         <w:t>ớ</w:t>
       </w:r>
       <w:r>
-        <w:t>c khi có trade-off.</w:t>
+        <w:t>c khi</w:t>
+      </w:r>
+      <w:r>
+        <w:t xml:space="preserve"> có trade-off.</w:t>
       </w:r>
     </w:p>
     <w:p>
@@ -13273,10 +13252,7 @@
         <w:t>ả</w:t>
       </w:r>
       <w:r>
-        <w:t xml:space="preserve"> schedule deb</w:t>
-      </w:r>
-      <w:r>
-        <w:t>t.</w:t>
+        <w:t xml:space="preserve"> schedule debt.</w:t>
       </w:r>
     </w:p>
     <w:p>
@@ -13375,7 +13351,10 @@
         <w:t>☐</w:t>
       </w:r>
       <w:r>
-        <w:t xml:space="preserve"> Xác nh</w:t>
+        <w:t xml:space="preserve"> Xác </w:t>
+      </w:r>
+      <w:r>
+        <w:t>nh</w:t>
       </w:r>
       <w:r>
         <w:t>ậ</w:t>
@@ -13395,10 +13374,7 @@
         <w:t>ộ</w:t>
       </w:r>
       <w:r>
-        <w:t xml:space="preserve">t </w:t>
-      </w:r>
-      <w:r>
-        <w:t>outcome duy nh</w:t>
+        <w:t>t outcome duy nh</w:t>
       </w:r>
       <w:r>
         <w:t>ấ</w:t>
@@ -13486,7 +13462,10 @@
         <w:t>☐</w:t>
       </w:r>
       <w:r>
-        <w:t xml:space="preserve"> Bug → hypothesis + measurement trư</w:t>
+        <w:t xml:space="preserve"> </w:t>
+      </w:r>
+      <w:r>
+        <w:t>Bug → hypothesis + measurement trư</w:t>
       </w:r>
       <w:r>
         <w:t>ớ</w:t>
@@ -13500,10 +13479,7 @@
         <w:t>☐</w:t>
       </w:r>
       <w:r>
-        <w:t xml:space="preserve"> Build/test </w:t>
-      </w:r>
-      <w:r>
-        <w:t>có command reproducible</w:t>
+        <w:t xml:space="preserve"> Build/test có command reproducible</w:t>
       </w:r>
     </w:p>
     <w:p>
@@ -13583,7 +13559,10 @@
         <w:t>ầ</w:t>
       </w:r>
       <w:r>
-        <w:t>n thi</w:t>
+        <w:t>n th</w:t>
+      </w:r>
+      <w:r>
+        <w:t>i</w:t>
       </w:r>
       <w:r>
         <w:t>ế</w:t>
@@ -13619,10 +13598,7 @@
         <w:t>ự</w:t>
       </w:r>
       <w:r>
-        <w:t>c</w:t>
-      </w:r>
-      <w:r>
-        <w:t xml:space="preserve"> t</w:t>
+        <w:t>c t</w:t>
       </w:r>
       <w:r>
         <w:t>ế</w:t>
@@ -13697,48 +13673,22 @@
           </w:tcPr>
           <w:p>
             <w:r>
-              <w:rPr>
-                <w:rFonts w:ascii="Consolas" w:hAnsi="Consolas"/>
-                <w:sz w:val="18"/>
-              </w:rPr>
               <w:t>B</w:t>
             </w:r>
             <w:r>
-              <w:rPr>
-                <w:rFonts w:ascii="Consolas" w:hAnsi="Consolas"/>
-                <w:sz w:val="18"/>
-              </w:rPr>
               <w:t>Ắ</w:t>
             </w:r>
             <w:r>
-              <w:rPr>
-                <w:rFonts w:ascii="Consolas" w:hAnsi="Consolas"/>
-                <w:sz w:val="18"/>
-              </w:rPr>
               <w:t>T Đ</w:t>
             </w:r>
             <w:r>
-              <w:rPr>
-                <w:rFonts w:ascii="Consolas" w:hAnsi="Consolas"/>
-                <w:sz w:val="18"/>
-              </w:rPr>
               <w:t>Ầ</w:t>
             </w:r>
             <w:r>
-              <w:rPr>
-                <w:rFonts w:ascii="Consolas" w:hAnsi="Consolas"/>
-                <w:sz w:val="18"/>
-              </w:rPr>
               <w:t>U / RESUME</w:t>
             </w:r>
             <w:r>
               <w:br/>
-            </w:r>
-            <w:r>
-              <w:rPr>
-                <w:rFonts w:ascii="Consolas" w:hAnsi="Consolas"/>
-                <w:sz w:val="18"/>
-              </w:rPr>
               <w:t>BOOT</w:t>
             </w:r>
             <w:r>
@@ -13746,60 +13696,26 @@
             </w:r>
             <w:r>
               <w:br/>
-            </w:r>
-            <w:r>
-              <w:rPr>
-                <w:rFonts w:ascii="Consolas" w:hAnsi="Consolas"/>
-                <w:sz w:val="18"/>
-              </w:rPr>
               <w:t>CH</w:t>
             </w:r>
             <w:r>
-              <w:rPr>
-                <w:rFonts w:ascii="Consolas" w:hAnsi="Consolas"/>
-                <w:sz w:val="18"/>
-              </w:rPr>
               <w:t>Ỉ</w:t>
             </w:r>
             <w:r>
-              <w:rPr>
-                <w:rFonts w:ascii="Consolas" w:hAnsi="Consolas"/>
-                <w:sz w:val="18"/>
-              </w:rPr>
               <w:t xml:space="preserve"> XEM TR</w:t>
             </w:r>
             <w:r>
-              <w:rPr>
-                <w:rFonts w:ascii="Consolas" w:hAnsi="Consolas"/>
-                <w:sz w:val="18"/>
-              </w:rPr>
               <w:t>Ạ</w:t>
             </w:r>
             <w:r>
-              <w:rPr>
-                <w:rFonts w:ascii="Consolas" w:hAnsi="Consolas"/>
-                <w:sz w:val="18"/>
-              </w:rPr>
               <w:t>NG THÁI</w:t>
             </w:r>
             <w:r>
               <w:br/>
-            </w:r>
-            <w:r>
-              <w:rPr>
-                <w:rFonts w:ascii="Consolas" w:hAnsi="Consolas"/>
-                <w:sz w:val="18"/>
-              </w:rPr>
               <w:t>STATUS</w:t>
             </w:r>
             <w:r>
               <w:br/>
-            </w:r>
-            <w:r>
-              <w:rPr>
-                <w:rFonts w:ascii="Consolas" w:hAnsi="Consolas"/>
-                <w:sz w:val="18"/>
-              </w:rPr>
               <w:t>BOOT STATUS ONLY</w:t>
             </w:r>
             <w:r>
@@ -13807,36 +13723,16 @@
             </w:r>
             <w:r>
               <w:br/>
-            </w:r>
-            <w:r>
-              <w:rPr>
-                <w:rFonts w:ascii="Consolas" w:hAnsi="Consolas"/>
-                <w:sz w:val="18"/>
-              </w:rPr>
               <w:t>H</w:t>
             </w:r>
             <w:r>
-              <w:rPr>
-                <w:rFonts w:ascii="Consolas" w:hAnsi="Consolas"/>
-                <w:sz w:val="18"/>
-              </w:rPr>
               <w:t>Ọ</w:t>
             </w:r>
             <w:r>
-              <w:rPr>
-                <w:rFonts w:ascii="Consolas" w:hAnsi="Consolas"/>
-                <w:sz w:val="18"/>
-              </w:rPr>
               <w:t>C THEORY</w:t>
             </w:r>
             <w:r>
               <w:br/>
-            </w:r>
-            <w:r>
-              <w:rPr>
-                <w:rFonts w:ascii="Consolas" w:hAnsi="Consolas"/>
-                <w:sz w:val="18"/>
-              </w:rPr>
               <w:t>TEACH: &lt;topic&gt;</w:t>
             </w:r>
             <w:r>
@@ -13844,50 +13740,22 @@
             </w:r>
             <w:r>
               <w:br/>
-            </w:r>
-            <w:r>
-              <w:rPr>
-                <w:rFonts w:ascii="Consolas" w:hAnsi="Consolas"/>
-                <w:sz w:val="18"/>
-              </w:rPr>
               <w:t>T</w:t>
             </w:r>
             <w:r>
-              <w:rPr>
-                <w:rFonts w:ascii="Consolas" w:hAnsi="Consolas"/>
-                <w:sz w:val="18"/>
-              </w:rPr>
               <w:t>Ự</w:t>
             </w:r>
             <w:r>
-              <w:rPr>
-                <w:rFonts w:ascii="Consolas" w:hAnsi="Consolas"/>
-                <w:sz w:val="18"/>
-              </w:rPr>
               <w:t xml:space="preserve"> KI</w:t>
             </w:r>
             <w:r>
-              <w:rPr>
-                <w:rFonts w:ascii="Consolas" w:hAnsi="Consolas"/>
-                <w:sz w:val="18"/>
-              </w:rPr>
               <w:t>Ể</w:t>
             </w:r>
             <w:r>
-              <w:rPr>
-                <w:rFonts w:ascii="Consolas" w:hAnsi="Consolas"/>
-                <w:sz w:val="18"/>
-              </w:rPr>
               <w:t>M TRA</w:t>
             </w:r>
             <w:r>
               <w:br/>
-            </w:r>
-            <w:r>
-              <w:rPr>
-                <w:rFonts w:ascii="Consolas" w:hAnsi="Consolas"/>
-                <w:sz w:val="18"/>
-              </w:rPr>
               <w:t>CHECK UNDERSTANDING: &lt;topic&gt;</w:t>
             </w:r>
             <w:r>
@@ -13895,22 +13763,10 @@
             </w:r>
             <w:r>
               <w:br/>
-            </w:r>
-            <w:r>
-              <w:rPr>
-                <w:rFonts w:ascii="Consolas" w:hAnsi="Consolas"/>
-                <w:sz w:val="18"/>
-              </w:rPr>
               <w:t>BÍ</w:t>
             </w:r>
             <w:r>
               <w:br/>
-            </w:r>
-            <w:r>
-              <w:rPr>
-                <w:rFonts w:ascii="Consolas" w:hAnsi="Consolas"/>
-                <w:sz w:val="18"/>
-              </w:rPr>
               <w:t>HINT 1 → HINT 2 → HINT 3 → HINT 4</w:t>
             </w:r>
             <w:r>
@@ -13918,52 +13774,21 @@
             </w:r>
             <w:r>
               <w:br/>
-            </w:r>
-            <w:r>
-              <w:rPr>
-                <w:rFonts w:ascii="Consolas" w:hAnsi="Consolas"/>
-                <w:sz w:val="18"/>
-              </w:rPr>
               <w:t>BUG</w:t>
             </w:r>
             <w:r>
               <w:br/>
-            </w:r>
-            <w:r>
-              <w:rPr>
-                <w:rFonts w:ascii="Consolas" w:hAnsi="Consolas"/>
-                <w:sz w:val="18"/>
-              </w:rPr>
-              <w:t xml:space="preserve">DEBUG: </w:t>
-            </w:r>
-            <w:r>
-              <w:rPr>
-                <w:rFonts w:ascii="Consolas" w:hAnsi="Consolas"/>
-                <w:sz w:val="18"/>
-              </w:rPr>
-              <w:t>&lt;symptom&gt;</w:t>
+              <w:t>DEBUG: &lt;symptom&gt;</w:t>
             </w:r>
             <w:r>
               <w:br/>
             </w:r>
             <w:r>
               <w:br/>
-            </w:r>
-            <w:r>
-              <w:rPr>
-                <w:rFonts w:ascii="Consolas" w:hAnsi="Consolas"/>
-                <w:sz w:val="18"/>
-              </w:rPr>
               <w:t>LÀM XONG BÀI</w:t>
             </w:r>
             <w:r>
               <w:br/>
-            </w:r>
-            <w:r>
-              <w:rPr>
-                <w:rFonts w:ascii="Consolas" w:hAnsi="Consolas"/>
-                <w:sz w:val="18"/>
-              </w:rPr>
               <w:t>SUBMIT TODO</w:t>
             </w:r>
             <w:r>
@@ -13971,22 +13796,10 @@
             </w:r>
             <w:r>
               <w:br/>
-            </w:r>
-            <w:r>
-              <w:rPr>
-                <w:rFonts w:ascii="Consolas" w:hAnsi="Consolas"/>
-                <w:sz w:val="18"/>
-              </w:rPr>
               <w:t>ĐÓNG NGÀY</w:t>
             </w:r>
             <w:r>
               <w:br/>
-            </w:r>
-            <w:r>
-              <w:rPr>
-                <w:rFonts w:ascii="Consolas" w:hAnsi="Consolas"/>
-                <w:sz w:val="18"/>
-              </w:rPr>
               <w:t>END DAY</w:t>
             </w:r>
             <w:r>
@@ -13994,50 +13807,22 @@
             </w:r>
             <w:r>
               <w:br/>
-            </w:r>
-            <w:r>
-              <w:rPr>
-                <w:rFonts w:ascii="Consolas" w:hAnsi="Consolas"/>
-                <w:sz w:val="18"/>
-              </w:rPr>
               <w:t>CU</w:t>
             </w:r>
             <w:r>
-              <w:rPr>
-                <w:rFonts w:ascii="Consolas" w:hAnsi="Consolas"/>
-                <w:sz w:val="18"/>
-              </w:rPr>
               <w:t>Ố</w:t>
             </w:r>
             <w:r>
-              <w:rPr>
-                <w:rFonts w:ascii="Consolas" w:hAnsi="Consolas"/>
-                <w:sz w:val="18"/>
-              </w:rPr>
               <w:t>I TU</w:t>
             </w:r>
             <w:r>
-              <w:rPr>
-                <w:rFonts w:ascii="Consolas" w:hAnsi="Consolas"/>
-                <w:sz w:val="18"/>
-              </w:rPr>
               <w:t>Ầ</w:t>
             </w:r>
             <w:r>
-              <w:rPr>
-                <w:rFonts w:ascii="Consolas" w:hAnsi="Consolas"/>
-                <w:sz w:val="18"/>
-              </w:rPr>
               <w:t>N</w:t>
             </w:r>
             <w:r>
               <w:br/>
-            </w:r>
-            <w:r>
-              <w:rPr>
-                <w:rFonts w:ascii="Consolas" w:hAnsi="Consolas"/>
-                <w:sz w:val="18"/>
-              </w:rPr>
               <w:t>WEEKLY REVIEW</w:t>
             </w:r>
             <w:r>
@@ -14045,22 +13830,50 @@
             </w:r>
             <w:r>
               <w:br/>
-            </w:r>
-            <w:r>
-              <w:rPr>
-                <w:rFonts w:ascii="Consolas" w:hAnsi="Consolas"/>
-                <w:sz w:val="18"/>
-              </w:rPr>
+              <w:t>RÀ SOÁT ROADMAP KHI H</w:t>
+            </w:r>
+            <w:r>
+              <w:t>Ệ</w:t>
+            </w:r>
+            <w:r>
+              <w:t xml:space="preserve"> TH</w:t>
+            </w:r>
+            <w:r>
+              <w:t>Ố</w:t>
+            </w:r>
+            <w:r>
+              <w:t>NG BÁO DUE</w:t>
+            </w:r>
+            <w:r>
+              <w:br/>
+              <w:t>ROADMAP REVIEW</w:t>
+            </w:r>
+            <w:r>
+              <w:br/>
+            </w:r>
+            <w:r>
+              <w:br/>
+              <w:t>R3/R4 KH</w:t>
+            </w:r>
+            <w:r>
+              <w:t>Ẩ</w:t>
+            </w:r>
+            <w:r>
+              <w:t>N</w:t>
+            </w:r>
+            <w:r>
+              <w:br/>
+              <w:t>ROADMAP REVIEW — URGENT</w:t>
+            </w:r>
+            <w:r>
+              <w:br/>
+            </w:r>
+            <w:r>
+              <w:br/>
               <w:t>FORMAL COMPETENCY</w:t>
             </w:r>
             <w:r>
               <w:br/>
-            </w:r>
-            <w:r>
-              <w:rPr>
-                <w:rFonts w:ascii="Consolas" w:hAnsi="Consolas"/>
-                <w:sz w:val="18"/>
-              </w:rPr>
               <w:t>GATE</w:t>
             </w:r>
             <w:r>
@@ -14068,29 +13881,16 @@
             </w:r>
             <w:r>
               <w:br/>
-            </w:r>
-            <w:r>
-              <w:rPr>
-                <w:rFonts w:ascii="Consolas" w:hAnsi="Consolas"/>
-                <w:sz w:val="18"/>
-              </w:rPr>
-              <w:t>FAIL / INVALID / TR</w:t>
-            </w:r>
-            <w:r>
-              <w:rPr>
-                <w:rFonts w:ascii="Consolas" w:hAnsi="Consolas"/>
-                <w:sz w:val="18"/>
-              </w:rPr>
+              <w:t>FAIL / INVA</w:t>
+            </w:r>
+            <w:r>
+              <w:t>LID / TR</w:t>
+            </w:r>
+            <w:r>
               <w:t>Ễ</w:t>
             </w:r>
             <w:r>
               <w:br/>
-            </w:r>
-            <w:r>
-              <w:rPr>
-                <w:rFonts w:ascii="Consolas" w:hAnsi="Consolas"/>
-                <w:sz w:val="18"/>
-              </w:rPr>
               <w:t>RECOVERY → RETEST</w:t>
             </w:r>
             <w:r>
@@ -14098,36 +13898,16 @@
             </w:r>
             <w:r>
               <w:br/>
-            </w:r>
-            <w:r>
-              <w:rPr>
-                <w:rFonts w:ascii="Consolas" w:hAnsi="Consolas"/>
-                <w:sz w:val="18"/>
-              </w:rPr>
               <w:t>Đ</w:t>
             </w:r>
             <w:r>
-              <w:rPr>
-                <w:rFonts w:ascii="Consolas" w:hAnsi="Consolas"/>
-                <w:sz w:val="18"/>
-              </w:rPr>
               <w:t>Ổ</w:t>
             </w:r>
             <w:r>
-              <w:rPr>
-                <w:rFonts w:ascii="Consolas" w:hAnsi="Consolas"/>
-                <w:sz w:val="18"/>
-              </w:rPr>
               <w:t>I CHAT / ACCOUNT</w:t>
             </w:r>
             <w:r>
               <w:br/>
-            </w:r>
-            <w:r>
-              <w:rPr>
-                <w:rFonts w:ascii="Consolas" w:hAnsi="Consolas"/>
-                <w:sz w:val="18"/>
-              </w:rPr>
               <w:t>HANDOFF</w:t>
             </w:r>
           </w:p>
@@ -14165,11 +13945,6 @@
             </w:tcMar>
           </w:tcPr>
           <w:p>
-            <w:pPr>
-              <w:rPr>
-                <w:sz w:val="20"/>
-              </w:rPr>
-            </w:pPr>
             <w:r>
               <w:rPr>
                 <w:b/>
@@ -14223,115 +13998,79 @@
               <w:rPr>
                 <w:sz w:val="20"/>
               </w:rPr>
-              <w:t xml:space="preserve">1) Artifact PASS khác Competency PASS. </w:t>
-            </w:r>
-          </w:p>
-          <w:p>
-            <w:pPr>
+              <w:t>1) Artifact PASS khác Competency PASS. 2) Core implementation ph</w:t>
+            </w:r>
+            <w:r>
               <w:rPr>
                 <w:sz w:val="20"/>
               </w:rPr>
-            </w:pPr>
+              <w:t>ả</w:t>
+            </w:r>
             <w:r>
               <w:rPr>
                 <w:sz w:val="20"/>
               </w:rPr>
-              <w:t>2) Core implementation ph</w:t>
+              <w:t>i có attempt c</w:t>
             </w:r>
             <w:r>
               <w:rPr>
                 <w:sz w:val="20"/>
               </w:rPr>
-              <w:t>ả</w:t>
+              <w:t>ủ</w:t>
             </w:r>
             <w:r>
               <w:rPr>
                 <w:sz w:val="20"/>
               </w:rPr>
-              <w:t>i có attempt c</w:t>
+              <w:t>a mình trư</w:t>
             </w:r>
             <w:r>
               <w:rPr>
                 <w:sz w:val="20"/>
               </w:rPr>
-              <w:t>ủ</w:t>
+              <w:t>ớ</w:t>
             </w:r>
             <w:r>
               <w:rPr>
                 <w:sz w:val="20"/>
               </w:rPr>
-              <w:t>a mình trư</w:t>
+              <w:t>c. 3) Debug b</w:t>
             </w:r>
             <w:r>
               <w:rPr>
                 <w:sz w:val="20"/>
               </w:rPr>
-              <w:t>ớ</w:t>
+              <w:t>ằ</w:t>
             </w:r>
             <w:r>
               <w:rPr>
                 <w:sz w:val="20"/>
               </w:rPr>
-              <w:t xml:space="preserve">c. </w:t>
-            </w:r>
-          </w:p>
-          <w:p>
-            <w:pPr>
+              <w:t>ng measurement, không s</w:t>
+            </w:r>
+            <w:r>
               <w:rPr>
                 <w:sz w:val="20"/>
               </w:rPr>
-            </w:pPr>
+              <w:t>ử</w:t>
+            </w:r>
             <w:r>
               <w:rPr>
                 <w:sz w:val="20"/>
               </w:rPr>
-              <w:t>3) Debug b</w:t>
+              <w:t>a ng</w:t>
             </w:r>
             <w:r>
               <w:rPr>
                 <w:sz w:val="20"/>
               </w:rPr>
-              <w:t>ằ</w:t>
+              <w:t>ẫ</w:t>
             </w:r>
             <w:r>
               <w:rPr>
                 <w:sz w:val="20"/>
               </w:rPr>
-              <w:t>ng measurement, không s</w:t>
-            </w:r>
-            <w:r>
-              <w:rPr>
-                <w:sz w:val="20"/>
-              </w:rPr>
-              <w:t>ử</w:t>
-            </w:r>
-            <w:r>
-              <w:rPr>
-                <w:sz w:val="20"/>
-              </w:rPr>
-              <w:t>a ng</w:t>
-            </w:r>
-            <w:r>
-              <w:rPr>
-                <w:sz w:val="20"/>
-              </w:rPr>
-              <w:t>ẫ</w:t>
-            </w:r>
-            <w:r>
-              <w:rPr>
-                <w:sz w:val="20"/>
-              </w:rPr>
-              <w:t xml:space="preserve">u nhiên. </w:t>
-            </w:r>
-          </w:p>
-          <w:p>
-            <w:bookmarkStart w:id="0" w:name="_GoBack"/>
-            <w:bookmarkEnd w:id="0"/>
-            <w:r>
-              <w:rPr>
-                <w:sz w:val="20"/>
-              </w:rPr>
-              <w:t>4) M</w:t>
+              <w:t>u nhiên. 4) M</w:t>
             </w:r>
             <w:r>
               <w:rPr>
@@ -14413,7 +14152,7 @@
           <w:i/>
           <w:sz w:val="17"/>
         </w:rPr>
-        <w:t>n: SYSTEM_SPEC_V3.md 3.0.0 • EMBEDDED_ROADMAP_V3.1.docx 3.1.0 • MASTER_PROMPT_V3.md 3.0.0</w:t>
+        <w:t>n: SYSTEM_SPEC_V3.md 3.0.0 • EMBEDDED_ROADMAP_V3.1.docx 3.1.0 • MASTER_PROMPT_V3.md 3.0.2</w:t>
       </w:r>
     </w:p>
     <w:p>
@@ -14453,14 +14192,7 @@
           <w:i/>
           <w:sz w:val="17"/>
         </w:rPr>
-        <w:t xml:space="preserve">n, ba </w:t>
-      </w:r>
-      <w:r>
-        <w:rPr>
-          <w:i/>
-          <w:sz w:val="17"/>
-        </w:rPr>
-        <w:t>ngu</w:t>
+        <w:t>n, ba ngu</w:t>
       </w:r>
       <w:r>
         <w:rPr>
@@ -14578,7 +14310,7 @@
         <w:noProof/>
         <w:sz w:val="18"/>
       </w:rPr>
-      <w:t>13</w:t>
+      <w:t>1</w:t>
     </w:r>
     <w:r>
       <w:rPr>
@@ -26589,7 +26321,7 @@
 </file>
 
 <file path=customXml/itemProps1.xml><?xml version="1.0" encoding="utf-8"?>
-<ds:datastoreItem xmlns:ds="http://schemas.openxmlformats.org/officeDocument/2006/customXml" ds:itemID="{56C2705E-4279-40D5-8B2C-1B74FFCFABB7}">
+<ds:datastoreItem xmlns:ds="http://schemas.openxmlformats.org/officeDocument/2006/customXml" ds:itemID="{B151D1C6-BA72-40F7-B109-44E7EC811FAA}">
   <ds:schemaRefs>
     <ds:schemaRef ds:uri="http://schemas.openxmlformats.org/officeDocument/2006/bibliography"/>
   </ds:schemaRefs>

</xml_diff>

<commit_message>
docs(system): stage execution engine v3.1 migration
</commit_message>
<xml_diff>
--- a/docs/system/HOW_TO_USE_ROADMAP_WITH_AI.docx
+++ b/docs/system/HOW_TO_USE_ROADMAP_WITH_AI.docx
@@ -81,91 +81,77 @@
         <w:rPr>
           <w:sz w:val="24"/>
         </w:rPr>
-        <w:t>B</w:t>
+        <w:t>Version 1.1.0 - bản Word editable dành cho người học tự đọc, chỉnh sửa và in</w:t>
       </w:r>
       <w:r>
         <w:rPr>
           <w:sz w:val="24"/>
         </w:rPr>
-        <w:t>ả</w:t>
       </w:r>
       <w:r>
         <w:rPr>
           <w:sz w:val="24"/>
         </w:rPr>
-        <w:t>n Word editable - dành cho ngư</w:t>
       </w:r>
       <w:r>
         <w:rPr>
           <w:sz w:val="24"/>
         </w:rPr>
-        <w:t>ờ</w:t>
       </w:r>
       <w:r>
         <w:rPr>
           <w:sz w:val="24"/>
         </w:rPr>
-        <w:t>i h</w:t>
       </w:r>
       <w:r>
         <w:rPr>
           <w:sz w:val="24"/>
         </w:rPr>
-        <w:t>ọ</w:t>
       </w:r>
       <w:r>
         <w:rPr>
           <w:sz w:val="24"/>
         </w:rPr>
-        <w:t>c t</w:t>
       </w:r>
       <w:r>
         <w:rPr>
           <w:sz w:val="24"/>
         </w:rPr>
-        <w:t>ự</w:t>
       </w:r>
       <w:r>
         <w:rPr>
           <w:sz w:val="24"/>
         </w:rPr>
-        <w:t xml:space="preserve"> đ</w:t>
       </w:r>
       <w:r>
         <w:rPr>
           <w:sz w:val="24"/>
         </w:rPr>
-        <w:t>ọ</w:t>
       </w:r>
       <w:r>
         <w:rPr>
           <w:sz w:val="24"/>
         </w:rPr>
-        <w:t>c, ch</w:t>
       </w:r>
       <w:r>
         <w:rPr>
           <w:sz w:val="24"/>
         </w:rPr>
-        <w:t>ỉ</w:t>
       </w:r>
       <w:r>
         <w:rPr>
           <w:sz w:val="24"/>
         </w:rPr>
-        <w:t>nh s</w:t>
       </w:r>
       <w:r>
         <w:rPr>
           <w:sz w:val="24"/>
         </w:rPr>
-        <w:t>ử</w:t>
       </w:r>
       <w:r>
         <w:rPr>
           <w:sz w:val="24"/>
         </w:rPr>
-        <w:t>a và in</w:t>
       </w:r>
     </w:p>
     <w:p/>
@@ -554,7 +540,7 @@
         <w:rPr>
           <w:sz w:val="19"/>
         </w:rPr>
-        <w:t>MASTER_PROMPT_V3.md - 3.0.2</w:t>
+        <w:t>MASTER_PROMPT_V3.md - 3.1.0 (canonical live: docs/system/MASTER_PROMPT_V3.md)</w:t>
       </w:r>
     </w:p>
     <w:p>
@@ -722,56 +708,49 @@
           <w:b/>
           <w:sz w:val="26"/>
         </w:rPr>
-        <w:t xml:space="preserve">BOOT  </w:t>
+        <w:t>BOOT    DAY CONTRACT    FOCUS    END_DAY_READY    END DAY</w:t>
       </w:r>
       <w:r>
         <w:rPr>
           <w:b/>
           <w:sz w:val="26"/>
         </w:rPr>
-        <w:sym w:font="Wingdings" w:char="F0E0"/>
       </w:r>
       <w:r>
         <w:rPr>
           <w:b/>
           <w:sz w:val="26"/>
         </w:rPr>
-        <w:t xml:space="preserve">  T</w:t>
       </w:r>
       <w:r>
         <w:rPr>
           <w:b/>
           <w:sz w:val="26"/>
         </w:rPr>
-        <w:t>Ự</w:t>
       </w:r>
       <w:r>
         <w:rPr>
           <w:b/>
           <w:sz w:val="26"/>
         </w:rPr>
-        <w:t xml:space="preserve"> LÀM  </w:t>
       </w:r>
       <w:r>
         <w:rPr>
           <w:b/>
           <w:sz w:val="26"/>
         </w:rPr>
-        <w:sym w:font="Wingdings" w:char="F0E0"/>
       </w:r>
       <w:r>
         <w:rPr>
           <w:b/>
           <w:sz w:val="26"/>
         </w:rPr>
-        <w:t xml:space="preserve">  SUBMIT TODO  </w:t>
       </w:r>
       <w:r>
         <w:rPr>
           <w:b/>
           <w:sz w:val="26"/>
         </w:rPr>
-        <w:sym w:font="Wingdings" w:char="F0E0"/>
       </w:r>
       <w:bookmarkStart w:id="0" w:name="_GoBack"/>
       <w:bookmarkEnd w:id="0"/>
@@ -780,7 +759,6 @@
           <w:b/>
           <w:sz w:val="26"/>
         </w:rPr>
-        <w:t xml:space="preserve">  END DAY</w:t>
       </w:r>
     </w:p>
     <w:p>
@@ -834,266 +812,236 @@
                 <w:rFonts w:ascii="Consolas" w:hAnsi="Consolas"/>
                 <w:sz w:val="18"/>
               </w:rPr>
-              <w:t>BOOT</w:t>
-            </w:r>
-            <w:r>
+              <w:t>BOOT (hoặc stateful command tự hydrate context)</w:t>
               <w:br/>
-            </w:r>
+              <w:t>↓</w:t>
+              <w:br/>
+              <w:t>STATE SNAPSHOT + GOVERNING SOURCE CHECK</w:t>
+              <w:br/>
+              <w:t>↓</w:t>
+              <w:br/>
+              <w:t>DAY CONTRACT: outcome / artifact / evidence / stop / AI / thời gian</w:t>
+              <w:br/>
+              <w:t>↓</w:t>
+              <w:br/>
+              <w:t>FOCUS: THEORY + TODO + TỰ LÀM CORE</w:t>
+              <w:br/>
+              <w:t>↓</w:t>
+              <w:br/>
+              <w:t>BUILD / TEST / MEASUREMENT / EVIDENCE</w:t>
+              <w:br/>
+              <w:t>↓</w:t>
+              <w:br/>
+              <w:t>SUBMIT TODO + sửa BLOCKER/HIGH</w:t>
+              <w:br/>
+              <w:t>↓</w:t>
+              <w:br/>
+              <w:t>END_DAY_READY khi đạt authoritative stop condition</w:t>
+              <w:br/>
+              <w:t>↓</w:t>
+              <w:br/>
+              <w:t>Learner xác nhận END DAY</w:t>
+              <w:br/>
+              <w:t>↓</w:t>
+              <w:br/>
+              <w:t>Human-Input preflight + Project Chat EXECUTOR DISPATCH nếu cần</w:t>
+              <w:br/>
+              <w:t>↓</w:t>
+              <w:br/>
+              <w:t>Cowork report + Project Chat independent verification</w:t>
+              <w:br/>
+              <w:t>↓</w:t>
+              <w:br/>
+              <w:t>CLOSED / NEXT ACTION / DỪNG</w:t>
+            </w:r>
+            <w:r/>
             <w:r>
               <w:rPr>
                 <w:rFonts w:ascii="Consolas" w:hAnsi="Consolas"/>
                 <w:sz w:val="18"/>
               </w:rPr>
-              <w:t>↓</w:t>
-            </w:r>
-            <w:r>
-              <w:br/>
-            </w:r>
+            </w:r>
+            <w:r/>
             <w:r>
               <w:rPr>
                 <w:rFonts w:ascii="Consolas" w:hAnsi="Consolas"/>
                 <w:sz w:val="18"/>
               </w:rPr>
-              <w:t>STATE SNAPSHOT</w:t>
-            </w:r>
-            <w:r>
-              <w:br/>
-            </w:r>
+            </w:r>
+            <w:r/>
             <w:r>
               <w:rPr>
                 <w:rFonts w:ascii="Consolas" w:hAnsi="Consolas"/>
                 <w:sz w:val="18"/>
               </w:rPr>
-              <w:t>↓</w:t>
-            </w:r>
-            <w:r>
-              <w:br/>
-            </w:r>
+            </w:r>
+            <w:r/>
             <w:r>
               <w:rPr>
                 <w:rFonts w:ascii="Consolas" w:hAnsi="Consolas"/>
                 <w:sz w:val="18"/>
               </w:rPr>
-              <w:t>THEORY PACK + PRE-CHECK</w:t>
-            </w:r>
-            <w:r>
-              <w:br/>
-            </w:r>
+            </w:r>
+            <w:r/>
             <w:r>
               <w:rPr>
                 <w:rFonts w:ascii="Consolas" w:hAnsi="Consolas"/>
                 <w:sz w:val="18"/>
               </w:rPr>
-              <w:t>↓</w:t>
-            </w:r>
-            <w:r>
-              <w:br/>
-            </w:r>
+            </w:r>
+            <w:r/>
             <w:r>
               <w:rPr>
                 <w:rFonts w:ascii="Consolas" w:hAnsi="Consolas"/>
                 <w:sz w:val="18"/>
               </w:rPr>
-              <w:t>TODO / DAY PACK</w:t>
-            </w:r>
-            <w:r>
-              <w:br/>
-            </w:r>
+            </w:r>
+            <w:r/>
             <w:r>
               <w:rPr>
                 <w:rFonts w:ascii="Consolas" w:hAnsi="Consolas"/>
                 <w:sz w:val="18"/>
               </w:rPr>
-              <w:t>↓</w:t>
-            </w:r>
-            <w:r>
-              <w:br/>
-            </w:r>
+            </w:r>
+            <w:r/>
             <w:r>
               <w:rPr>
                 <w:rFonts w:ascii="Consolas" w:hAnsi="Consolas"/>
                 <w:sz w:val="18"/>
               </w:rPr>
-              <w:t>T</w:t>
             </w:r>
             <w:r>
               <w:rPr>
                 <w:rFonts w:ascii="Consolas" w:hAnsi="Consolas"/>
                 <w:sz w:val="18"/>
               </w:rPr>
-              <w:t>Ự</w:t>
             </w:r>
             <w:r>
               <w:rPr>
                 <w:rFonts w:ascii="Consolas" w:hAnsi="Consolas"/>
                 <w:sz w:val="18"/>
               </w:rPr>
-              <w:t xml:space="preserve"> LÀM CORE IMPLEMENTATION</w:t>
-            </w:r>
-            <w:r>
-              <w:br/>
-            </w:r>
+            </w:r>
+            <w:r/>
             <w:r>
               <w:rPr>
                 <w:rFonts w:ascii="Consolas" w:hAnsi="Consolas"/>
                 <w:sz w:val="18"/>
               </w:rPr>
-              <w:t>↓</w:t>
-            </w:r>
-            <w:r>
-              <w:br/>
-            </w:r>
+            </w:r>
+            <w:r/>
             <w:r>
               <w:rPr>
                 <w:rFonts w:ascii="Consolas" w:hAnsi="Consolas"/>
                 <w:sz w:val="18"/>
               </w:rPr>
-              <w:t xml:space="preserve">Bí? </w:t>
             </w:r>
             <w:r>
               <w:rPr>
                 <w:rFonts w:ascii="Consolas" w:hAnsi="Consolas"/>
                 <w:sz w:val="18"/>
               </w:rPr>
-              <w:t xml:space="preserve"> HINT 1 → HINT 2 → HINT 3 → HINT 4</w:t>
-            </w:r>
-            <w:r>
-              <w:br/>
-            </w:r>
+            </w:r>
+            <w:r/>
             <w:r>
               <w:rPr>
                 <w:rFonts w:ascii="Consolas" w:hAnsi="Consolas"/>
                 <w:sz w:val="18"/>
               </w:rPr>
-              <w:t>Bug? DEBUG: &lt;symptom&gt;</w:t>
-            </w:r>
-            <w:r>
-              <w:br/>
-            </w:r>
+            </w:r>
+            <w:r/>
             <w:r>
               <w:rPr>
                 <w:rFonts w:ascii="Consolas" w:hAnsi="Consolas"/>
                 <w:sz w:val="18"/>
               </w:rPr>
-              <w:t>↓</w:t>
-            </w:r>
-            <w:r>
-              <w:br/>
-            </w:r>
+            </w:r>
+            <w:r/>
             <w:r>
               <w:rPr>
                 <w:rFonts w:ascii="Consolas" w:hAnsi="Consolas"/>
                 <w:sz w:val="18"/>
               </w:rPr>
-              <w:t>BUILD / TEST / MEASUREMENT / EVIDENCE</w:t>
-            </w:r>
-            <w:r>
-              <w:br/>
-            </w:r>
+            </w:r>
+            <w:r/>
             <w:r>
               <w:rPr>
                 <w:rFonts w:ascii="Consolas" w:hAnsi="Consolas"/>
                 <w:sz w:val="18"/>
               </w:rPr>
-              <w:t>↓</w:t>
-            </w:r>
-            <w:r>
-              <w:br/>
-            </w:r>
+            </w:r>
+            <w:r/>
             <w:r>
               <w:rPr>
                 <w:rFonts w:ascii="Consolas" w:hAnsi="Consolas"/>
                 <w:sz w:val="18"/>
               </w:rPr>
-              <w:t>SUBMIT TODO</w:t>
-            </w:r>
-            <w:r>
-              <w:br/>
-            </w:r>
+            </w:r>
+            <w:r/>
             <w:r>
               <w:rPr>
                 <w:rFonts w:ascii="Consolas" w:hAnsi="Consolas"/>
                 <w:sz w:val="18"/>
               </w:rPr>
-              <w:t>↓</w:t>
-            </w:r>
-            <w:r>
-              <w:br/>
-            </w:r>
+            </w:r>
+            <w:r/>
             <w:r>
               <w:rPr>
                 <w:rFonts w:ascii="Consolas" w:hAnsi="Consolas"/>
                 <w:sz w:val="18"/>
               </w:rPr>
-              <w:t>S</w:t>
             </w:r>
             <w:r>
               <w:rPr>
                 <w:rFonts w:ascii="Consolas" w:hAnsi="Consolas"/>
                 <w:sz w:val="18"/>
               </w:rPr>
-              <w:t>Ử</w:t>
             </w:r>
             <w:r>
               <w:rPr>
                 <w:rFonts w:ascii="Consolas" w:hAnsi="Consolas"/>
                 <w:sz w:val="18"/>
               </w:rPr>
-              <w:t>A BLOCKER / HIGH</w:t>
-            </w:r>
-            <w:r>
-              <w:br/>
-            </w:r>
+            </w:r>
+            <w:r/>
             <w:r>
               <w:rPr>
                 <w:rFonts w:ascii="Consolas" w:hAnsi="Consolas"/>
                 <w:sz w:val="18"/>
               </w:rPr>
-              <w:t>↓</w:t>
-            </w:r>
-            <w:r>
-              <w:br/>
-            </w:r>
+            </w:r>
+            <w:r/>
             <w:r>
               <w:rPr>
                 <w:rFonts w:ascii="Consolas" w:hAnsi="Consolas"/>
                 <w:sz w:val="18"/>
               </w:rPr>
-              <w:t>END DAY</w:t>
-            </w:r>
-            <w:r>
-              <w:br/>
-            </w:r>
+            </w:r>
+            <w:r/>
             <w:r>
               <w:rPr>
                 <w:rFonts w:ascii="Consolas" w:hAnsi="Consolas"/>
                 <w:sz w:val="18"/>
               </w:rPr>
-              <w:t>↓</w:t>
-            </w:r>
-            <w:r>
-              <w:br/>
-            </w:r>
+            </w:r>
+            <w:r/>
             <w:r>
               <w:rPr>
                 <w:rFonts w:ascii="Consolas" w:hAnsi="Consolas"/>
                 <w:sz w:val="18"/>
               </w:rPr>
-              <w:t>COMMIT / PUSH / NEXT ACTION / D</w:t>
             </w:r>
             <w:r>
               <w:rPr>
                 <w:rFonts w:ascii="Consolas" w:hAnsi="Consolas"/>
                 <w:sz w:val="18"/>
               </w:rPr>
-              <w:t>Ừ</w:t>
             </w:r>
             <w:r>
               <w:rPr>
                 <w:rFonts w:ascii="Consolas" w:hAnsi="Consolas"/>
                 <w:sz w:val="18"/>
               </w:rPr>
-              <w:t>NG</w:t>
             </w:r>
           </w:p>
         </w:tc>
@@ -1135,152 +1083,135 @@
                 <w:b/>
                 <w:color w:val="1C4B5F"/>
               </w:rPr>
-              <w:t>Ba l</w:t>
+              <w:t>Ba mốc quan trọng</w:t>
+              <w:br/>
+              <w:t>BOOT = start/resume mặc định; stateful command khác vẫn phải tự hydrate context.</w:t>
+              <w:br/>
+              <w:t>END_DAY_READY = hệ thống báo đủ điều kiện, chưa đóng ngày.</w:t>
+              <w:br/>
+              <w:t>END DAY = learner xác nhận để bắt đầu closure; HANDOFF chỉ dùng khi đổi context.</w:t>
             </w:r>
             <w:r>
               <w:rPr>
                 <w:b/>
                 <w:color w:val="1C4B5F"/>
               </w:rPr>
-              <w:t>ệ</w:t>
             </w:r>
             <w:r>
               <w:rPr>
                 <w:b/>
                 <w:color w:val="1C4B5F"/>
               </w:rPr>
-              <w:t>nh quan tr</w:t>
             </w:r>
             <w:r>
               <w:rPr>
                 <w:b/>
                 <w:color w:val="1C4B5F"/>
               </w:rPr>
-              <w:t>ọ</w:t>
             </w:r>
             <w:r>
               <w:rPr>
                 <w:b/>
                 <w:color w:val="1C4B5F"/>
               </w:rPr>
-              <w:t>ng nh</w:t>
             </w:r>
             <w:r>
               <w:rPr>
                 <w:b/>
                 <w:color w:val="1C4B5F"/>
               </w:rPr>
-              <w:t>ấ</w:t>
             </w:r>
             <w:r>
               <w:rPr>
                 <w:b/>
                 <w:color w:val="1C4B5F"/>
               </w:rPr>
-              <w:t>t</w:t>
             </w:r>
             <w:r>
               <w:rPr>
                 <w:b/>
                 <w:color w:val="1C4B5F"/>
               </w:rPr>
-              <w:br/>
             </w:r>
             <w:r>
               <w:rPr>
                 <w:sz w:val="20"/>
               </w:rPr>
-              <w:t>BOOT = b</w:t>
             </w:r>
             <w:r>
               <w:rPr>
                 <w:sz w:val="20"/>
               </w:rPr>
-              <w:t>ắ</w:t>
             </w:r>
             <w:r>
               <w:rPr>
                 <w:sz w:val="20"/>
               </w:rPr>
-              <w:t>t đ</w:t>
             </w:r>
             <w:r>
               <w:rPr>
                 <w:sz w:val="20"/>
               </w:rPr>
-              <w:t>ầ</w:t>
             </w:r>
             <w:r>
               <w:rPr>
                 <w:sz w:val="20"/>
               </w:rPr>
-              <w:t>u/resume đúng ch</w:t>
             </w:r>
             <w:r>
               <w:rPr>
                 <w:sz w:val="20"/>
               </w:rPr>
-              <w:t>ỗ</w:t>
             </w:r>
             <w:r>
               <w:rPr>
                 <w:sz w:val="20"/>
               </w:rPr>
-              <w:t xml:space="preserve">. SUBMIT TODO = </w:t>
             </w:r>
             <w:r>
               <w:rPr>
                 <w:sz w:val="20"/>
               </w:rPr>
-              <w:t>review công vi</w:t>
             </w:r>
             <w:r>
               <w:rPr>
                 <w:sz w:val="20"/>
               </w:rPr>
-              <w:t>ệ</w:t>
             </w:r>
             <w:r>
               <w:rPr>
                 <w:sz w:val="20"/>
               </w:rPr>
-              <w:t>c th</w:t>
             </w:r>
             <w:r>
               <w:rPr>
                 <w:sz w:val="20"/>
               </w:rPr>
-              <w:t>ậ</w:t>
             </w:r>
             <w:r>
               <w:rPr>
                 <w:sz w:val="20"/>
               </w:rPr>
-              <w:t>t. END DAY = đóng ngày đ</w:t>
             </w:r>
             <w:r>
               <w:rPr>
                 <w:sz w:val="20"/>
               </w:rPr>
-              <w:t>ể</w:t>
             </w:r>
             <w:r>
               <w:rPr>
                 <w:sz w:val="20"/>
               </w:rPr>
-              <w:t xml:space="preserve"> ngày mai resume đư</w:t>
             </w:r>
             <w:r>
               <w:rPr>
                 <w:sz w:val="20"/>
               </w:rPr>
-              <w:t>ợ</w:t>
             </w:r>
             <w:r>
               <w:rPr>
                 <w:sz w:val="20"/>
               </w:rPr>
-              <w:t>c.</w:t>
             </w:r>
           </w:p>
         </w:tc>
@@ -1310,103 +1241,61 @@
         <w:ind w:left="142" w:hanging="142"/>
       </w:pPr>
       <w:r>
-        <w:t>1. M</w:t>
-      </w:r>
-      <w:r>
-        <w:t>ở</w:t>
-      </w:r>
-      <w:r>
-        <w:t xml:space="preserve"> chat chính và gõ BOOT.</w:t>
-      </w:r>
+        <w:t>1. Mở chat chính và gõ BOOT; nếu gọi thẳng stateful command, hệ thống vẫn phải tự hydrate context.</w:t>
+      </w:r>
+      <w:r/>
+      <w:r/>
     </w:p>
     <w:p>
       <w:pPr>
         <w:ind w:left="142" w:hanging="142"/>
       </w:pPr>
       <w:r>
-        <w:t>2. Đ</w:t>
-      </w:r>
-      <w:r>
-        <w:t>ọ</w:t>
-      </w:r>
-      <w:r>
-        <w:t>c State Snapshot.</w:t>
-      </w:r>
+        <w:t>2. Đọc State Snapshot và xác nhận governing Master Prompt là bản canonical live 3.1+.</w:t>
+      </w:r>
+      <w:r/>
+      <w:r/>
     </w:p>
     <w:p>
       <w:pPr>
         <w:ind w:left="142" w:hanging="142"/>
       </w:pPr>
       <w:r>
-        <w:t>3. Xác nh</w:t>
-      </w:r>
-      <w:r>
-        <w:t>ậ</w:t>
-      </w:r>
-      <w:r>
-        <w:t>n m</w:t>
-      </w:r>
-      <w:r>
-        <w:t>ộ</w:t>
-      </w:r>
-      <w:r>
-        <w:t>t outcome duy nh</w:t>
-      </w:r>
-      <w:r>
-        <w:t>ấ</w:t>
-      </w:r>
-      <w:r>
-        <w:t>t c</w:t>
-      </w:r>
-      <w:r>
-        <w:t>ủ</w:t>
-      </w:r>
-      <w:r>
-        <w:t>a ngày.</w:t>
-      </w:r>
+        <w:t>3. Chốt Day Contract: outcome, artifact, evidence, stop condition và AI mode.</w:t>
+      </w:r>
+      <w:r/>
+      <w:r/>
+      <w:r/>
+      <w:r/>
+      <w:r/>
+      <w:r/>
+      <w:r/>
+      <w:r/>
     </w:p>
     <w:p>
       <w:pPr>
         <w:ind w:left="142" w:hanging="142"/>
       </w:pPr>
       <w:r>
-        <w:t>4. Xác nh</w:t>
-      </w:r>
-      <w:r>
-        <w:t>ậ</w:t>
-      </w:r>
-      <w:r>
-        <w:t>n AI mode đư</w:t>
-      </w:r>
-      <w:r>
-        <w:t>ợ</w:t>
-      </w:r>
-      <w:r>
-        <w:t>c phép.</w:t>
-      </w:r>
+        <w:t>4. Tách Roadmap Standard Load, Available Focused Time và Planned Focused Time.</w:t>
+      </w:r>
+      <w:r/>
+      <w:r/>
+      <w:r/>
+      <w:r/>
     </w:p>
     <w:p>
       <w:pPr>
         <w:ind w:left="142" w:hanging="142"/>
       </w:pPr>
       <w:r>
-        <w:t>5. Đ</w:t>
-      </w:r>
-      <w:r>
-        <w:t>ọ</w:t>
-      </w:r>
-      <w:r>
-        <w:t>c đúng day card/TODO, không đ</w:t>
-      </w:r>
-      <w:r>
-        <w:t>ọ</w:t>
-      </w:r>
-      <w:r>
-        <w:t xml:space="preserve">c lan sang ngày </w:t>
-      </w:r>
-      <w:r>
-        <w:t>mai.</w:t>
-      </w:r>
+        <w:t>5. Chỉ vào Focus khi Day Contract đủ; mở đúng day card/TODO, không đọc lan sang ngày mai.</w:t>
+      </w:r>
+      <w:r/>
+      <w:r/>
+      <w:r/>
+      <w:r/>
+      <w:r/>
     </w:p>
     <w:p>
       <w:pPr>
@@ -1427,106 +1316,62 @@
         <w:ind w:left="142" w:hanging="142"/>
       </w:pPr>
       <w:r>
-        <w:t>1. Build/test l</w:t>
-      </w:r>
-      <w:r>
-        <w:t>ạ</w:t>
-      </w:r>
-      <w:r>
-        <w:t>i.</w:t>
-      </w:r>
+        <w:t>1. Build/test lại và giữ raw evidence/failure evidence.</w:t>
+      </w:r>
+      <w:r/>
+      <w:r/>
     </w:p>
     <w:p>
       <w:pPr>
         <w:ind w:left="142" w:hanging="142"/>
       </w:pPr>
       <w:r>
-        <w:t>2. Lưu log/capture/failure evidence trư</w:t>
-      </w:r>
-      <w:r>
-        <w:t>ớ</w:t>
-      </w:r>
-      <w:r>
-        <w:t>c khi d</w:t>
-      </w:r>
-      <w:r>
-        <w:t>ọ</w:t>
-      </w:r>
-      <w:r>
-        <w:t>n đ</w:t>
-      </w:r>
-      <w:r>
-        <w:t>ẹ</w:t>
-      </w:r>
-      <w:r>
-        <w:t>p.</w:t>
-      </w:r>
+        <w:t>2. SUBMIT TODO/review; sửa BLOCKER/HIGH cần thiết.</w:t>
+      </w:r>
+      <w:r/>
+      <w:r/>
+      <w:r/>
+      <w:r/>
+      <w:r/>
+      <w:r/>
     </w:p>
     <w:p>
       <w:pPr>
         <w:ind w:left="142" w:hanging="142"/>
       </w:pPr>
       <w:r>
-        <w:t>3. Commit m</w:t>
-      </w:r>
-      <w:r>
-        <w:t>ộ</w:t>
-      </w:r>
-      <w:r>
-        <w:t>t thay đ</w:t>
-      </w:r>
-      <w:r>
-        <w:t>ổ</w:t>
-      </w:r>
-      <w:r>
-        <w:t>i logic có nghĩa.</w:t>
-      </w:r>
+        <w:t>3. Khi đủ authoritative criteria, hệ thống báo END_DAY_READY; learner xác nhận END DAY.</w:t>
+      </w:r>
+      <w:r/>
+      <w:r/>
+      <w:r/>
+      <w:r/>
     </w:p>
     <w:p>
       <w:pPr>
         <w:ind w:left="142" w:hanging="142"/>
       </w:pPr>
       <w:r>
-        <w:t>4. SUBMIT TODO n</w:t>
-      </w:r>
-      <w:r>
-        <w:t>ế</w:t>
-      </w:r>
-      <w:r>
-        <w:t>u c</w:t>
-      </w:r>
-      <w:r>
-        <w:t>ầ</w:t>
-      </w:r>
-      <w:r>
-        <w:t>n review.</w:t>
-      </w:r>
+        <w:t>4. Settle AI provenance và trả lời đúng các human-only fields còn thiếu.</w:t>
+      </w:r>
+      <w:r/>
+      <w:r/>
+      <w:r/>
+      <w:r/>
     </w:p>
     <w:p>
       <w:pPr>
         <w:ind w:left="142" w:hanging="142"/>
       </w:pPr>
       <w:r>
-        <w:t>5. END DAY đ</w:t>
-      </w:r>
-      <w:r>
-        <w:t>ể</w:t>
-      </w:r>
-      <w:r>
-        <w:t xml:space="preserve"> ch</w:t>
-      </w:r>
-      <w:r>
-        <w:t>ấ</w:t>
-      </w:r>
-      <w:r>
-        <w:t>m GREEN/YELLOW/RED và ghi m</w:t>
-      </w:r>
-      <w:r>
-        <w:t>ộ</w:t>
-      </w:r>
-      <w:r>
-        <w:t>t Next Action 5-15 phút.</w:t>
-      </w:r>
+        <w:t>5. Project Chat dispatch Cowork nếu cần; chỉ CLOSED sau evidence/log/state/linter/commit/push được independent verify.</w:t>
+      </w:r>
+      <w:r/>
+      <w:r/>
+      <w:r/>
+      <w:r/>
+      <w:r/>
+      <w:r/>
     </w:p>
     <w:p>
       <w:r>
@@ -1971,35 +1816,17 @@
           </w:tcPr>
           <w:p>
             <w:r>
-              <w:t>Quy đ</w:t>
-            </w:r>
-            <w:r>
-              <w:t>ị</w:t>
-            </w:r>
-            <w:r>
-              <w:t>nh</w:t>
-            </w:r>
-            <w:r>
-              <w:t xml:space="preserve"> AI ph</w:t>
-            </w:r>
-            <w:r>
-              <w:t>ả</w:t>
-            </w:r>
-            <w:r>
-              <w:t>i BOOT, d</w:t>
-            </w:r>
-            <w:r>
-              <w:t>ạ</w:t>
-            </w:r>
-            <w:r>
-              <w:t>y, review, gate, recovery và discover live repo th</w:t>
-            </w:r>
-            <w:r>
-              <w:t>ế</w:t>
-            </w:r>
-            <w:r>
-              <w:t xml:space="preserve"> nào.</w:t>
-            </w:r>
+              <w:t>Canonical execution engine 3.1: hydrate state, Day Contract, lifecycle, assessment firewall, audit/review/correction và executor routing.</w:t>
+            </w:r>
+            <w:r/>
+            <w:r/>
+            <w:r/>
+            <w:r/>
+            <w:r/>
+            <w:r/>
+            <w:r/>
+            <w:r/>
+            <w:r/>
           </w:p>
         </w:tc>
         <w:tc>
@@ -2018,43 +1845,37 @@
               <w:rPr>
                 <w:sz w:val="17"/>
               </w:rPr>
-              <w:t>Không c</w:t>
+              <w:t>Future session phải verify bản canonical live; không vận hành từ static copy stale.</w:t>
             </w:r>
             <w:r>
               <w:rPr>
                 <w:sz w:val="17"/>
               </w:rPr>
-              <w:t>ầ</w:t>
             </w:r>
             <w:r>
               <w:rPr>
                 <w:sz w:val="17"/>
               </w:rPr>
-              <w:t>n đ</w:t>
             </w:r>
             <w:r>
               <w:rPr>
                 <w:sz w:val="17"/>
               </w:rPr>
-              <w:t>ọ</w:t>
             </w:r>
             <w:r>
               <w:rPr>
                 <w:sz w:val="17"/>
               </w:rPr>
-              <w:t>c thư</w:t>
             </w:r>
             <w:r>
               <w:rPr>
                 <w:sz w:val="17"/>
               </w:rPr>
-              <w:t>ờ</w:t>
             </w:r>
             <w:r>
               <w:rPr>
                 <w:sz w:val="17"/>
               </w:rPr>
-              <w:t>ng xuyên.</w:t>
             </w:r>
           </w:p>
         </w:tc>
@@ -2443,81 +2264,56 @@
           </w:tcPr>
           <w:p>
             <w:r>
-              <w:t>ChatGPT Project - gi</w:t>
-            </w:r>
-            <w:r>
-              <w:t>ữ</w:t>
-            </w:r>
-            <w:r>
-              <w:t xml:space="preserve"> 3 source frozen:</w:t>
-            </w:r>
-            <w:r>
+              <w:t>ChatGPT Project / attachment có thể giữ source tham chiếu, nhưng future session phải verify canonical live Master Prompt 3.1+ tại GitHub.</w:t>
               <w:br/>
-              <w:t>SYSTEM_SPEC_V3.md</w:t>
-            </w:r>
-            <w:r>
               <w:br/>
-            </w:r>
-            <w:r>
-              <w:t>EMBEDDED_ROADMAP_V3.1.docx</w:t>
-            </w:r>
-            <w:r>
-              <w:br/>
-              <w:t>MASTER_PROMPT_V3.md</w:t>
-            </w:r>
-            <w:r>
-              <w:br/>
-            </w:r>
-            <w:r>
-              <w:br/>
-              <w:t>GitHub canonical:</w:t>
-            </w:r>
-            <w:r>
+              <w:t>Canonical live repo:</w:t>
               <w:br/>
               <w:t>https://github.com/MinhSit/embedded-firmware-journey-v3</w:t>
-            </w:r>
-            <w:r>
               <w:br/>
-            </w:r>
-            <w:r>
               <w:br/>
-              <w:t>GitHub - live state:</w:t>
-            </w:r>
-            <w:r>
+              <w:t>Live engine/runbook/state:</w:t>
+              <w:br/>
+              <w:t>docs/system/MASTER_PROMPT_V3.md</w:t>
+              <w:br/>
+              <w:t>roadmap-control/execution-runbook.md (NON-AUTHORITATIVE HOW)</w:t>
               <w:br/>
               <w:t>roadmap-control/current-state.md</w:t>
-            </w:r>
-            <w:r>
+              <w:br/>
+              <w:t>docs/system/ROADMAP_REVIEW_LOG.md</w:t>
               <w:br/>
               <w:t>roadmap-control/daily-log.md</w:t>
-            </w:r>
-            <w:r>
               <w:br/>
               <w:t>roadmap-control/competency-ledger.md</w:t>
-            </w:r>
-            <w:r>
               <w:br/>
-              <w:t>roadmap-contr</w:t>
-            </w:r>
-            <w:r>
-              <w:t>ol/ai-usage-log.md</w:t>
-            </w:r>
-            <w:r>
-              <w:br/>
-              <w:t>docs/system/ROADMAP_REVIEW_LOG.md</w:t>
-            </w:r>
-            <w:r>
+              <w:t>roadmap-control/ai-usage-log.md</w:t>
               <w:br/>
               <w:t>roadmap-control/weekly-scorecards/</w:t>
-            </w:r>
-            <w:r>
               <w:br/>
               <w:t>roadmap-control/recovery/</w:t>
-            </w:r>
-            <w:r>
               <w:br/>
               <w:t>code / tests / evidence / captures</w:t>
             </w:r>
+            <w:r/>
+            <w:r/>
+            <w:r/>
+            <w:r/>
+            <w:r/>
+            <w:r/>
+            <w:r/>
+            <w:r/>
+            <w:r/>
+            <w:r/>
+            <w:r/>
+            <w:r/>
+            <w:r/>
+            <w:r/>
+            <w:r/>
+            <w:r/>
+            <w:r/>
+            <w:r/>
+            <w:r/>
+            <w:r/>
           </w:p>
         </w:tc>
       </w:tr>
@@ -3032,109 +2828,57 @@
           </w:tcPr>
           <w:p>
             <w:r>
-              <w:t>STATE SNAPSHOT</w:t>
-            </w:r>
-            <w:r>
+              <w:t>STATE SNAPSHOT + SOURCE CHECK</w:t>
               <w:br/>
-              <w:t>- Calendar</w:t>
-            </w:r>
-            <w:r>
+              <w:t>- governing source/version</w:t>
               <w:br/>
-              <w:t>- Execution</w:t>
-            </w:r>
-            <w:r>
+              <w:t>- Calendar / Execution / Artifact / Competency</w:t>
               <w:br/>
-              <w:t>- Artifact</w:t>
-            </w:r>
-            <w:r>
+              <w:t>- gate / AI contamination / schedule / review</w:t>
               <w:br/>
-              <w:t>- Competency</w:t>
-            </w:r>
-            <w:r>
               <w:br/>
-              <w:t>- Current Gate</w:t>
-            </w:r>
-            <w:r>
+              <w:t>DAY CONTRACT</w:t>
               <w:br/>
-              <w:t>- AI contamination / retest</w:t>
-            </w:r>
-            <w:r>
+              <w:t>- outcome / artifact / evidence / stop</w:t>
               <w:br/>
-              <w:t>- Schedule variance / Recovery</w:t>
-            </w:r>
-            <w:r>
+              <w:t>- AI/assessment</w:t>
               <w:br/>
-              <w:t>- Deadline risk</w:t>
-            </w:r>
-            <w:r>
+              <w:t>- Standard Load / Available / Planned</w:t>
               <w:br/>
-              <w:t>- Roadmap Review status / checkpoint</w:t>
-            </w:r>
-            <w:r>
               <w:br/>
-              <w:t>- Exact Next Action</w:t>
-            </w:r>
-            <w:r>
+              <w:t>FOCUS PACK</w:t>
               <w:br/>
-            </w:r>
-            <w:r>
+              <w:t>- theory / TODO / starter/test khi cần</w:t>
               <w:br/>
-              <w:t>THEORY PACK</w:t>
-            </w:r>
-            <w:r>
-              <w:br/>
-              <w:t>- w</w:t>
-            </w:r>
-            <w:r>
-              <w:t>hy / mental model / core concepts</w:t>
-            </w:r>
-            <w:r>
-              <w:br/>
-              <w:t>- mini example / failure modes</w:t>
-            </w:r>
-            <w:r>
-              <w:br/>
-              <w:t>- measurement / official reading</w:t>
-            </w:r>
-            <w:r>
-              <w:br/>
-              <w:t>- pre-check 3-7 câu</w:t>
-            </w:r>
-            <w:r>
-              <w:br/>
-            </w:r>
-            <w:r>
-              <w:br/>
-              <w:t>FULL DAY PACK</w:t>
-            </w:r>
-            <w:r>
-              <w:br/>
-              <w:t>- THEORY...</w:t>
-            </w:r>
-            <w:r>
-              <w:br/>
-              <w:t>- TODO...</w:t>
-            </w:r>
-            <w:r>
-              <w:br/>
-              <w:t>- SUBMIT...</w:t>
-            </w:r>
-            <w:r>
-              <w:br/>
-              <w:t>- starter code/test n</w:t>
-            </w:r>
-            <w:r>
-              <w:t>ế</w:t>
-            </w:r>
-            <w:r>
-              <w:t>u c</w:t>
-            </w:r>
-            <w:r>
-              <w:t>ầ</w:t>
-            </w:r>
-            <w:r>
-              <w:t>n</w:t>
-            </w:r>
+              <w:t>- generated MUST phải có authority trace</w:t>
+            </w:r>
+            <w:r/>
+            <w:r/>
+            <w:r/>
+            <w:r/>
+            <w:r/>
+            <w:r/>
+            <w:r/>
+            <w:r/>
+            <w:r/>
+            <w:r/>
+            <w:r/>
+            <w:r/>
+            <w:r/>
+            <w:r/>
+            <w:r/>
+            <w:r/>
+            <w:r/>
+            <w:r/>
+            <w:r/>
+            <w:r/>
+            <w:r/>
+            <w:r/>
+            <w:r/>
+            <w:r/>
+            <w:r/>
+            <w:r/>
+            <w:r/>
           </w:p>
         </w:tc>
       </w:tr>
@@ -3544,7 +3288,7 @@
               <w:rPr>
                 <w:sz w:val="18"/>
               </w:rPr>
-              <w:t>Context đã rõ.</w:t>
+              <w:t>Có thể gọi trực tiếp; context chưa đủ sẽ được hydrate tự động.</w:t>
             </w:r>
           </w:p>
         </w:tc>
@@ -3564,7 +3308,7 @@
               <w:rPr>
                 <w:sz w:val="18"/>
               </w:rPr>
-              <w:t>Theory Pack + Full Day Pack.</w:t>
+              <w:t>Source check + Day Contract, rồi mới Theory Pack + Full Day Pack.</w:t>
             </w:r>
           </w:p>
         </w:tc>
@@ -3592,113 +3336,43 @@
     </w:p>
     <w:p>
       <w:r>
-        <w:t>Roadmap m</w:t>
-      </w:r>
-      <w:r>
-        <w:t>ỗ</w:t>
-      </w:r>
-      <w:r>
-        <w:t>i ngày đã đ</w:t>
-      </w:r>
-      <w:r>
-        <w:t>ị</w:t>
-      </w:r>
-      <w:r>
-        <w:t xml:space="preserve">nh nghĩa </w:t>
-      </w:r>
-      <w:r>
-        <w:t>Vi</w:t>
-      </w:r>
-      <w:r>
-        <w:t>ệ</w:t>
-      </w:r>
-      <w:r>
-        <w:t>c chính, Ki</w:t>
-      </w:r>
-      <w:r>
-        <w:t>ể</w:t>
-      </w:r>
-      <w:r>
-        <w:t>m tra b</w:t>
-      </w:r>
-      <w:r>
-        <w:t>ắ</w:t>
-      </w:r>
-      <w:r>
-        <w:t>t bu</w:t>
-      </w:r>
-      <w:r>
-        <w:t>ộ</w:t>
-      </w:r>
-      <w:r>
-        <w:t>c, B</w:t>
-      </w:r>
-      <w:r>
-        <w:t>ằ</w:t>
-      </w:r>
-      <w:r>
-        <w:t>ng ch</w:t>
-      </w:r>
-      <w:r>
-        <w:t>ứ</w:t>
-      </w:r>
-      <w:r>
-        <w:t>ng cu</w:t>
-      </w:r>
-      <w:r>
-        <w:t>ố</w:t>
-      </w:r>
-      <w:r>
-        <w:t>i ngày, AI đư</w:t>
-      </w:r>
-      <w:r>
-        <w:t>ợ</w:t>
-      </w:r>
-      <w:r>
-        <w:t>c phép và Đi</w:t>
-      </w:r>
-      <w:r>
-        <w:t>ể</w:t>
-      </w:r>
-      <w:r>
-        <w:t>m d</w:t>
-      </w:r>
-      <w:r>
-        <w:t>ừ</w:t>
-      </w:r>
-      <w:r>
-        <w:t>ng. AI ch</w:t>
-      </w:r>
-      <w:r>
-        <w:t>ỉ</w:t>
-      </w:r>
-      <w:r>
-        <w:t xml:space="preserve"> đóng gói l</w:t>
-      </w:r>
-      <w:r>
-        <w:t>ạ</w:t>
-      </w:r>
-      <w:r>
-        <w:t>i đ</w:t>
-      </w:r>
-      <w:r>
-        <w:t>ể</w:t>
-      </w:r>
-      <w:r>
-        <w:t xml:space="preserve"> b</w:t>
-      </w:r>
-      <w:r>
-        <w:t>ạ</w:t>
-      </w:r>
-      <w:r>
-        <w:t>n b</w:t>
-      </w:r>
-      <w:r>
-        <w:t>ắ</w:t>
-      </w:r>
-      <w:r>
-        <w:t>t tay làm.</w:t>
-      </w:r>
+        <w:t>Roadmap mỗi ngày đã định nghĩa Việc chính, Kiểm tra bắt buộc, Bằng chứng cuối ngày, AI được phép và Điểm dừng. AI chỉ đóng gói để bạn bắt tay làm. Generated MUST không có trace tới System Spec, day card, valid gate contract hoặc necessary invariant là NON-SCORING.</w:t>
+      </w:r>
+      <w:r/>
+      <w:r/>
+      <w:r/>
+      <w:r/>
+      <w:r/>
+      <w:r/>
+      <w:r/>
+      <w:r/>
+      <w:r/>
+      <w:r/>
+      <w:r/>
+      <w:r/>
+      <w:r/>
+      <w:r/>
+      <w:r/>
+      <w:r/>
+      <w:r/>
+      <w:r/>
+      <w:r/>
+      <w:r/>
+      <w:r/>
+      <w:r/>
+      <w:r/>
+      <w:r/>
+      <w:r/>
+      <w:r/>
+      <w:r/>
+      <w:r/>
+      <w:r/>
+      <w:r/>
+      <w:r/>
+      <w:r/>
+      <w:r/>
+      <w:r/>
+      <w:r/>
     </w:p>
     <w:p>
       <w:pPr>
@@ -5188,61 +4862,59 @@
                 <w:color w:val="1C4B5F"/>
               </w:rPr>
               <w:t>Meaningful attempt</w:t>
+              <w:br/>
+              <w:t>Có thể là code đã viết, hypothesis, failed test, log, debugger observation, capture, diagram hoặc explanation attempt.</w:t>
+              <w:br/>
+              <w:br/>
+              <w:t>AI-0 firewall</w:t>
+              <w:br/>
+              <w:t>Chỉ hỏi HINT/DEBUG mà AI chưa tiết lộ trợ giúp cấm thì attempt chưa tự động contaminate. Nếu AI thực sự tiết lộ nội dung cấm: INVALID / RETEST REQUIRED; không PASS và không tự động FAIL.</w:t>
             </w:r>
             <w:r>
               <w:rPr>
                 <w:b/>
                 <w:color w:val="1C4B5F"/>
               </w:rPr>
-              <w:br/>
             </w:r>
             <w:r>
               <w:rPr>
                 <w:sz w:val="20"/>
               </w:rPr>
-              <w:t>Có th</w:t>
             </w:r>
             <w:r>
               <w:rPr>
                 <w:sz w:val="20"/>
               </w:rPr>
-              <w:t>ể</w:t>
             </w:r>
             <w:r>
               <w:rPr>
                 <w:sz w:val="20"/>
               </w:rPr>
-              <w:t xml:space="preserve"> là code đã vi</w:t>
             </w:r>
             <w:r>
               <w:rPr>
                 <w:sz w:val="20"/>
               </w:rPr>
-              <w:t>ế</w:t>
             </w:r>
             <w:r>
               <w:rPr>
                 <w:sz w:val="20"/>
               </w:rPr>
-              <w:t xml:space="preserve">t, hypothesis, failed </w:t>
             </w:r>
             <w:r>
               <w:rPr>
                 <w:sz w:val="20"/>
               </w:rPr>
-              <w:t>test, log, debugger observation, capture, diagram ho</w:t>
             </w:r>
             <w:r>
               <w:rPr>
                 <w:sz w:val="20"/>
               </w:rPr>
-              <w:t>ặ</w:t>
             </w:r>
             <w:r>
               <w:rPr>
                 <w:sz w:val="20"/>
               </w:rPr>
-              <w:t>c explanation attempt.</w:t>
             </w:r>
           </w:p>
         </w:tc>
@@ -7941,21 +7613,17 @@
         <w:ind w:left="142" w:hanging="142"/>
       </w:pPr>
       <w:r>
-        <w:t>1. Build/test l</w:t>
-      </w:r>
-      <w:r>
-        <w:t>ạ</w:t>
-      </w:r>
-      <w:r>
-        <w:t>i.</w:t>
-      </w:r>
+        <w:t>1. Đối chiếu Day Contract; build/test và giữ evidence thực tế.</w:t>
+      </w:r>
+      <w:r/>
+      <w:r/>
     </w:p>
     <w:p>
       <w:pPr>
         <w:ind w:left="142" w:hanging="142"/>
       </w:pPr>
       <w:r>
-        <w:t>2. Lưu log/capture/failure evidence.</w:t>
+        <w:t>2. Xác định artifact result và settle AI provenance trước mọi closure commit.</w:t>
       </w:r>
     </w:p>
     <w:p>
@@ -7963,7 +7631,7 @@
         <w:ind w:left="142" w:hanging="142"/>
       </w:pPr>
       <w:r>
-        <w:t>3. Ghi Expected vs Actual.</w:t>
+        <w:t>3. Learner xác nhận END DAY; chạy Human-Input preflight, không suy focused time từ timestamp.</w:t>
       </w:r>
     </w:p>
     <w:p>
@@ -7971,7 +7639,7 @@
         <w:ind w:left="142" w:hanging="142"/>
       </w:pPr>
       <w:r>
-        <w:t>4. Commit logical change.</w:t>
+        <w:t>4. Project Chat tạo EXECUTOR DISPATCH/Cowork prompt nếu repo mutation cần thiết.</w:t>
       </w:r>
     </w:p>
     <w:p>
@@ -7979,7 +7647,7 @@
         <w:ind w:left="142" w:hanging="142"/>
       </w:pPr>
       <w:r>
-        <w:t>5. Log material AI usage.</w:t>
+        <w:t>5. Cowork update evidence → daily log → AI log → Current State → ledger khi applicable.</w:t>
       </w:r>
     </w:p>
     <w:p>
@@ -7987,48 +7655,38 @@
         <w:ind w:left="142" w:hanging="142"/>
       </w:pPr>
       <w:r>
-        <w:t>6. Ch</w:t>
-      </w:r>
-      <w:r>
-        <w:t>ấ</w:t>
-      </w:r>
-      <w:r>
-        <w:t xml:space="preserve">m GREEN/YELLOW/RED </w:t>
-      </w:r>
-      <w:r>
-        <w:t>đúng th</w:t>
-      </w:r>
-      <w:r>
-        <w:t>ự</w:t>
-      </w:r>
-      <w:r>
-        <w:t>c t</w:t>
-      </w:r>
-      <w:r>
-        <w:t>ế</w:t>
-      </w:r>
-      <w:r>
-        <w:t>.</w:t>
-      </w:r>
+        <w:t>6. Chạy closure linter + human semantic audit; linter PASS không phải Competency PASS.</w:t>
+      </w:r>
+      <w:r/>
+      <w:r/>
+      <w:r/>
+      <w:r/>
+      <w:r/>
+      <w:r/>
+      <w:r/>
     </w:p>
     <w:p>
       <w:pPr>
         <w:ind w:left="142" w:hanging="142"/>
       </w:pPr>
       <w:r>
-        <w:t>7. Vi</w:t>
-      </w:r>
-      <w:r>
-        <w:t>ế</w:t>
-      </w:r>
-      <w:r>
-        <w:t>t đúng m</w:t>
-      </w:r>
-      <w:r>
-        <w:t>ộ</w:t>
-      </w:r>
-      <w:r>
-        <w:t>t Next Action 5-15 phút.</w:t>
+        <w:t>7. Commit, authorized push/sync và Project Chat independent verification.</w:t>
+      </w:r>
+      <w:r/>
+      <w:r/>
+      <w:r/>
+      <w:r/>
+    </w:p>
+    <w:p>
+      <w:pPr/>
+      <w:r>
+        <w:t>8. Chỉ sau đó mới CLOSED; ghi GREEN/YELLOW/RED và một Next Action 5-15 phút.</w:t>
+      </w:r>
+    </w:p>
+    <w:p>
+      <w:pPr/>
+      <w:r>
+        <w:t>Commit nằm trong chính record chưa biết SHA dùng: SELF — containing commit; không tạo repair commit chỉ để backfill SHA.</w:t>
       </w:r>
     </w:p>
     <w:tbl>
@@ -8352,97 +8010,82 @@
         <w:rPr>
           <w:b/>
         </w:rPr>
-        <w:t>B</w:t>
+        <w:t>Bạn không cần học thuộc CP-00/CP-01/... . BOOT/WEEKLY REVIEW đọc live sources. Ở week close, required AI-0 gate/retest phải được xử lý trước MASTER CHECK để audit không làm lộ lời giải.</w:t>
       </w:r>
       <w:r>
         <w:rPr>
           <w:b/>
         </w:rPr>
-        <w:t>ạ</w:t>
       </w:r>
       <w:r>
         <w:rPr>
           <w:b/>
         </w:rPr>
-        <w:t>n không c</w:t>
       </w:r>
       <w:r>
         <w:rPr>
           <w:b/>
         </w:rPr>
-        <w:t>ầ</w:t>
       </w:r>
       <w:r>
         <w:rPr>
           <w:b/>
         </w:rPr>
-        <w:t>n h</w:t>
       </w:r>
       <w:r>
         <w:rPr>
           <w:b/>
         </w:rPr>
-        <w:t>ọ</w:t>
       </w:r>
       <w:r>
         <w:rPr>
           <w:b/>
         </w:rPr>
-        <w:t>c thu</w:t>
       </w:r>
       <w:r>
         <w:rPr>
           <w:b/>
         </w:rPr>
-        <w:t>ộ</w:t>
       </w:r>
       <w:r>
         <w:rPr>
           <w:b/>
         </w:rPr>
-        <w:t>c CP-00/CP-01/... . BOOT và WEEKLY REVIEW ph</w:t>
       </w:r>
       <w:r>
         <w:rPr>
           <w:b/>
         </w:rPr>
-        <w:t>ả</w:t>
       </w:r>
       <w:r>
         <w:rPr>
           <w:b/>
         </w:rPr>
-        <w:t>i đ</w:t>
       </w:r>
       <w:r>
         <w:rPr>
           <w:b/>
         </w:rPr>
-        <w:t>ọ</w:t>
       </w:r>
       <w:r>
         <w:rPr>
           <w:b/>
         </w:rPr>
-        <w:t>c live ROADMAP_REVIEW_LOG.md và t</w:t>
       </w:r>
       <w:r>
         <w:rPr>
           <w:b/>
         </w:rPr>
-        <w:t>ự</w:t>
       </w:r>
       <w:r>
         <w:rPr>
           <w:b/>
         </w:rPr>
-        <w:t xml:space="preserve"> b</w:t>
       </w:r>
       <w:r>
         <w:rPr>
           <w:b/>
         </w:rPr>
-        <w:t>áo khi review NOT_DUE / DUE / URGENT.</w:t>
       </w:r>
     </w:p>
     <w:tbl>
@@ -8547,14 +8190,10 @@
     </w:p>
     <w:p>
       <w:r>
-        <w:t>AI ch</w:t>
-      </w:r>
-      <w:r>
-        <w:t>ấ</w:t>
-      </w:r>
-      <w:r>
-        <w:t>m Output, Understanding, Testing, Documentation, Health và Career; sau đó ra PASS / CONDITIONAL PASS / FAIL.</w:t>
-      </w:r>
+        <w:t>Week close: scheduled work → required AI-0 PASS → MASTER CHECK read-only → disposition findings → WEEKLY REVIEW/CP → Week decision. MASTER CHECK không sửa repo, commit/push hoặc tự cấp Competency PASS.</w:t>
+      </w:r>
+      <w:r/>
+      <w:r/>
     </w:p>
     <w:tbl>
       <w:tblPr>
@@ -9610,88 +9249,77 @@
                 <w:b/>
                 <w:color w:val="1C4B5F"/>
               </w:rPr>
-              <w:t>Lu</w:t>
+              <w:t>Luật</w:t>
+              <w:br/>
+              <w:t>Gate FAIL → targeted Recovery ngay → fresh AI-0 Retest → MASTER CHECK khi assessment integrity đã resolve → WEEKLY REVIEW/CP. Không reset roadmap và không tạo deadlock bắt review trước Recovery.</w:t>
             </w:r>
             <w:r>
               <w:rPr>
                 <w:b/>
                 <w:color w:val="1C4B5F"/>
               </w:rPr>
-              <w:t>ậ</w:t>
             </w:r>
             <w:r>
               <w:rPr>
                 <w:b/>
                 <w:color w:val="1C4B5F"/>
               </w:rPr>
-              <w:t>t</w:t>
             </w:r>
             <w:r>
               <w:rPr>
                 <w:b/>
                 <w:color w:val="1C4B5F"/>
               </w:rPr>
-              <w:br/>
             </w:r>
             <w:r>
               <w:rPr>
                 <w:sz w:val="20"/>
               </w:rPr>
-              <w:t>M</w:t>
             </w:r>
             <w:r>
               <w:rPr>
                 <w:sz w:val="20"/>
               </w:rPr>
-              <w:t>ộ</w:t>
             </w:r>
             <w:r>
               <w:rPr>
                 <w:sz w:val="20"/>
               </w:rPr>
-              <w:t xml:space="preserve">t gate fail → targeted recovery → fresh retest → resume. Không reset toàn </w:t>
             </w:r>
             <w:r>
               <w:rPr>
                 <w:sz w:val="20"/>
               </w:rPr>
-              <w:t>roadmap vì m</w:t>
             </w:r>
             <w:r>
               <w:rPr>
                 <w:sz w:val="20"/>
               </w:rPr>
-              <w:t>ộ</w:t>
             </w:r>
             <w:r>
               <w:rPr>
                 <w:sz w:val="20"/>
               </w:rPr>
-              <w:t>t l</w:t>
             </w:r>
             <w:r>
               <w:rPr>
                 <w:sz w:val="20"/>
               </w:rPr>
-              <w:t>ỗ</w:t>
             </w:r>
             <w:r>
               <w:rPr>
                 <w:sz w:val="20"/>
               </w:rPr>
-              <w:t>i thông thư</w:t>
             </w:r>
             <w:r>
               <w:rPr>
                 <w:sz w:val="20"/>
               </w:rPr>
-              <w:t>ờ</w:t>
             </w:r>
             <w:r>
               <w:rPr>
                 <w:sz w:val="20"/>
               </w:rPr>
-              <w:t>ng.</w:t>
             </w:r>
           </w:p>
         </w:tc>
@@ -9707,23 +9335,13 @@
         <w:pStyle w:val="Heading1"/>
       </w:pPr>
       <w:r>
-        <w:t>13. ROADMAP-CONTROL - PH</w:t>
-      </w:r>
-      <w:r>
-        <w:t>Ầ</w:t>
-      </w:r>
-      <w:r>
-        <w:t>N AI CÓ TH</w:t>
-      </w:r>
-      <w:r>
-        <w:t>Ể</w:t>
-      </w:r>
-      <w:r>
-        <w:t xml:space="preserve"> LÀM H</w:t>
-      </w:r>
-      <w:r>
-        <w:t>Ộ</w:t>
-      </w:r>
+        <w:t>13. PROJECT CHAT, COWORK, HANDOFF VÀ ROADMAP-CONTROL</w:t>
+      </w:r>
+      <w:r/>
+      <w:r/>
+      <w:r/>
+      <w:r/>
+      <w:r/>
     </w:p>
     <w:tbl>
       <w:tblPr>
@@ -9752,16 +9370,29 @@
           </w:tcPr>
           <w:p>
             <w:r>
+              <w:t>PROJECT CHAT</w:t>
+              <w:br/>
+              <w:t>quyết định / assessment / audit / review / Cowork task spec / verify</w:t>
+              <w:br/>
+              <w:br/>
+              <w:t>COWORK</w:t>
+              <w:br/>
+              <w:t>manual independent chat / bounded repo transaction / report</w:t>
+              <w:br/>
+              <w:br/>
+              <w:t>LEARNER</w:t>
+              <w:br/>
+              <w:t>core implementation / AI-0 answer / hardware observation / END DAY confirmation</w:t>
+              <w:br/>
+              <w:br/>
               <w:t>roadmap-control/</w:t>
-            </w:r>
-            <w:r>
               <w:br/>
               <w:t>current-state.md | daily-log.md | competency-ledger.md | ai-usage-log.md</w:t>
-            </w:r>
-            <w:r>
               <w:br/>
               <w:t>weekly-scorecards/ | recovery/</w:t>
             </w:r>
+            <w:r/>
+            <w:r/>
           </w:p>
         </w:tc>
       </w:tr>
@@ -9773,29 +9404,15 @@
     </w:p>
     <w:p>
       <w:r>
-        <w:t>Bookkeeping/operational work có th</w:t>
-      </w:r>
-      <w:r>
-        <w:t>ể</w:t>
-      </w:r>
-      <w:r>
-        <w:t xml:space="preserve"> giao AI. Không </w:t>
-      </w:r>
-      <w:r>
-        <w:t>upload l</w:t>
-      </w:r>
-      <w:r>
-        <w:t>ạ</w:t>
-      </w:r>
-      <w:r>
-        <w:t>i các live files này vào ChatGPT Project m</w:t>
-      </w:r>
-      <w:r>
-        <w:t>ỗ</w:t>
-      </w:r>
-      <w:r>
-        <w:t>i ngày.</w:t>
-      </w:r>
+        <w:t>Learner không phải tự duy trì các file bookkeeping dài theo mặc định. Project Chat ra quyết định và tạo manual self-contained Cowork prompt; learner mở independent Cowork chat; Cowork execute/report; Project Chat independent verify. Platform Work mode không phải Cowork. HANDOFF chỉ là context transfer và không tự tạo commit. Nếu handoff giữa active session, packet giữ workflow phase/task, repo state nếu biết, build/test/failure, attempts/hints/AI exposure, blocker và exact resume point; provenance không rõ phải ghi UNRESOLVED, không đoán mức AI thấp hơn.</w:t>
+      </w:r>
+      <w:r/>
+      <w:r/>
+      <w:r/>
+      <w:r/>
+      <w:r/>
+      <w:r/>
+      <w:r/>
     </w:p>
     <w:tbl>
       <w:tblPr>
@@ -10229,31 +9846,27 @@
               <w:rPr>
                 <w:sz w:val="16"/>
               </w:rPr>
-              <w:t>B</w:t>
+              <w:t>Start/resume mặc định</w:t>
             </w:r>
             <w:r>
               <w:rPr>
                 <w:sz w:val="16"/>
               </w:rPr>
-              <w:t>ắ</w:t>
             </w:r>
             <w:r>
               <w:rPr>
                 <w:sz w:val="16"/>
               </w:rPr>
-              <w:t>t đ</w:t>
             </w:r>
             <w:r>
               <w:rPr>
                 <w:sz w:val="16"/>
               </w:rPr>
-              <w:t>ầ</w:t>
             </w:r>
             <w:r>
               <w:rPr>
                 <w:sz w:val="16"/>
               </w:rPr>
-              <w:t>u/resume ngày</w:t>
             </w:r>
           </w:p>
         </w:tc>
@@ -10273,19 +9886,17 @@
               <w:rPr>
                 <w:sz w:val="16"/>
               </w:rPr>
-              <w:t>Đ</w:t>
+              <w:t>Source/version check → hydrate state → Day Contract → Focus</w:t>
             </w:r>
             <w:r>
               <w:rPr>
                 <w:sz w:val="16"/>
               </w:rPr>
-              <w:t>ọ</w:t>
             </w:r>
             <w:r>
               <w:rPr>
                 <w:sz w:val="16"/>
               </w:rPr>
-              <w:t>c state → snapshot → theory → day pack</w:t>
             </w:r>
           </w:p>
         </w:tc>
@@ -10537,7 +10148,7 @@
               <w:rPr>
                 <w:sz w:val="16"/>
               </w:rPr>
-              <w:t>Context đã rõ</w:t>
+              <w:t>Có thể gọi trực tiếp</w:t>
             </w:r>
           </w:p>
         </w:tc>
@@ -10558,7 +10169,7 @@
               <w:rPr>
                 <w:sz w:val="16"/>
               </w:rPr>
-              <w:t>Theory Pack + Full Day Pack</w:t>
+              <w:t>Tự hydrate context nếu cần; Day Contract trước Theory/Day Pack</w:t>
             </w:r>
           </w:p>
         </w:tc>
@@ -11482,7 +11093,7 @@
               <w:rPr>
                 <w:sz w:val="16"/>
               </w:rPr>
-              <w:t>Đóng ngày</w:t>
+              <w:t>Learner xác nhận đóng ngày</w:t>
             </w:r>
           </w:p>
         </w:tc>
@@ -11502,7 +11113,7 @@
               <w:rPr>
                 <w:sz w:val="16"/>
               </w:rPr>
-              <w:t>Log + status + Next Action</w:t>
+              <w:t>Human preflight → Cowork nếu cần → logs/state/linter/commit/verify</w:t>
             </w:r>
           </w:p>
         </w:tc>
@@ -11593,7 +11204,7 @@
           </w:tcPr>
           <w:p>
             <w:r>
-              <w:t>Scorecard + weekly decision + check roadmap-review status</w:t>
+              <w:t>Sau required assessment + MASTER CHECK: scorecard, CP, Week decision</w:t>
             </w:r>
           </w:p>
         </w:tc>
@@ -12493,19 +12104,17 @@
               <w:rPr>
                 <w:sz w:val="16"/>
               </w:rPr>
-              <w:t>Đ</w:t>
+              <w:t>Đổi chat/account/context</w:t>
             </w:r>
             <w:r>
               <w:rPr>
                 <w:sz w:val="16"/>
               </w:rPr>
-              <w:t>ổ</w:t>
             </w:r>
             <w:r>
               <w:rPr>
                 <w:sz w:val="16"/>
               </w:rPr>
-              <w:t>i chat/account</w:t>
             </w:r>
           </w:p>
         </w:tc>
@@ -12525,19 +12134,49 @@
               <w:rPr>
                 <w:sz w:val="16"/>
               </w:rPr>
-              <w:t>T</w:t>
+              <w:t>Context packet; active session giữ attempts/AI/repo/resume point; không Cowork dispatch</w:t>
             </w:r>
             <w:r>
               <w:rPr>
                 <w:sz w:val="16"/>
               </w:rPr>
-              <w:t>ạ</w:t>
             </w:r>
             <w:r>
               <w:rPr>
                 <w:sz w:val="16"/>
               </w:rPr>
-              <w:t>o resume packet</w:t>
+            </w:r>
+          </w:p>
+        </w:tc>
+      </w:tr>
+      <w:tr>
+        <w:tc>
+          <w:tcPr>
+            <w:tcW w:type="dxa" w:w="3324"/>
+          </w:tcPr>
+          <w:p>
+            <w:r>
+              <w:t>MASTER CHECK</w:t>
+            </w:r>
+          </w:p>
+        </w:tc>
+        <w:tc>
+          <w:tcPr>
+            <w:tcW w:type="dxa" w:w="3324"/>
+          </w:tcPr>
+          <w:p>
+            <w:r>
+              <w:t>Deep audit snapshot; bắt buộc ở week close</w:t>
+            </w:r>
+          </w:p>
+        </w:tc>
+        <w:tc>
+          <w:tcPr>
+            <w:tcW w:type="dxa" w:w="3324"/>
+          </w:tcPr>
+          <w:p>
+            <w:r>
+              <w:t>Pin AUDIT_BASE_SHA; read-only; không sửa/commit/push/award competency</w:t>
             </w:r>
           </w:p>
         </w:tc>
@@ -12614,276 +12253,214 @@
                 <w:rFonts w:ascii="Consolas" w:hAnsi="Consolas"/>
                 <w:sz w:val="18"/>
               </w:rPr>
-              <w:t>08:00  BOOT</w:t>
-            </w:r>
-            <w:r>
-              <w:br/>
-            </w:r>
+              <w:t>08:00 BOOT → State Snapshot → Day Contract (Standard/Available/Planned time) → Theory/TODO → Focus tự code → DEBUG/measurement → build/test/evidence → SUBMIT TODO → sửa findings bắt buộc → END_DAY_READY → learner xác nhận END DAY → human-input preflight → Cowork closure nếu cần → Project Chat verify → CLOSED</w:t>
+            </w:r>
+            <w:r/>
             <w:r>
               <w:rPr>
                 <w:rFonts w:ascii="Consolas" w:hAnsi="Consolas"/>
                 <w:sz w:val="18"/>
               </w:rPr>
-              <w:t>08:05  đ</w:t>
             </w:r>
             <w:r>
               <w:rPr>
                 <w:rFonts w:ascii="Consolas" w:hAnsi="Consolas"/>
                 <w:sz w:val="18"/>
               </w:rPr>
-              <w:t>ọ</w:t>
             </w:r>
             <w:r>
               <w:rPr>
                 <w:rFonts w:ascii="Consolas" w:hAnsi="Consolas"/>
                 <w:sz w:val="18"/>
               </w:rPr>
-              <w:t>c snapshot + outcome</w:t>
-            </w:r>
-            <w:r>
-              <w:br/>
-            </w:r>
+            </w:r>
+            <w:r/>
             <w:r>
               <w:rPr>
                 <w:rFonts w:ascii="Consolas" w:hAnsi="Consolas"/>
                 <w:sz w:val="18"/>
               </w:rPr>
-              <w:t>08:10  Theory Pack</w:t>
-            </w:r>
-            <w:r>
-              <w:br/>
-            </w:r>
+            </w:r>
+            <w:r/>
             <w:r>
               <w:rPr>
                 <w:rFonts w:ascii="Consolas" w:hAnsi="Consolas"/>
                 <w:sz w:val="18"/>
               </w:rPr>
-              <w:t>08:40  tr</w:t>
             </w:r>
             <w:r>
               <w:rPr>
                 <w:rFonts w:ascii="Consolas" w:hAnsi="Consolas"/>
                 <w:sz w:val="18"/>
               </w:rPr>
-              <w:t>ả</w:t>
             </w:r>
             <w:r>
               <w:rPr>
                 <w:rFonts w:ascii="Consolas" w:hAnsi="Consolas"/>
                 <w:sz w:val="18"/>
               </w:rPr>
-              <w:t xml:space="preserve"> l</w:t>
             </w:r>
             <w:r>
               <w:rPr>
                 <w:rFonts w:ascii="Consolas" w:hAnsi="Consolas"/>
                 <w:sz w:val="18"/>
               </w:rPr>
-              <w:t>ờ</w:t>
             </w:r>
             <w:r>
               <w:rPr>
                 <w:rFonts w:ascii="Consolas" w:hAnsi="Consolas"/>
                 <w:sz w:val="18"/>
               </w:rPr>
-              <w:t>i pre-check</w:t>
-            </w:r>
-            <w:r>
-              <w:br/>
-            </w:r>
+            </w:r>
+            <w:r/>
             <w:r>
               <w:rPr>
                 <w:rFonts w:ascii="Consolas" w:hAnsi="Consolas"/>
                 <w:sz w:val="18"/>
               </w:rPr>
-              <w:t>09:00  m</w:t>
             </w:r>
             <w:r>
               <w:rPr>
                 <w:rFonts w:ascii="Consolas" w:hAnsi="Consolas"/>
                 <w:sz w:val="18"/>
               </w:rPr>
-              <w:t>ở</w:t>
             </w:r>
             <w:r>
               <w:rPr>
                 <w:rFonts w:ascii="Consolas" w:hAnsi="Consolas"/>
                 <w:sz w:val="18"/>
               </w:rPr>
-              <w:t xml:space="preserve"> TODO/starter</w:t>
-            </w:r>
-            <w:r>
-              <w:br/>
-            </w:r>
+            </w:r>
+            <w:r/>
             <w:r>
               <w:rPr>
                 <w:rFonts w:ascii="Consolas" w:hAnsi="Consolas"/>
                 <w:sz w:val="18"/>
               </w:rPr>
-              <w:t>09:05  t</w:t>
             </w:r>
             <w:r>
               <w:rPr>
                 <w:rFonts w:ascii="Consolas" w:hAnsi="Consolas"/>
                 <w:sz w:val="18"/>
               </w:rPr>
-              <w:t>ự</w:t>
             </w:r>
             <w:r>
               <w:rPr>
                 <w:rFonts w:ascii="Consolas" w:hAnsi="Consolas"/>
                 <w:sz w:val="18"/>
               </w:rPr>
-              <w:t xml:space="preserve"> code AI-1/AI-2</w:t>
-            </w:r>
-            <w:r>
-              <w:br/>
-            </w:r>
+            </w:r>
+            <w:r/>
             <w:r>
               <w:rPr>
                 <w:rFonts w:ascii="Consolas" w:hAnsi="Consolas"/>
                 <w:sz w:val="18"/>
               </w:rPr>
-              <w:t>11:00  test fail</w:t>
-            </w:r>
-            <w:r>
-              <w:br/>
-            </w:r>
+            </w:r>
+            <w:r/>
             <w:r>
               <w:rPr>
                 <w:rFonts w:ascii="Consolas" w:hAnsi="Consolas"/>
                 <w:sz w:val="18"/>
               </w:rPr>
-              <w:t>11:05  DEBUG: ...</w:t>
-            </w:r>
-            <w:r>
-              <w:br/>
-            </w:r>
+            </w:r>
+            <w:r/>
             <w:r>
               <w:rPr>
                 <w:rFonts w:ascii="Consolas" w:hAnsi="Consolas"/>
                 <w:sz w:val="18"/>
               </w:rPr>
-              <w:t>11:30  fix + regression</w:t>
-            </w:r>
-            <w:r>
-              <w:br/>
-            </w:r>
+            </w:r>
+            <w:r/>
             <w:r>
               <w:rPr>
                 <w:rFonts w:ascii="Consolas" w:hAnsi="Consolas"/>
                 <w:sz w:val="18"/>
               </w:rPr>
-              <w:t>14:00  edge cases</w:t>
-            </w:r>
-            <w:r>
-              <w:br/>
-            </w:r>
+            </w:r>
+            <w:r/>
             <w:r>
               <w:rPr>
                 <w:rFonts w:ascii="Consolas" w:hAnsi="Consolas"/>
                 <w:sz w:val="18"/>
               </w:rPr>
-              <w:t>16:00  build/test clean</w:t>
-            </w:r>
-            <w:r>
-              <w:br/>
-            </w:r>
+            </w:r>
+            <w:r/>
             <w:r>
               <w:rPr>
                 <w:rFonts w:ascii="Consolas" w:hAnsi="Consolas"/>
                 <w:sz w:val="18"/>
               </w:rPr>
-              <w:t xml:space="preserve">16:15  CHECK </w:t>
             </w:r>
             <w:r>
               <w:rPr>
                 <w:rFonts w:ascii="Consolas" w:hAnsi="Consolas"/>
                 <w:sz w:val="18"/>
               </w:rPr>
-              <w:t>UNDERSTANDING</w:t>
-            </w:r>
-            <w:r>
-              <w:br/>
-            </w:r>
+            </w:r>
+            <w:r/>
             <w:r>
               <w:rPr>
                 <w:rFonts w:ascii="Consolas" w:hAnsi="Consolas"/>
                 <w:sz w:val="18"/>
               </w:rPr>
-              <w:t>16:30  commit/push</w:t>
-            </w:r>
-            <w:r>
-              <w:br/>
-            </w:r>
+            </w:r>
+            <w:r/>
             <w:r>
               <w:rPr>
                 <w:rFonts w:ascii="Consolas" w:hAnsi="Consolas"/>
                 <w:sz w:val="18"/>
               </w:rPr>
-              <w:t>16:40  SUBMIT TODO</w:t>
-            </w:r>
-            <w:r>
-              <w:br/>
-            </w:r>
+            </w:r>
+            <w:r/>
             <w:r>
               <w:rPr>
                 <w:rFonts w:ascii="Consolas" w:hAnsi="Consolas"/>
                 <w:sz w:val="18"/>
               </w:rPr>
-              <w:t>17:00  s</w:t>
             </w:r>
             <w:r>
               <w:rPr>
                 <w:rFonts w:ascii="Consolas" w:hAnsi="Consolas"/>
                 <w:sz w:val="18"/>
               </w:rPr>
-              <w:t>ử</w:t>
             </w:r>
             <w:r>
               <w:rPr>
                 <w:rFonts w:ascii="Consolas" w:hAnsi="Consolas"/>
                 <w:sz w:val="18"/>
               </w:rPr>
-              <w:t>a findings b</w:t>
             </w:r>
             <w:r>
               <w:rPr>
                 <w:rFonts w:ascii="Consolas" w:hAnsi="Consolas"/>
                 <w:sz w:val="18"/>
               </w:rPr>
-              <w:t>ắ</w:t>
             </w:r>
             <w:r>
               <w:rPr>
                 <w:rFonts w:ascii="Consolas" w:hAnsi="Consolas"/>
                 <w:sz w:val="18"/>
               </w:rPr>
-              <w:t>t bu</w:t>
             </w:r>
             <w:r>
               <w:rPr>
                 <w:rFonts w:ascii="Consolas" w:hAnsi="Consolas"/>
                 <w:sz w:val="18"/>
               </w:rPr>
-              <w:t>ộ</w:t>
             </w:r>
             <w:r>
               <w:rPr>
                 <w:rFonts w:ascii="Consolas" w:hAnsi="Consolas"/>
                 <w:sz w:val="18"/>
               </w:rPr>
-              <w:t>c</w:t>
-            </w:r>
-            <w:r>
-              <w:br/>
-            </w:r>
+            </w:r>
+            <w:r/>
             <w:r>
               <w:rPr>
                 <w:rFonts w:ascii="Consolas" w:hAnsi="Consolas"/>
                 <w:sz w:val="18"/>
               </w:rPr>
-              <w:t>17:30  END DAY</w:t>
             </w:r>
           </w:p>
         </w:tc>
@@ -13340,11 +12917,9 @@
     </w:p>
     <w:p>
       <w:r>
-        <w:t>☐</w:t>
-      </w:r>
-      <w:r>
-        <w:t xml:space="preserve"> BOOT</w:t>
-      </w:r>
+        <w:t>☐ BOOT (hoặc stateful command tự hydrate context)</w:t>
+      </w:r>
+      <w:r/>
     </w:p>
     <w:p>
       <w:r>
@@ -13365,39 +12940,25 @@
     </w:p>
     <w:p>
       <w:r>
-        <w:t>☐</w:t>
-      </w:r>
-      <w:r>
-        <w:t xml:space="preserve"> M</w:t>
-      </w:r>
-      <w:r>
-        <w:t>ộ</w:t>
-      </w:r>
-      <w:r>
-        <w:t>t outcome duy nh</w:t>
-      </w:r>
-      <w:r>
-        <w:t>ấ</w:t>
-      </w:r>
-      <w:r>
-        <w:t>t</w:t>
-      </w:r>
+        <w:t>☐ Day Contract: outcome / artifact / evidence / stop condition</w:t>
+      </w:r>
+      <w:r/>
+      <w:r/>
+      <w:r/>
+      <w:r/>
+      <w:r/>
     </w:p>
     <w:p>
       <w:r>
-        <w:t>☐</w:t>
-      </w:r>
-      <w:r>
-        <w:t xml:space="preserve"> AI level hôm nay</w:t>
-      </w:r>
+        <w:t>☐ AI/assessment mode và AI-0 firewall</w:t>
+      </w:r>
+      <w:r/>
     </w:p>
     <w:p>
       <w:r>
-        <w:t>☐</w:t>
-      </w:r>
-      <w:r>
-        <w:t xml:space="preserve"> Required evidence</w:t>
-      </w:r>
+        <w:t>☐ Roadmap Standard Load / Available / Planned Focused Time tách riêng</w:t>
+      </w:r>
+      <w:r/>
     </w:p>
     <w:p>
       <w:r>
@@ -13534,58 +13095,38 @@
     </w:p>
     <w:p>
       <w:r>
-        <w:t>☐</w:t>
-      </w:r>
-      <w:r>
-        <w:t xml:space="preserve"> Save log/capture/failure evidence</w:t>
-      </w:r>
+        <w:t>☐ Save raw log/capture/failure evidence</w:t>
+      </w:r>
+      <w:r/>
     </w:p>
     <w:p>
       <w:r>
-        <w:t>☐</w:t>
-      </w:r>
-      <w:r>
-        <w:t xml:space="preserve"> Commit logical change</w:t>
-      </w:r>
+        <w:t>☐ END_DAY_READY → learner xác nhận END DAY</w:t>
+      </w:r>
+      <w:r/>
     </w:p>
     <w:p>
       <w:r>
-        <w:t>☐</w:t>
-      </w:r>
-      <w:r>
-        <w:t xml:space="preserve"> Push checkpoint c</w:t>
-      </w:r>
-      <w:r>
-        <w:t>ầ</w:t>
-      </w:r>
-      <w:r>
-        <w:t>n th</w:t>
-      </w:r>
-      <w:r>
-        <w:t>i</w:t>
-      </w:r>
-      <w:r>
-        <w:t>ế</w:t>
-      </w:r>
-      <w:r>
-        <w:t>t</w:t>
-      </w:r>
+        <w:t>☐ Human-only fields + AI provenance đã settle</w:t>
+      </w:r>
+      <w:r/>
+      <w:r/>
+      <w:r/>
+      <w:r/>
+      <w:r/>
+      <w:r/>
     </w:p>
     <w:p>
       <w:r>
-        <w:t>☐</w:t>
-      </w:r>
-      <w:r>
-        <w:t xml:space="preserve"> SUBMIT TODO</w:t>
-      </w:r>
+        <w:t>☐ Cowork closure nếu cần; Project Chat verify report</w:t>
+      </w:r>
+      <w:r/>
     </w:p>
     <w:p>
       <w:r>
-        <w:t>☐</w:t>
-      </w:r>
-      <w:r>
-        <w:t xml:space="preserve"> END DAY</w:t>
-      </w:r>
+        <w:t>☐ Evidence/log/state/linter/human audit → commit/push</w:t>
+      </w:r>
+      <w:r/>
     </w:p>
     <w:p>
       <w:r>
@@ -13673,243 +13214,126 @@
           </w:tcPr>
           <w:p>
             <w:r>
-              <w:t>B</w:t>
-            </w:r>
-            <w:r>
-              <w:t>Ắ</w:t>
-            </w:r>
-            <w:r>
-              <w:t>T Đ</w:t>
-            </w:r>
-            <w:r>
-              <w:t>Ầ</w:t>
-            </w:r>
-            <w:r>
-              <w:t>U / RESUME</w:t>
-            </w:r>
-            <w:r>
+              <w:t>BẮT ĐẦU / RESUME</w:t>
               <w:br/>
               <w:t>BOOT</w:t>
-            </w:r>
-            <w:r>
               <w:br/>
-            </w:r>
-            <w:r>
               <w:br/>
-              <w:t>CH</w:t>
-            </w:r>
-            <w:r>
-              <w:t>Ỉ</w:t>
-            </w:r>
-            <w:r>
-              <w:t xml:space="preserve"> XEM TR</w:t>
-            </w:r>
-            <w:r>
-              <w:t>Ạ</w:t>
-            </w:r>
-            <w:r>
-              <w:t>NG THÁI</w:t>
-            </w:r>
-            <w:r>
+              <w:t>STATEFUL COMMAND KHÔNG CÓ BOOT</w:t>
               <w:br/>
-              <w:t>STATUS</w:t>
-            </w:r>
-            <w:r>
+              <w:t>TỰ HYDRATE CONTEXT</w:t>
               <w:br/>
-              <w:t>BOOT STATUS ONLY</w:t>
-            </w:r>
-            <w:r>
               <w:br/>
-            </w:r>
-            <w:r>
+              <w:t>DAY CONTRACT</w:t>
               <w:br/>
-              <w:t>H</w:t>
-            </w:r>
-            <w:r>
-              <w:t>Ọ</w:t>
-            </w:r>
-            <w:r>
-              <w:t>C THEORY</w:t>
-            </w:r>
-            <w:r>
+              <w:t>OUTCOME / ARTIFACT / EVIDENCE / STOP / AI / STANDARD-AVAILABLE-PLANNED</w:t>
               <w:br/>
-              <w:t>TEACH: &lt;topic&gt;</w:t>
-            </w:r>
-            <w:r>
               <w:br/>
-            </w:r>
-            <w:r>
+              <w:t>FOCUS</w:t>
               <w:br/>
-              <w:t>T</w:t>
-            </w:r>
-            <w:r>
-              <w:t>Ự</w:t>
-            </w:r>
-            <w:r>
-              <w:t xml:space="preserve"> KI</w:t>
-            </w:r>
-            <w:r>
-              <w:t>Ể</w:t>
-            </w:r>
-            <w:r>
-              <w:t>M TRA</w:t>
-            </w:r>
-            <w:r>
+              <w:t>TỰ LÀM CORE → TEST/MEASURE → SUBMIT</w:t>
               <w:br/>
-              <w:t>CHECK UNDERSTANDING: &lt;topic&gt;</w:t>
-            </w:r>
-            <w:r>
               <w:br/>
-            </w:r>
-            <w:r>
+              <w:t>ĐỦ ĐIỀU KIỆN</w:t>
               <w:br/>
-              <w:t>BÍ</w:t>
-            </w:r>
-            <w:r>
+              <w:t>END_DAY_READY (CHƯA CLOSED)</w:t>
               <w:br/>
-              <w:t>HINT 1 → HINT 2 → HINT 3 → HINT 4</w:t>
-            </w:r>
-            <w:r>
               <w:br/>
-            </w:r>
-            <w:r>
-              <w:br/>
-              <w:t>BUG</w:t>
-            </w:r>
-            <w:r>
-              <w:br/>
-              <w:t>DEBUG: &lt;symptom&gt;</w:t>
-            </w:r>
-            <w:r>
-              <w:br/>
-            </w:r>
-            <w:r>
-              <w:br/>
-              <w:t>LÀM XONG BÀI</w:t>
-            </w:r>
-            <w:r>
-              <w:br/>
-              <w:t>SUBMIT TODO</w:t>
-            </w:r>
-            <w:r>
-              <w:br/>
-            </w:r>
-            <w:r>
-              <w:br/>
-              <w:t>ĐÓNG NGÀY</w:t>
-            </w:r>
-            <w:r>
+              <w:t>LEARNER XÁC NHẬN</w:t>
               <w:br/>
               <w:t>END DAY</w:t>
-            </w:r>
-            <w:r>
               <w:br/>
-            </w:r>
-            <w:r>
               <w:br/>
-              <w:t>CU</w:t>
-            </w:r>
-            <w:r>
-              <w:t>Ố</w:t>
-            </w:r>
-            <w:r>
-              <w:t>I TU</w:t>
-            </w:r>
-            <w:r>
-              <w:t>Ầ</w:t>
-            </w:r>
-            <w:r>
-              <w:t>N</w:t>
-            </w:r>
-            <w:r>
+              <w:t>REPO WORK</w:t>
               <w:br/>
-              <w:t>WEEKLY REVIEW</w:t>
-            </w:r>
-            <w:r>
+              <w:t>PROJECT CHAT → MANUAL COWORK PROMPT → REPORT → INDEPENDENT VERIFY</w:t>
               <w:br/>
-            </w:r>
-            <w:r>
+              <w:t>WORK MODE != COWORK</w:t>
               <w:br/>
-              <w:t>RÀ SOÁT ROADMAP KHI H</w:t>
-            </w:r>
-            <w:r>
-              <w:t>Ệ</w:t>
-            </w:r>
-            <w:r>
-              <w:t xml:space="preserve"> TH</w:t>
-            </w:r>
-            <w:r>
-              <w:t>Ố</w:t>
-            </w:r>
-            <w:r>
-              <w:t>NG BÁO DUE</w:t>
-            </w:r>
-            <w:r>
               <w:br/>
-              <w:t>ROADMAP REVIEW</w:t>
-            </w:r>
-            <w:r>
+              <w:t>DEEP AUDIT</w:t>
               <w:br/>
-            </w:r>
-            <w:r>
+              <w:t>MASTER CHECK = READ-ONLY, PIN SHA</w:t>
               <w:br/>
-              <w:t>R3/R4 KH</w:t>
-            </w:r>
-            <w:r>
-              <w:t>Ẩ</w:t>
-            </w:r>
-            <w:r>
-              <w:t>N</w:t>
-            </w:r>
-            <w:r>
               <w:br/>
-              <w:t>ROADMAP REVIEW — URGENT</w:t>
-            </w:r>
-            <w:r>
+              <w:t>GATE FAIL</w:t>
               <w:br/>
-            </w:r>
-            <w:r>
+              <w:t>TARGETED RECOVERY → FRESH RETEST → MASTER CHECK → WEEKLY REVIEW</w:t>
               <w:br/>
-              <w:t>FORMAL COMPETENCY</w:t>
-            </w:r>
-            <w:r>
               <w:br/>
-              <w:t>GATE</w:t>
-            </w:r>
-            <w:r>
+              <w:t>ĐỔI CONTEXT</w:t>
               <w:br/>
-            </w:r>
-            <w:r>
-              <w:br/>
-              <w:t>FAIL / INVA</w:t>
-            </w:r>
-            <w:r>
-              <w:t>LID / TR</w:t>
-            </w:r>
-            <w:r>
-              <w:t>Ễ</w:t>
-            </w:r>
-            <w:r>
-              <w:br/>
-              <w:t>RECOVERY → RETEST</w:t>
-            </w:r>
-            <w:r>
-              <w:br/>
-            </w:r>
-            <w:r>
-              <w:br/>
-              <w:t>Đ</w:t>
-            </w:r>
-            <w:r>
-              <w:t>Ổ</w:t>
-            </w:r>
-            <w:r>
-              <w:t>I CHAT / ACCOUNT</w:t>
-            </w:r>
-            <w:r>
-              <w:br/>
-              <w:t>HANDOFF</w:t>
-            </w:r>
+              <w:t>HANDOFF (KHÔNG PHẢI COWORK DISPATCH)</w:t>
+            </w:r>
+            <w:r/>
+            <w:r/>
+            <w:r/>
+            <w:r/>
+            <w:r/>
+            <w:r/>
+            <w:r/>
+            <w:r/>
+            <w:r/>
+            <w:r/>
+            <w:r/>
+            <w:r/>
+            <w:r/>
+            <w:r/>
+            <w:r/>
+            <w:r/>
+            <w:r/>
+            <w:r/>
+            <w:r/>
+            <w:r/>
+            <w:r/>
+            <w:r/>
+            <w:r/>
+            <w:r/>
+            <w:r/>
+            <w:r/>
+            <w:r/>
+            <w:r/>
+            <w:r/>
+            <w:r/>
+            <w:r/>
+            <w:r/>
+            <w:r/>
+            <w:r/>
+            <w:r/>
+            <w:r/>
+            <w:r/>
+            <w:r/>
+            <w:r/>
+            <w:r/>
+            <w:r/>
+            <w:r/>
+            <w:r/>
+            <w:r/>
+            <w:r/>
+            <w:r/>
+            <w:r/>
+            <w:r/>
+            <w:r/>
+            <w:r/>
+            <w:r/>
+            <w:r/>
+            <w:r/>
+            <w:r/>
+            <w:r/>
+            <w:r/>
+            <w:r/>
+            <w:r/>
+            <w:r/>
+            <w:r/>
+            <w:r/>
+            <w:r/>
+            <w:r/>
+            <w:r/>
+            <w:r/>
+            <w:r/>
+            <w:r/>
+            <w:r/>
+            <w:r/>
           </w:p>
         </w:tc>
       </w:tr>
@@ -14138,21 +13562,19 @@
           <w:i/>
           <w:sz w:val="17"/>
         </w:rPr>
-        <w:t>Ngu</w:t>
+        <w:t>Sổ tay 1.1.0 • Nguồn: SYSTEM_SPEC_V3.md 3.0.0 • EMBEDDED_ROADMAP_V3.1.docx 3.1.0 • MASTER_PROMPT_V3.md 3.1.0 (canonical live)</w:t>
       </w:r>
       <w:r>
         <w:rPr>
           <w:i/>
           <w:sz w:val="17"/>
         </w:rPr>
-        <w:t>ồ</w:t>
       </w:r>
       <w:r>
         <w:rPr>
           <w:i/>
           <w:sz w:val="17"/>
         </w:rPr>
-        <w:t>n: SYSTEM_SPEC_V3.md 3.0.0 • EMBEDDED_ROADMAP_V3.1.docx 3.1.0 • MASTER_PROMPT_V3.md 3.0.2</w:t>
       </w:r>
     </w:p>
     <w:p>

</xml_diff>

<commit_message>
docs(system): harden executor consent and portability
</commit_message>
<xml_diff>
--- a/docs/system/HOW_TO_USE_ROADMAP_WITH_AI.docx
+++ b/docs/system/HOW_TO_USE_ROADMAP_WITH_AI.docx
@@ -7639,7 +7639,7 @@
         <w:ind w:left="142" w:hanging="142"/>
       </w:pPr>
       <w:r>
-        <w:t>4. Project Chat tạo EXECUTOR DISPATCH/Cowork prompt nếu repo mutation cần thiết.</w:t>
+        <w:t>4. Project Chat tạo executor prompt (Cowork hoặc Antigravity) nếu repo mutation cần thiết; explicit opt-in trước.</w:t>
       </w:r>
     </w:p>
     <w:p>
@@ -7647,7 +7647,7 @@
         <w:ind w:left="142" w:hanging="142"/>
       </w:pPr>
       <w:r>
-        <w:t>5. Cowork update evidence → daily log → AI log → Current State → ledger khi applicable.</w:t>
+        <w:t>5. Executor (Cowork/Antigravity) update evidence → daily log → AI log → Current State → ledger khi applicable.</w:t>
       </w:r>
     </w:p>
     <w:p>
@@ -9404,7 +9404,32 @@
     </w:p>
     <w:p>
       <w:r>
-        <w:t>Learner không phải tự duy trì các file bookkeeping dài theo mặc định. Project Chat ra quyết định và tạo manual self-contained Cowork prompt; learner mở independent Cowork chat; Cowork execute/report; Project Chat independent verify. Platform Work mode không phải Cowork. HANDOFF chỉ là context transfer và không tự tạo commit. Nếu handoff giữa active session, packet giữ workflow phase/task, repo state nếu biết, build/test/failure, attempts/hints/AI exposure, blocker và exact resume point; provenance không rõ phải ghi UNRESOLVED, không đoán mức AI thấp hơn.</w:t>
+        <w:t>Learner không phải tự duy trì các file bookkeeping dài theo mặc định. Project Chat ra quyết định và tạo manual self-contained executor prompt; learner mở independent Cowork hoặc Antigravity context; executor thực hiện bounded operation và trả report; Project Chat independent verify.</w:t>
+        <w:br/>
+        <w:br/>
+        <w:t>Quan trọng — Work mode popup và executor consent:</w:t>
+        <w:br/>
+        <w:t>• Work mode popup/background handoff của platform KHÔNG phải roadmap executor consent. Reject popup đó KHÔNG reject executor.</w:t>
+        <w:br/>
+        <w:t>• Project Chat hoàn thành reply trước, giải thích ngắn tại sao cần executor, rồi hỏi permission. Chỉ sau khi learner đồng ý mới tạo prompt.</w:t>
+        <w:br/>
+        <w:t>• Cowork là executor mặc định. Antigravity là fallback được duyệt — cùng prompt, cùng contract, cùng provenance rules.</w:t>
+        <w:br/>
+        <w:t>• Learner tự mở context mới, paste prompt, chạy, lấy report về cho Project Chat.</w:t>
+        <w:br/>
+        <w:t>• Nếu Cowork hết quota hoặc không khả dụng, dùng Antigravity — không tự hủy operation.</w:t>
+        <w:br/>
+        <w:br/>
+        <w:t>HANDOFF chỉ là context transfer giữa chat/account/context, không phải executor dispatch. Nếu handoff giữa active session, packet giữ workflow phase/task, repo state nếu biết, build/test/failure, attempts/hints/AI exposure, blocker và exact resume point; provenance không rõ phải ghi UNRESOLVED, không đoán mức AI thấp hơn.</w:t>
+        <w:br/>
+        <w:br/>
+        <w:t>MASTER CHECK — external inspection:</w:t>
+        <w:br/>
+        <w:t>• MASTER CHECK là deep read-only audit, kể cả khi executor hỗ trợ inspect local repo.</w:t>
+        <w:br/>
+        <w:t>• Executor chạy read-only commands và trả observations — KHÔNG sửa file, commit, push, repair hoặc tự cấp competency.</w:t>
+        <w:br/>
+        <w:t>• Nếu cần correction sau audit: MASTER CHECK kết thúc → disposition findings → owner approve → CORRECTION transaction riêng → fresh executor consent.</w:t>
       </w:r>
       <w:r/>
       <w:r/>
@@ -13118,7 +13143,7 @@
     </w:p>
     <w:p>
       <w:r>
-        <w:t>☐ Cowork closure nếu cần; Project Chat verify report</w:t>
+        <w:t>☐ Executor (Cowork/Antigravity) closure nếu cần; Project Chat verify report</w:t>
       </w:r>
       <w:r/>
     </w:p>
@@ -13562,7 +13587,7 @@
           <w:i/>
           <w:sz w:val="17"/>
         </w:rPr>
-        <w:t>Sổ tay 1.1.0 • Nguồn: SYSTEM_SPEC_V3.md 3.0.0 • EMBEDDED_ROADMAP_V3.1.docx 3.1.0 • MASTER_PROMPT_V3.md 3.1.0 (canonical live)</w:t>
+        <w:t>Sổ tay 1.2.0 • Nguồn: SYSTEM_SPEC_V3.md 3.0.0 • EMBEDDED_ROADMAP_V3.1.docx 3.1.0 • MASTER_PROMPT_V3.md 3.1.1 (canonical live)</w:t>
       </w:r>
       <w:r>
         <w:rPr>

</xml_diff>

<commit_message>
fix(workflow): pipeline start-day prep and executor hygiene
</commit_message>
<xml_diff>
--- a/docs/system/HOW_TO_USE_ROADMAP_WITH_AI.docx
+++ b/docs/system/HOW_TO_USE_ROADMAP_WITH_AI.docx
@@ -81,7 +81,7 @@
         <w:rPr>
           <w:sz w:val="24"/>
         </w:rPr>
-        <w:t>Version 1.1.0 - bản Word editable dành cho người học tự đọc, chỉnh sửa và in</w:t>
+        <w:t>Version 1.3.0 - bản Word editable dành cho người học tự đọc, chỉnh sửa và in</w:t>
       </w:r>
       <w:r>
         <w:rPr>
@@ -540,7 +540,7 @@
         <w:rPr>
           <w:sz w:val="19"/>
         </w:rPr>
-        <w:t>MASTER_PROMPT_V3.md - 3.1.0 (canonical live: docs/system/MASTER_PROMPT_V3.md)</w:t>
+        <w:t>MASTER_PROMPT_V3.md - 3.1.2 (canonical live: docs/system/MASTER_PROMPT_V3.md)</w:t>
       </w:r>
     </w:p>
     <w:p>
@@ -708,7 +708,7 @@
           <w:b/>
           <w:sz w:val="26"/>
         </w:rPr>
-        <w:t>BOOT    DAY CONTRACT    FOCUS    END_DAY_READY    END DAY</w:t>
+        <w:t>BOOT    THEORY + PREP    DAY CONTRACT    FOCUS    END_DAY_READY    END DAY</w:t>
       </w:r>
       <w:r>
         <w:rPr>
@@ -812,47 +812,46 @@
                 <w:rFonts w:ascii="Consolas" w:hAnsi="Consolas"/>
                 <w:sz w:val="18"/>
               </w:rPr>
-              <w:t>BOOT (hoặc stateful command tự hydrate context)</w:t>
+              <w:t>BOOT → hydrate state</w:t>
               <w:br/>
               <w:t>↓</w:t>
               <w:br/>
-              <w:t>STATE SNAPSHOT + GOVERNING SOURCE CHECK</w:t>
+              <w:t>STATE SNAPSHOT + scoped THEORY PACK + AI BOUNDARY</w:t>
               <w:br/>
               <w:t>↓</w:t>
               <w:br/>
-              <w:t>DAY CONTRACT: outcome / artifact / evidence / stop / AI / thời gian</w:t>
+              <w:t>BOOT PREP INPUT: Available Time nếu thiếu + executor consent nếu hữu ích</w:t>
               <w:br/>
               <w:t>↓</w:t>
               <w:br/>
-              <w:t>FOCUS: THEORY + TODO + TỰ LÀM CORE</w:t>
+              <w:t>Cowork/Antigravity prep trong khi learner đọc theory</w:t>
               <w:br/>
               <w:t>↓</w:t>
               <w:br/>
-              <w:t>BUILD / TEST / MEASUREMENT / EVIDENCE</w:t>
+              <w:t>PROJECT CHAT VERIFY PREP → PRE-CHECK</w:t>
               <w:br/>
               <w:t>↓</w:t>
               <w:br/>
-              <w:t>SUBMIT TODO + sửa BLOCKER/HIGH</w:t>
+              <w:t>COMPLETE DAY CONTRACT → FOCUS_ACTIVE</w:t>
               <w:br/>
               <w:t>↓</w:t>
               <w:br/>
-              <w:t>END_DAY_READY khi đạt authoritative stop condition</w:t>
+              <w:t>LEARNER TỰ LÀM CORE → BUILD / TEST / EVIDENCE</w:t>
               <w:br/>
               <w:t>↓</w:t>
               <w:br/>
-              <w:t>Learner xác nhận END DAY</w:t>
+              <w:t>END_DAY_READY → learner xác nhận END DAY</w:t>
               <w:br/>
               <w:t>↓</w:t>
               <w:br/>
-              <w:t>Human-Input preflight + Project Chat EXECUTOR DISPATCH nếu cần</w:t>
-              <w:br/>
-              <w:t>↓</w:t>
-              <w:br/>
-              <w:t>Cowork report + Project Chat independent verification</w:t>
+              <w:t>CLOSURE + independent verification</w:t>
               <w:br/>
               <w:t>↓</w:t>
               <w:br/>
               <w:t>CLOSED / NEXT ACTION / DỪNG</w:t>
+              <w:br/>
+              <w:br/>
+              <w:t>AI-0 scored gate: neutral logistics/scaffold only; no targeted theory/hint/Pre-check leak.</w:t>
             </w:r>
             <w:r/>
             <w:r>
@@ -1241,7 +1240,7 @@
         <w:ind w:left="142" w:hanging="142"/>
       </w:pPr>
       <w:r>
-        <w:t>1. Mở chat chính và gõ BOOT; nếu gọi thẳng stateful command, hệ thống vẫn phải tự hydrate context.</w:t>
+        <w:t>1. Mở chat chính và gõ BOOT; hệ thống hydrate canonical context và xác định assessment/AI boundary trước.</w:t>
       </w:r>
       <w:r/>
       <w:r/>
@@ -1251,7 +1250,7 @@
         <w:ind w:left="142" w:hanging="142"/>
       </w:pPr>
       <w:r>
-        <w:t>2. Đọc State Snapshot và xác nhận governing Master Prompt là bản canonical live 3.1+.</w:t>
+        <w:t>2. Với ngày LEARNING bình thường, đọc State Snapshot + scoped Theory Pack ngay khi starter prep chưa xong.</w:t>
       </w:r>
       <w:r/>
       <w:r/>
@@ -1261,7 +1260,7 @@
         <w:ind w:left="142" w:hanging="142"/>
       </w:pPr>
       <w:r>
-        <w:t>3. Chốt Day Contract: outcome, artifact, evidence, stop condition và AI mode.</w:t>
+        <w:t>3. Nếu prep hữu ích, trả lời một BOOT PREP INPUT: Available Focused Time còn thiếu + explicit executor consent.</w:t>
       </w:r>
       <w:r/>
       <w:r/>
@@ -1277,7 +1276,7 @@
         <w:ind w:left="142" w:hanging="142"/>
       </w:pPr>
       <w:r>
-        <w:t>4. Tách Roadmap Standard Load, Available Focused Time và Planned Focused Time.</w:t>
+        <w:t>4. Đọc theory khi Cowork/Antigravity chuẩn bị repo; chờ Project Chat verify rồi mới làm Pre-check.</w:t>
       </w:r>
       <w:r/>
       <w:r/>
@@ -1289,7 +1288,7 @@
         <w:ind w:left="142" w:hanging="142"/>
       </w:pPr>
       <w:r>
-        <w:t>5. Chỉ vào Focus khi Day Contract đủ; mở đúng day card/TODO, không đọc lan sang ngày mai.</w:t>
+        <w:t>5. Chốt Planned Focused Time và Day Contract; chỉ sau đó vào FOCUS_ACTIVE và tự làm core implementation.</w:t>
       </w:r>
       <w:r/>
       <w:r/>
@@ -2832,25 +2831,30 @@
               <w:br/>
               <w:t>- governing source/version</w:t>
               <w:br/>
-              <w:t>- Calendar / Execution / Artifact / Competency</w:t>
+              <w:t>- lifecycle + Calendar / Execution / Artifact / Competency</w:t>
               <w:br/>
-              <w:t>- gate / AI contamination / schedule / review</w:t>
+              <w:t>- gate / AI boundary / schedule / review</w:t>
               <w:br/>
               <w:br/>
-              <w:t>DAY CONTRACT</w:t>
+              <w:t>PIPELINED PREP (normal LEARNING)</w:t>
+              <w:br/>
+              <w:t>- scoped Theory Pack trước</w:t>
+              <w:br/>
+              <w:t>- compact Available Time + executor consent</w:t>
+              <w:br/>
+              <w:t>- verify starter trước Pre-check</w:t>
+              <w:br/>
+              <w:br/>
+              <w:t>DAY CONTRACT → FOCUS_ACTIVE</w:t>
               <w:br/>
               <w:t>- outcome / artifact / evidence / stop</w:t>
               <w:br/>
-              <w:t>- AI/assessment</w:t>
+              <w:t>- Standard / Available / Planned</w:t>
               <w:br/>
-              <w:t>- Standard Load / Available / Planned</w:t>
+              <w:t>- learner tự làm core; generated MUST có authority trace</w:t>
               <w:br/>
               <w:br/>
-              <w:t>FOCUS PACK</w:t>
-              <w:br/>
-              <w:t>- theory / TODO / starter/test khi cần</w:t>
-              <w:br/>
-              <w:t>- generated MUST phải có authority trace</w:t>
+              <w:t>AI-0 scored: neutral logistics/scaffold only; không tutoring leak.</w:t>
             </w:r>
             <w:r/>
             <w:r/>
@@ -9404,32 +9408,26 @@
     </w:p>
     <w:p>
       <w:r>
-        <w:t>Learner không phải tự duy trì các file bookkeeping dài theo mặc định. Project Chat ra quyết định và tạo manual self-contained executor prompt; learner mở independent Cowork hoặc Antigravity context; executor thực hiện bounded operation và trả report; Project Chat independent verify.</w:t>
+        <w:t>Learner không phải tự duy trì boilerplate hoặc các file bookkeeping dài theo mặc định. Project Chat phải kiểm tra actor ownership trước NEXT ACTION. Khi multi-file starter/test/TODO prep hữu ích, Project Chat đưa State Snapshot + scoped Theory Pack trước, rồi hỏi một BOOT PREP INPUT gộp Available Focused Time còn thiếu và explicit executor consent. Sau approval, learner mở independent Cowork hoặc Antigravity context, paste self-contained prompt và đọc theory trong lúc executor chuẩn bị repo. Project Chat independent verify report trước khi bật Pre-check; chỉ sau complete Day Contract mới vào FOCUS_ACTIVE và learner tự làm core implementation. Đây là transient orchestration, không phải DAY_PREPARING state.</w:t>
         <w:br/>
         <w:br/>
-        <w:t>Quan trọng — Work mode popup và executor consent:</w:t>
+        <w:t>AI-0 firewall:</w:t>
         <w:br/>
-        <w:t>• Work mode popup/background handoff của platform KHÔNG phải roadmap executor consent. Reject popup đó KHÔNG reject executor.</w:t>
+        <w:t>• Với scored DIAGNOSTIC/GATE/RETEST AI-0, không có competency-targeted Theory Pack, hint, example hoặc tutoring Pre-check trước/trong attempt.</w:t>
         <w:br/>
-        <w:t>• Project Chat hoàn thành reply trước, giải thích ngắn tại sao cần executor, rồi hỏi permission. Chỉ sau khi learner đồng ý mới tạo prompt.</w:t>
-        <w:br/>
-        <w:t>• Cowork là executor mặc định. Antigravity là fallback được duyệt — cùng prompt, cùng contract, cùng provenance rules.</w:t>
-        <w:br/>
-        <w:t>• Learner tự mở context mới, paste prompt, chạy, lấy report về cho Project Chat.</w:t>
-        <w:br/>
-        <w:t>• Nếu Cowork hết quota hoặc không khả dụng, dùng Antigravity — không tự hủy operation.</w:t>
+        <w:t>• Chỉ neutral logistics, contract/timing, allowed references và non-answer-revealing scaffold/rubric/tests được phép. Assessment integrity thắng pipeline optimization.</w:t>
         <w:br/>
         <w:br/>
-        <w:t>HANDOFF chỉ là context transfer giữa chat/account/context, không phải executor dispatch. Nếu handoff giữa active session, packet giữ workflow phase/task, repo state nếu biết, build/test/failure, attempts/hints/AI exposure, blocker và exact resume point; provenance không rõ phải ghi UNRESOLVED, không đoán mức AI thấp hơn.</w:t>
+        <w:t>Work mode popup và executor consent:</w:t>
+        <w:br/>
+        <w:t>• Work mode popup/background handoff KHÔNG phải roadmap executor consent. Reject popup đó KHÔNG reject executor.</w:t>
+        <w:br/>
+        <w:t>• Executor consent vẫn explicit, manual và transaction-specific; chỉ sau approval mới tạo prompt.</w:t>
+        <w:br/>
+        <w:t>• Cowork là mặc định; Antigravity là fallback với cùng prompt, contract và provenance rules.</w:t>
         <w:br/>
         <w:br/>
-        <w:t>MASTER CHECK — external inspection:</w:t>
-        <w:br/>
-        <w:t>• MASTER CHECK là deep read-only audit, kể cả khi executor hỗ trợ inspect local repo.</w:t>
-        <w:br/>
-        <w:t>• Executor chạy read-only commands và trả observations — KHÔNG sửa file, commit, push, repair hoặc tự cấp competency.</w:t>
-        <w:br/>
-        <w:t>• Nếu cần correction sau audit: MASTER CHECK kết thúc → disposition findings → owner approve → CORRECTION transaction riêng → fresh executor consent.</w:t>
+        <w:t>HANDOFF chỉ là context transfer, không phải executor dispatch. MASTER CHECK vẫn deep read-only kể cả khi executor hỗ trợ; correction cần transaction và consent riêng.</w:t>
       </w:r>
       <w:r/>
       <w:r/>
@@ -12278,7 +12276,7 @@
                 <w:rFonts w:ascii="Consolas" w:hAnsi="Consolas"/>
                 <w:sz w:val="18"/>
               </w:rPr>
-              <w:t>08:00 BOOT → State Snapshot → Day Contract (Standard/Available/Planned time) → Theory/TODO → Focus tự code → DEBUG/measurement → build/test/evidence → SUBMIT TODO → sửa findings bắt buộc → END_DAY_READY → learner xác nhận END DAY → human-input preflight → Cowork closure nếu cần → Project Chat verify → CLOSED</w:t>
+              <w:t>08:00 BOOT → State Snapshot + scoped Theory → BOOT PREP INPUT (Available Time + executor consent nếu cần) → learner đọc theory trong lúc executor chuẩn bị → Project Chat verify → Pre-check → complete Day Contract (Standard/Available/Planned) → FOCUS_ACTIVE → learner tự code → test/evidence → END_DAY_READY → END DAY → closure verify → CLOSED</w:t>
             </w:r>
             <w:r/>
             <w:r>
@@ -12942,30 +12940,22 @@
     </w:p>
     <w:p>
       <w:r>
-        <w:t>☐ BOOT (hoặc stateful command tự hydrate context)</w:t>
+        <w:t>☐ BOOT → State Snapshot + Theory/AI boundary đúng assessment mode</w:t>
       </w:r>
       <w:r/>
     </w:p>
     <w:p>
       <w:r>
-        <w:t>☐</w:t>
-      </w:r>
-      <w:r>
-        <w:t xml:space="preserve"> Xác </w:t>
-      </w:r>
-      <w:r>
-        <w:t>nh</w:t>
-      </w:r>
-      <w:r>
-        <w:t>ậ</w:t>
-      </w:r>
-      <w:r>
-        <w:t>n Calendar / Execution / Artifact / Competency</w:t>
-      </w:r>
+        <w:t>☐ Xác nhận Calendar / Execution / Artifact / Competency và lifecycle state</w:t>
+      </w:r>
+      <w:r/>
+      <w:r/>
+      <w:r/>
+      <w:r/>
     </w:p>
     <w:p>
       <w:r>
-        <w:t>☐ Day Contract: outcome / artifact / evidence / stop condition</w:t>
+        <w:t>☐ Nếu prep hữu ích: BOOT PREP INPUT + explicit executor consent</w:t>
       </w:r>
       <w:r/>
       <w:r/>
@@ -12975,37 +12965,29 @@
     </w:p>
     <w:p>
       <w:r>
-        <w:t>☐ AI/assessment mode và AI-0 firewall</w:t>
+        <w:t>☐ AI-0 gate: không targeted theory/hint/example/Pre-check leak</w:t>
       </w:r>
       <w:r/>
     </w:p>
     <w:p>
       <w:r>
-        <w:t>☐ Roadmap Standard Load / Available / Planned Focused Time tách riêng</w:t>
+        <w:t>☐ Executor verified prep → Pre-check → complete Day Contract</w:t>
       </w:r>
       <w:r/>
     </w:p>
     <w:p>
       <w:r>
-        <w:t>☐</w:t>
-      </w:r>
-      <w:r>
-        <w:t xml:space="preserve"> Stop condition</w:t>
-      </w:r>
+        <w:t>☐ Standard / Available / Planned Focused Time tách riêng</w:t>
+      </w:r>
+      <w:r/>
     </w:p>
     <w:p>
       <w:r>
-        <w:t>☐</w:t>
-      </w:r>
-      <w:r>
-        <w:t xml:space="preserve"> NEXT ACTION đ</w:t>
-      </w:r>
-      <w:r>
-        <w:t>ầ</w:t>
-      </w:r>
-      <w:r>
-        <w:t>u tiên</w:t>
-      </w:r>
+        <w:t>☐ FOCUS_ACTIVE chỉ sau contract; learner tự làm core task</w:t>
+      </w:r>
+      <w:r/>
+      <w:r/>
+      <w:r/>
     </w:p>
     <w:p>
       <w:pPr>
@@ -13241,37 +13223,41 @@
             <w:r>
               <w:t>BẮT ĐẦU / RESUME</w:t>
               <w:br/>
-              <w:t>BOOT</w:t>
+              <w:t>BOOT → HYDRATE CONTEXT</w:t>
               <w:br/>
               <w:br/>
-              <w:t>STATEFUL COMMAND KHÔNG CÓ BOOT</w:t>
+              <w:t>NORMAL LEARNING + PREP HỮU ÍCH</w:t>
               <w:br/>
-              <w:t>TỰ HYDRATE CONTEXT</w:t>
+              <w:t>STATE SNAPSHOT + THEORY + AI BOUNDARY</w:t>
+              <w:br/>
+              <w:t>→ BOOT PREP INPUT</w:t>
+              <w:br/>
+              <w:t>→ EXECUTOR PREP TRONG KHI LEARNER ĐỌC</w:t>
+              <w:br/>
+              <w:t>→ PROJECT CHAT VERIFY</w:t>
+              <w:br/>
+              <w:t>→ PRE-CHECK</w:t>
+              <w:br/>
+              <w:t>→ COMPLETE DAY CONTRACT</w:t>
+              <w:br/>
+              <w:t>→ FOCUS_ACTIVE / LEARNER TỰ LÀM CORE</w:t>
               <w:br/>
               <w:br/>
-              <w:t>DAY CONTRACT</w:t>
+              <w:t>SCORED AI-0</w:t>
               <w:br/>
-              <w:t>OUTCOME / ARTIFACT / EVIDENCE / STOP / AI / STANDARD-AVAILABLE-PLANNED</w:t>
+              <w:t>NEUTRAL LOGISTICS/SCAFFOLD ONLY</w:t>
               <w:br/>
-              <w:br/>
-              <w:t>FOCUS</w:t>
-              <w:br/>
-              <w:t>TỰ LÀM CORE → TEST/MEASURE → SUBMIT</w:t>
+              <w:t>KHÔNG TARGETED THEORY / HINT / PRE-CHECK</w:t>
               <w:br/>
               <w:br/>
               <w:t>ĐỦ ĐIỀU KIỆN</w:t>
               <w:br/>
-              <w:t>END_DAY_READY (CHƯA CLOSED)</w:t>
-              <w:br/>
-              <w:br/>
-              <w:t>LEARNER XÁC NHẬN</w:t>
-              <w:br/>
-              <w:t>END DAY</w:t>
+              <w:t>END_DAY_READY (CHƯA CLOSED) → LEARNER END DAY</w:t>
               <w:br/>
               <w:br/>
               <w:t>REPO WORK</w:t>
               <w:br/>
-              <w:t>PROJECT CHAT → MANUAL COWORK PROMPT → REPORT → INDEPENDENT VERIFY</w:t>
+              <w:t>PROJECT CHAT → MANUAL EXECUTOR PROMPT → REPORT → INDEPENDENT VERIFY</w:t>
               <w:br/>
               <w:t>WORK MODE != COWORK</w:t>
               <w:br/>
@@ -13288,7 +13274,7 @@
               <w:br/>
               <w:t>ĐỔI CONTEXT</w:t>
               <w:br/>
-              <w:t>HANDOFF (KHÔNG PHẢI COWORK DISPATCH)</w:t>
+              <w:t>HANDOFF (KHÔNG PHẢI EXECUTOR DISPATCH)</w:t>
             </w:r>
             <w:r/>
             <w:r/>
@@ -13587,7 +13573,7 @@
           <w:i/>
           <w:sz w:val="17"/>
         </w:rPr>
-        <w:t>Sổ tay 1.2.0 • Nguồn: SYSTEM_SPEC_V3.md 3.0.0 • EMBEDDED_ROADMAP_V3.1.docx 3.1.0 • MASTER_PROMPT_V3.md 3.1.1 (canonical live)</w:t>
+        <w:t>Sổ tay 1.3.0 • Nguồn: SYSTEM_SPEC_V3.md 3.0.0 • EMBEDDED_ROADMAP_V3.1.docx 3.1.0 • MASTER_PROMPT_V3.md 3.1.2 (canonical live)</w:t>
       </w:r>
       <w:r>
         <w:rPr>

</xml_diff>

<commit_message>
docs(system): apply CP-01 workflow amendments
</commit_message>
<xml_diff>
--- a/docs/system/HOW_TO_USE_ROADMAP_WITH_AI.docx
+++ b/docs/system/HOW_TO_USE_ROADMAP_WITH_AI.docx
@@ -81,7 +81,7 @@
         <w:rPr>
           <w:sz w:val="24"/>
         </w:rPr>
-        <w:t>Version 1.3.0 - bản Word editable dành cho người học tự đọc, chỉnh sửa và in</w:t>
+        <w:t>Version 1.4.0 - bản Word editable dành cho người học tự đọc, chỉnh sửa và in</w:t>
       </w:r>
       <w:r>
         <w:rPr>
@@ -540,7 +540,7 @@
         <w:rPr>
           <w:sz w:val="19"/>
         </w:rPr>
-        <w:t>MASTER_PROMPT_V3.md - 3.1.2 (canonical live: docs/system/MASTER_PROMPT_V3.md)</w:t>
+        <w:t>MASTER_PROMPT_V3.md - 3.1.3 (canonical live: docs/system/MASTER_PROMPT_V3.md)</w:t>
       </w:r>
     </w:p>
     <w:p>
@@ -708,7 +708,7 @@
           <w:b/>
           <w:sz w:val="26"/>
         </w:rPr>
-        <w:t>BOOT    THEORY + PREP    DAY CONTRACT    FOCUS    END_DAY_READY    END DAY</w:t>
+        <w:t>BOOT    THEORY + PREP    DAY CONTRACT    FOCUS    END_DAY_READY    END DAY; CUỐI TUẦN: END WEEK</w:t>
       </w:r>
       <w:r>
         <w:rPr>
@@ -3887,6 +3887,85 @@
     </w:p>
     <w:p>
       <w:pPr>
+        <w:pStyle w:val="Heading2"/>
+      </w:pPr>
+      <w:r>
+        <w:t>Normal practice khó và iterative</w:t>
+      </w:r>
+    </w:p>
+    <w:p>
+      <w:pPr>
+        <w:spacing w:after="0" w:line="240" w:lineRule="auto"/>
+      </w:pPr>
+      <w:r>
+        <w:rPr>
+          <w:sz w:val="20"/>
+        </w:rPr>
+        <w:t>Từ Week 2 trở đi, khi prerequisite đã đủ, bài coding bình thường có thể cố ý khó hơn. Fail visible tests trong lúc học là feedback để bạn quan sát, suy luận và sửa; đó không phải assessment failure.</w:t>
+      </w:r>
+    </w:p>
+    <w:p>
+      <w:pPr>
+        <w:pStyle w:val="ListBullet"/>
+        <w:spacing w:after="0" w:line="240" w:lineRule="auto"/>
+      </w:pPr>
+      <w:r>
+        <w:rPr>
+          <w:sz w:val="20"/>
+        </w:rPr>
+        <w:t>Giữ loop: code → chạy visible/deep tests → xem failure → reason about delta → sửa → chạy lại.</w:t>
+      </w:r>
+    </w:p>
+    <w:p>
+      <w:pPr>
+        <w:pStyle w:val="ListBullet"/>
+        <w:spacing w:after="0" w:line="240" w:lineRule="auto"/>
+      </w:pPr>
+      <w:r>
+        <w:rPr>
+          <w:sz w:val="20"/>
+        </w:rPr>
+        <w:t>Test có thể giàu boundary, invalid input, failure path, state edge, repeated call/idempotency, wrap/overflow và regression; randomized/property/stress chỉ thêm khi có ý nghĩa, sau deterministic baseline.</w:t>
+      </w:r>
+    </w:p>
+    <w:p>
+      <w:pPr>
+        <w:pStyle w:val="ListBullet"/>
+        <w:spacing w:after="0" w:line="240" w:lineRule="auto"/>
+      </w:pPr>
+      <w:r>
+        <w:rPr>
+          <w:sz w:val="20"/>
+        </w:rPr>
+        <w:t>Generated extra/deep test không trace tới source/gate/invariant có thẩm quyền là NON-SCORING learning feedback, không phải scoring MUST.</w:t>
+      </w:r>
+    </w:p>
+    <w:p>
+      <w:pPr>
+        <w:pStyle w:val="ListBullet"/>
+        <w:spacing w:after="0" w:line="240" w:lineRule="auto"/>
+      </w:pPr>
+      <w:r>
+        <w:rPr>
+          <w:sz w:val="20"/>
+        </w:rPr>
+        <w:t>Bạn vẫn tự viết core implementation trước AI-3/4. Short transfer exercise code → diagram/state flow → reasoning → concise verbal explanation có thể được thêm, nhưng không thay implementation.</w:t>
+      </w:r>
+    </w:p>
+    <w:p>
+      <w:pPr>
+        <w:pStyle w:val="ListBullet"/>
+        <w:spacing w:after="0" w:line="240" w:lineRule="auto"/>
+      </w:pPr>
+      <w:r>
+        <w:rPr>
+          <w:sz w:val="20"/>
+        </w:rPr>
+        <w:t>Visible learning tests khác hidden assessment tests: learning tests được phép lộ case và actual/expected delta để bạn sửa; hidden gate feedback chỉ theo đúng gate contract.</w:t>
+      </w:r>
+    </w:p>
+    <w:p>
+      <w:pPr>
         <w:pStyle w:val="Heading1"/>
       </w:pPr>
       <w:r>
@@ -8006,7 +8085,30 @@
         <w:pStyle w:val="Heading1"/>
       </w:pPr>
       <w:r>
-        <w:t>11. WEEKLY REVIEW, GATE VÀ RETEST</w:t>
+        <w:t>11. END WEEK, WEEKLY REVIEW, GATE VÀ RETEST</w:t>
+      </w:r>
+    </w:p>
+    <w:p>
+      <w:pPr>
+        <w:pStyle w:val="Heading2"/>
+      </w:pPr>
+      <w:r>
+        <w:t>END WEEK - một lệnh đóng tuần</w:t>
+      </w:r>
+    </w:p>
+    <w:p>
+      <w:r>
+        <w:t>Gõ END WEEK. Đây là public stateful command: hệ thống tự hydrate context, kiểm tra version/dependency và orchestrate week close. Bạn không cần gọi năm closing commands riêng trừ khi troubleshooting/recovery yêu cầu.</w:t>
+      </w:r>
+    </w:p>
+    <w:p>
+      <w:r>
+        <w:t>Thứ tự chính: unresolved AI-0 gate/retest → MASTER CHECK read-only → disposition findings → human-only preflight → WEEKLY REVIEW/CP → PASS/CONDITIONAL PASS/FAIL → carry-over/Recovery/Week-2 eligibility → một closure transaction → remote verify.</w:t>
+      </w:r>
+    </w:p>
+    <w:p>
+      <w:r>
+        <w:t>Nếu audit tìm ra correction bắt buộc, audit phải kết thúc trước; review/disposition rồi mới mở correction transaction riêng và verify độc lập. END WEEK không tạo PASS definition mới và không biến Artifact PASS thành Competency PASS.</w:t>
       </w:r>
     </w:p>
     <w:p>
@@ -8710,6 +8812,56 @@
       <w:pPr>
         <w:spacing w:after="0"/>
       </w:pPr>
+    </w:p>
+    <w:p>
+      <w:pPr>
+        <w:pStyle w:val="Heading2"/>
+      </w:pPr>
+      <w:r>
+        <w:t>Optional: tối đa 2 submission cho coding gate</w:t>
+      </w:r>
+    </w:p>
+    <w:p>
+      <w:r>
+        <w:t>Chỉ khi future gate contract ghi rõ opt-in, một scored AI-0 coding subpart có thể cho Attempt 1 + tối đa một retry. Evaluator chỉ trả PASS hoặc NOT PASS.</w:t>
+      </w:r>
+    </w:p>
+    <w:p>
+      <w:pPr>
+        <w:pStyle w:val="ListBullet"/>
+      </w:pPr>
+      <w:r>
+        <w:t>Cả hai submission dùng original timer; không reset, không extension, không có retry clock riêng.</w:t>
+      </w:r>
+    </w:p>
+    <w:p>
+      <w:pPr>
+        <w:pStyle w:val="ListBullet"/>
+      </w:pPr>
+      <w:r>
+        <w:t>Không lộ hidden case, failing count/category, expected/actual diff, exact input, bug location, hint, explanation, code review, percentage hoặc solution.</w:t>
+      </w:r>
+    </w:p>
+    <w:p>
+      <w:pPr>
+        <w:pStyle w:val="ListBullet"/>
+      </w:pPr>
+      <w:r>
+        <w:t>Attempt 1 và Attempt 2 nếu dùng phải được giữ raw riêng với timestamp/result; retry là cùng một gate attempt, không phải RETEST.</w:t>
+      </w:r>
+    </w:p>
+    <w:p>
+      <w:pPr>
+        <w:pStyle w:val="ListBullet"/>
+      </w:pPr>
+      <w:r>
+        <w:t>Conceptual explanation, verbal reasoning, design/project defense, unseen diagnosis và interview answer vẫn single-response/no-feedback trong scored phase.</w:t>
+      </w:r>
+    </w:p>
+    <w:p>
+      <w:r>
+        <w:t>Nếu contract không opt in, behavior cũ giữ nguyên. Protocol không hồi tố W01D06/W01D07 và không đổi AI-0 independence.</w:t>
+      </w:r>
     </w:p>
     <w:p>
       <w:pPr>
@@ -9437,6 +9589,11 @@
       <w:r/>
       <w:r/>
     </w:p>
+    <w:p>
+      <w:r>
+        <w:br w:type="page"/>
+      </w:r>
+    </w:p>
     <w:tbl>
       <w:tblPr>
         <w:tblStyle w:val="TableGrid"/>
@@ -11149,6 +11306,73 @@
         <w:tc>
           <w:tcPr>
             <w:tcW w:w="3324" w:type="dxa"/>
+            <w:tcMar>
+              <w:top w:w="70" w:type="dxa"/>
+              <w:left w:w="90" w:type="dxa"/>
+              <w:bottom w:w="70" w:type="dxa"/>
+              <w:right w:w="90" w:type="dxa"/>
+            </w:tcMar>
+            <w:vAlign w:val="center"/>
+          </w:tcPr>
+          <w:p>
+            <w:r>
+              <w:rPr>
+                <w:b/>
+                <w:sz w:val="16"/>
+              </w:rPr>
+              <w:t>END WEEK</w:t>
+            </w:r>
+          </w:p>
+        </w:tc>
+        <w:tc>
+          <w:tcPr>
+            <w:tcW w:w="3324" w:type="dxa"/>
+            <w:tcMar>
+              <w:top w:w="70" w:type="dxa"/>
+              <w:left w:w="90" w:type="dxa"/>
+              <w:bottom w:w="70" w:type="dxa"/>
+              <w:right w:w="90" w:type="dxa"/>
+            </w:tcMar>
+            <w:vAlign w:val="center"/>
+          </w:tcPr>
+          <w:p>
+            <w:r>
+              <w:rPr>
+                <w:sz w:val="16"/>
+              </w:rPr>
+              <w:t>Cuối tuần - một lệnh</w:t>
+            </w:r>
+          </w:p>
+        </w:tc>
+        <w:tc>
+          <w:tcPr>
+            <w:tcW w:w="3324" w:type="dxa"/>
+            <w:tcMar>
+              <w:top w:w="70" w:type="dxa"/>
+              <w:left w:w="90" w:type="dxa"/>
+              <w:bottom w:w="70" w:type="dxa"/>
+              <w:right w:w="90" w:type="dxa"/>
+            </w:tcMar>
+            <w:vAlign w:val="center"/>
+          </w:tcPr>
+          <w:p>
+            <w:r>
+              <w:rPr>
+                <w:sz w:val="16"/>
+              </w:rPr>
+              <w:t>AI-0 dependency → MASTER CHECK → review/decision → coherent closure → remote verify</w:t>
+            </w:r>
+          </w:p>
+        </w:tc>
+      </w:tr>
+      <w:tr>
+        <w:trPr>
+          <w:cantSplit/>
+          <w:jc w:val="center"/>
+        </w:trPr>
+        <w:tc>
+          <w:tcPr>
+            <w:tcW w:w="3324" w:type="dxa"/>
             <w:shd w:val="clear" w:color="auto" w:fill="F8FAFB"/>
             <w:tcMar>
               <w:top w:w="70" w:type="dxa"/>
@@ -13187,6 +13411,34 @@
     </w:p>
     <w:p>
       <w:pPr>
+        <w:pStyle w:val="Heading2"/>
+      </w:pPr>
+      <w:r>
+        <w:t>Cuối tuần</w:t>
+      </w:r>
+    </w:p>
+    <w:p>
+      <w:r>
+        <w:t>☐ Gõ END WEEK thay vì tự gọi chuỗi closing commands.</w:t>
+      </w:r>
+    </w:p>
+    <w:p>
+      <w:r>
+        <w:t>☐ MASTER CHECK vẫn read-only; correction nếu có là transaction riêng.</w:t>
+      </w:r>
+    </w:p>
+    <w:p>
+      <w:r>
+        <w:t>☐ Xác nhận Week decision / carry-over / Recovery / next-week eligibility và remote verify.</w:t>
+      </w:r>
+    </w:p>
+    <w:p>
+      <w:r>
+        <w:t>☐ Gate có bounded feedback chỉ khi contract opt in; max 2, PASS/NOT PASS, one timer, raw attempts retained.</w:t>
+      </w:r>
+    </w:p>
+    <w:p>
+      <w:pPr>
         <w:pStyle w:val="Heading1"/>
       </w:pPr>
       <w:r>
@@ -13220,7 +13472,13 @@
             </w:tcMar>
           </w:tcPr>
           <w:p>
-            <w:r>
+            <w:pPr>
+              <w:spacing w:after="0" w:line="240" w:lineRule="auto"/>
+            </w:pPr>
+            <w:r>
+              <w:rPr>
+                <w:sz w:val="19"/>
+              </w:rPr>
               <w:t>BẮT ĐẦU / RESUME</w:t>
               <w:br/>
               <w:t>BOOT → HYDRATE CONTEXT</w:t>
@@ -13276,75 +13534,369 @@
               <w:br/>
               <w:t>HANDOFF (KHÔNG PHẢI EXECUTOR DISPATCH)</w:t>
             </w:r>
-            <w:r/>
-            <w:r/>
-            <w:r/>
-            <w:r/>
-            <w:r/>
-            <w:r/>
-            <w:r/>
-            <w:r/>
-            <w:r/>
-            <w:r/>
-            <w:r/>
-            <w:r/>
-            <w:r/>
-            <w:r/>
-            <w:r/>
-            <w:r/>
-            <w:r/>
-            <w:r/>
-            <w:r/>
-            <w:r/>
-            <w:r/>
-            <w:r/>
-            <w:r/>
-            <w:r/>
-            <w:r/>
-            <w:r/>
-            <w:r/>
-            <w:r/>
-            <w:r/>
-            <w:r/>
-            <w:r/>
-            <w:r/>
-            <w:r/>
-            <w:r/>
-            <w:r/>
-            <w:r/>
-            <w:r/>
-            <w:r/>
-            <w:r/>
-            <w:r/>
-            <w:r/>
-            <w:r/>
-            <w:r/>
-            <w:r/>
-            <w:r/>
-            <w:r/>
-            <w:r/>
-            <w:r/>
-            <w:r/>
-            <w:r/>
-            <w:r/>
-            <w:r/>
-            <w:r/>
-            <w:r/>
-            <w:r/>
-            <w:r/>
-            <w:r/>
-            <w:r/>
-            <w:r/>
-            <w:r/>
-            <w:r/>
-            <w:r/>
-            <w:r/>
-            <w:r/>
-            <w:r/>
-            <w:r/>
-            <w:r/>
-            <w:r/>
-            <w:r/>
+            <w:r>
+              <w:rPr>
+                <w:sz w:val="19"/>
+              </w:rPr>
+            </w:r>
+            <w:r>
+              <w:rPr>
+                <w:sz w:val="19"/>
+              </w:rPr>
+            </w:r>
+            <w:r>
+              <w:rPr>
+                <w:sz w:val="19"/>
+              </w:rPr>
+            </w:r>
+            <w:r>
+              <w:rPr>
+                <w:sz w:val="19"/>
+              </w:rPr>
+            </w:r>
+            <w:r>
+              <w:rPr>
+                <w:sz w:val="19"/>
+              </w:rPr>
+            </w:r>
+            <w:r>
+              <w:rPr>
+                <w:sz w:val="19"/>
+              </w:rPr>
+            </w:r>
+            <w:r>
+              <w:rPr>
+                <w:sz w:val="19"/>
+              </w:rPr>
+            </w:r>
+            <w:r>
+              <w:rPr>
+                <w:sz w:val="19"/>
+              </w:rPr>
+            </w:r>
+            <w:r>
+              <w:rPr>
+                <w:sz w:val="19"/>
+              </w:rPr>
+            </w:r>
+            <w:r>
+              <w:rPr>
+                <w:sz w:val="19"/>
+              </w:rPr>
+            </w:r>
+            <w:r>
+              <w:rPr>
+                <w:sz w:val="19"/>
+              </w:rPr>
+            </w:r>
+            <w:r>
+              <w:rPr>
+                <w:sz w:val="19"/>
+              </w:rPr>
+            </w:r>
+            <w:r>
+              <w:rPr>
+                <w:sz w:val="19"/>
+              </w:rPr>
+            </w:r>
+            <w:r>
+              <w:rPr>
+                <w:sz w:val="19"/>
+              </w:rPr>
+            </w:r>
+            <w:r>
+              <w:rPr>
+                <w:sz w:val="19"/>
+              </w:rPr>
+            </w:r>
+            <w:r>
+              <w:rPr>
+                <w:sz w:val="19"/>
+              </w:rPr>
+            </w:r>
+            <w:r>
+              <w:rPr>
+                <w:sz w:val="19"/>
+              </w:rPr>
+            </w:r>
+            <w:r>
+              <w:rPr>
+                <w:sz w:val="19"/>
+              </w:rPr>
+            </w:r>
+            <w:r>
+              <w:rPr>
+                <w:sz w:val="19"/>
+              </w:rPr>
+            </w:r>
+            <w:r>
+              <w:rPr>
+                <w:sz w:val="19"/>
+              </w:rPr>
+            </w:r>
+            <w:r>
+              <w:rPr>
+                <w:sz w:val="19"/>
+              </w:rPr>
+            </w:r>
+            <w:r>
+              <w:rPr>
+                <w:sz w:val="19"/>
+              </w:rPr>
+            </w:r>
+            <w:r>
+              <w:rPr>
+                <w:sz w:val="19"/>
+              </w:rPr>
+            </w:r>
+            <w:r>
+              <w:rPr>
+                <w:sz w:val="19"/>
+              </w:rPr>
+            </w:r>
+            <w:r>
+              <w:rPr>
+                <w:sz w:val="19"/>
+              </w:rPr>
+            </w:r>
+            <w:r>
+              <w:rPr>
+                <w:sz w:val="19"/>
+              </w:rPr>
+            </w:r>
+            <w:r>
+              <w:rPr>
+                <w:sz w:val="19"/>
+              </w:rPr>
+            </w:r>
+            <w:r>
+              <w:rPr>
+                <w:sz w:val="19"/>
+              </w:rPr>
+            </w:r>
+            <w:r>
+              <w:rPr>
+                <w:sz w:val="19"/>
+              </w:rPr>
+            </w:r>
+            <w:r>
+              <w:rPr>
+                <w:sz w:val="19"/>
+              </w:rPr>
+            </w:r>
+            <w:r>
+              <w:rPr>
+                <w:sz w:val="19"/>
+              </w:rPr>
+            </w:r>
+            <w:r>
+              <w:rPr>
+                <w:sz w:val="19"/>
+              </w:rPr>
+            </w:r>
+            <w:r>
+              <w:rPr>
+                <w:sz w:val="19"/>
+              </w:rPr>
+            </w:r>
+            <w:r>
+              <w:rPr>
+                <w:sz w:val="19"/>
+              </w:rPr>
+            </w:r>
+            <w:r>
+              <w:rPr>
+                <w:sz w:val="19"/>
+              </w:rPr>
+            </w:r>
+            <w:r>
+              <w:rPr>
+                <w:sz w:val="19"/>
+              </w:rPr>
+            </w:r>
+            <w:r>
+              <w:rPr>
+                <w:sz w:val="19"/>
+              </w:rPr>
+            </w:r>
+            <w:r>
+              <w:rPr>
+                <w:sz w:val="19"/>
+              </w:rPr>
+            </w:r>
+            <w:r>
+              <w:rPr>
+                <w:sz w:val="19"/>
+              </w:rPr>
+            </w:r>
+            <w:r>
+              <w:rPr>
+                <w:sz w:val="19"/>
+              </w:rPr>
+            </w:r>
+            <w:r>
+              <w:rPr>
+                <w:sz w:val="19"/>
+              </w:rPr>
+            </w:r>
+            <w:r>
+              <w:rPr>
+                <w:sz w:val="19"/>
+              </w:rPr>
+            </w:r>
+            <w:r>
+              <w:rPr>
+                <w:sz w:val="19"/>
+              </w:rPr>
+            </w:r>
+            <w:r>
+              <w:rPr>
+                <w:sz w:val="19"/>
+              </w:rPr>
+            </w:r>
+            <w:r>
+              <w:rPr>
+                <w:sz w:val="19"/>
+              </w:rPr>
+            </w:r>
+            <w:r>
+              <w:rPr>
+                <w:sz w:val="19"/>
+              </w:rPr>
+            </w:r>
+            <w:r>
+              <w:rPr>
+                <w:sz w:val="19"/>
+              </w:rPr>
+            </w:r>
+            <w:r>
+              <w:rPr>
+                <w:sz w:val="19"/>
+              </w:rPr>
+            </w:r>
+            <w:r>
+              <w:rPr>
+                <w:sz w:val="19"/>
+              </w:rPr>
+            </w:r>
+            <w:r>
+              <w:rPr>
+                <w:sz w:val="19"/>
+              </w:rPr>
+            </w:r>
+            <w:r>
+              <w:rPr>
+                <w:sz w:val="19"/>
+              </w:rPr>
+            </w:r>
+            <w:r>
+              <w:rPr>
+                <w:sz w:val="19"/>
+              </w:rPr>
+            </w:r>
+            <w:r>
+              <w:rPr>
+                <w:sz w:val="19"/>
+              </w:rPr>
+            </w:r>
+            <w:r>
+              <w:rPr>
+                <w:sz w:val="19"/>
+              </w:rPr>
+            </w:r>
+            <w:r>
+              <w:rPr>
+                <w:sz w:val="19"/>
+              </w:rPr>
+            </w:r>
+            <w:r>
+              <w:rPr>
+                <w:sz w:val="19"/>
+              </w:rPr>
+            </w:r>
+            <w:r>
+              <w:rPr>
+                <w:sz w:val="19"/>
+              </w:rPr>
+            </w:r>
+            <w:r>
+              <w:rPr>
+                <w:sz w:val="19"/>
+              </w:rPr>
+            </w:r>
+            <w:r>
+              <w:rPr>
+                <w:sz w:val="19"/>
+              </w:rPr>
+            </w:r>
+            <w:r>
+              <w:rPr>
+                <w:sz w:val="19"/>
+              </w:rPr>
+            </w:r>
+            <w:r>
+              <w:rPr>
+                <w:sz w:val="19"/>
+              </w:rPr>
+            </w:r>
+            <w:r>
+              <w:rPr>
+                <w:sz w:val="19"/>
+              </w:rPr>
+            </w:r>
+            <w:r>
+              <w:rPr>
+                <w:sz w:val="19"/>
+              </w:rPr>
+            </w:r>
+            <w:r>
+              <w:rPr>
+                <w:sz w:val="19"/>
+              </w:rPr>
+            </w:r>
+            <w:r>
+              <w:rPr>
+                <w:sz w:val="19"/>
+              </w:rPr>
+            </w:r>
+            <w:r>
+              <w:rPr>
+                <w:sz w:val="19"/>
+              </w:rPr>
+            </w:r>
+            <w:r>
+              <w:rPr>
+                <w:sz w:val="19"/>
+              </w:rPr>
+            </w:r>
+            <w:r>
+              <w:rPr>
+                <w:sz w:val="19"/>
+              </w:rPr>
+            </w:r>
+            <w:r>
+              <w:rPr>
+                <w:sz w:val="19"/>
+              </w:rPr>
+            </w:r>
+          </w:p>
+          <w:p>
+            <w:pPr>
+              <w:spacing w:after="0" w:line="240" w:lineRule="auto"/>
+            </w:pPr>
+            <w:r>
+              <w:rPr>
+                <w:sz w:val="19"/>
+              </w:rPr>
+              <w:t>WEEK CLOSE</w:t>
+              <w:br/>
+              <w:t>END WEEK → AI-0 DEPENDENCY → MASTER CHECK READ-ONLY → REVIEW/DECISION → CLOSURE/REMOTE VERIFY</w:t>
+              <w:br/>
+              <w:br/>
+              <w:t>OPTIONAL CODING GATE</w:t>
+              <w:br/>
+              <w:t>EXPLICIT OPT-IN → MAX 2 SUBMISSIONS → PASS/NOT PASS ONLY → ONE ORIGINAL TIMER</w:t>
+            </w:r>
           </w:p>
         </w:tc>
       </w:tr>
@@ -13573,7 +14125,7 @@
           <w:i/>
           <w:sz w:val="17"/>
         </w:rPr>
-        <w:t>Sổ tay 1.3.0 • Nguồn: SYSTEM_SPEC_V3.md 3.0.0 • EMBEDDED_ROADMAP_V3.1.docx 3.1.0 • MASTER_PROMPT_V3.md 3.1.2 (canonical live)</w:t>
+        <w:t>Sổ tay 1.4.0 • Nguồn: SYSTEM_SPEC_V3.md 3.0.0 • EMBEDDED_ROADMAP_V3.1.docx 3.1.0 • MASTER_PROMPT_V3.md 3.1.3 (canonical live)</w:t>
       </w:r>
       <w:r>
         <w:rPr>
@@ -13712,7 +14264,8 @@
   <w:p>
     <w:pPr>
       <w:pStyle w:val="Footer"/>
-      <w:jc w:val="right"/>
+      <w:ind/>
+      <w:jc w:val="center"/>
     </w:pPr>
     <w:r>
       <w:rPr>

</xml_diff>